<commit_message>
Redesign Chapter 10 deck to match reference style
Clean layout matched to the reference deck: F4F4F4 background, D4FC00
accent, 141417 dark, Inter typography, one monochrome documentary photo
per slide, book figures redrawn as native shapes, informative header row,
shorter copy without dashes. Study guide updated to the new slide titles.

Co-Authored-By: Claude Fable 5.1 <noreply@anthropic.com>
Claude-Session: https://claude.ai/code/session_01Ljehy9D2DPqSYfPX6Gsiea
</commit_message>
<xml_diff>
--- a/presentasi_ch10_kelompok3/SMJKT_Group 3_Aslih_Materi Pemahaman Chapter 10.docx
+++ b/presentasi_ch10_kelompok3/SMJKT_Group 3_Aslih_Materi Pemahaman Chapter 10.docx
@@ -119,13 +119,7 @@
         <w:t xml:space="preserve"> </w:t>
       </w:r>
       <w:r>
-        <w:t xml:space="preserve">3</w:t>
-      </w:r>
-      <w:r>
-        <w:t xml:space="preserve"> </w:t>
-      </w:r>
-      <w:r>
-        <w:t xml:space="preserve">—</w:t>
+        <w:t xml:space="preserve">3:</w:t>
       </w:r>
       <w:r>
         <w:t xml:space="preserve"> </w:t>
@@ -294,7 +288,7 @@
         <w:pStyle w:val="FirstParagraph"/>
       </w:pPr>
       <w:r>
-        <w:t xml:space="preserve">Dokumen ini adalah pendamping deck 21 slide. Setiap slide diuraikan dalam empat lapis:</w:t>
+        <w:t xml:space="preserve">Dokumen ini mendampingi deck 21 slide. Setiap slide diuraikan dalam empat lapis:</w:t>
       </w:r>
       <w:r>
         <w:t xml:space="preserve"> </w:t>
@@ -391,6 +385,24 @@
       </w:r>
       <w:r>
         <w:t xml:space="preserve">singkat yang dapat dibaca presenter. Istilah teori dipertahankan dalam bahasa Inggris sesuai buku; penjelasan menggunakan bahasa Indonesia.</w:t>
+      </w:r>
+    </w:p>
+    <w:p>
+      <w:pPr>
+        <w:pStyle w:val="BodyText"/>
+      </w:pPr>
+      <w:r>
+        <w:rPr>
+          <w:bCs/>
+          <w:b/>
+        </w:rPr>
+        <w:t xml:space="preserve">Catatan teknis deck.</w:t>
+      </w:r>
+      <w:r>
+        <w:t xml:space="preserve"> </w:t>
+      </w:r>
+      <w:r>
+        <w:t xml:space="preserve">Palet dan tipografi disamakan dengan deck referensi: latar F4F4F4, lime D4FC00, hitam 141417, font Inter. Inter adalah font gratis (Google Fonts). Bila belum terpasang di komputer presentasi, PowerPoint akan mengganti dengan font sistem; pasang Inter agar tampilan sama persis dengan PDF. Foto bersifat ilustratif, dibuat khusus dan diproses monokrom; gambar kerangka buku digambar ulang sebagai objek PowerPoint yang dapat diedit.</w:t>
       </w:r>
     </w:p>
     <w:p>
@@ -414,7 +426,7 @@
         <w:pStyle w:val="Compact"/>
       </w:pPr>
       <w:r>
-        <w:t xml:space="preserve">Durasi presentasi 10–15 menit, sisakan waktu diskusi. Bila beliau meminta</w:t>
+        <w:t xml:space="preserve">Durasi presentasi 10 sampai 15 menit, sisakan waktu diskusi. Bila beliau meminta</w:t>
       </w:r>
       <w:r>
         <w:t xml:space="preserve"> </w:t>
@@ -680,7 +692,7 @@
               <w:jc w:val="left"/>
             </w:pPr>
             <w:r>
-              <w:t xml:space="preserve">1–6</w:t>
+              <w:t xml:space="preserve">1 sampai 6</w:t>
             </w:r>
           </w:p>
         </w:tc>
@@ -730,7 +742,7 @@
               <w:jc w:val="left"/>
             </w:pPr>
             <w:r>
-              <w:t xml:space="preserve">7–8</w:t>
+              <w:t xml:space="preserve">7 sampai 8</w:t>
             </w:r>
           </w:p>
         </w:tc>
@@ -780,7 +792,7 @@
               <w:jc w:val="left"/>
             </w:pPr>
             <w:r>
-              <w:t xml:space="preserve">9–12</w:t>
+              <w:t xml:space="preserve">9 sampai 12</w:t>
             </w:r>
           </w:p>
         </w:tc>
@@ -830,7 +842,7 @@
               <w:jc w:val="left"/>
             </w:pPr>
             <w:r>
-              <w:t xml:space="preserve">13–17</w:t>
+              <w:t xml:space="preserve">13 sampai 17</w:t>
             </w:r>
           </w:p>
         </w:tc>
@@ -880,7 +892,7 @@
               <w:jc w:val="left"/>
             </w:pPr>
             <w:r>
-              <w:t xml:space="preserve">18–21</w:t>
+              <w:t xml:space="preserve">18 sampai 21</w:t>
             </w:r>
           </w:p>
         </w:tc>
@@ -960,7 +972,7 @@
         <w:t xml:space="preserve"> </w:t>
       </w:r>
       <w:r>
-        <w:t xml:space="preserve">(Bab 10–12). Logikanya berjenjang:</w:t>
+        <w:t xml:space="preserve">(Bab 10 sampai 12). Logikanya berjenjang:</w:t>
       </w:r>
     </w:p>
     <w:p>
@@ -1273,7 +1285,7 @@
         <w:t xml:space="preserve"> </w:t>
       </w:r>
       <w:r>
-        <w:t xml:space="preserve">visi adalah bintang penunjuk arah (Bab 1–2), lingkungan eksternal adalah arah angin (Bab 3), resources dan capabilities adalah layar dan mesin (Bab 4), pilihan strategi generik dan pelengkapnya adalah haluan (Bab 5–8). Bab 10 menjawab: siapa awak kapalnya, apa yang mereka kuasai, dan bagaimana mereka ditata di geladak agar kapal benar-benar bergerak ke arah yang dipilih.</w:t>
+        <w:t xml:space="preserve">visi adalah bintang penunjuk arah (Bab 1 sampai 2), lingkungan eksternal adalah arah angin (Bab 3), resources dan capabilities adalah layar dan mesin (Bab 4), pilihan strategi generik dan pelengkapnya adalah haluan (Bab 5 sampai 8). Bab 10 menjawab: siapa awak kapalnya, apa yang mereka kuasai, dan bagaimana mereka ditata di geladak agar kapal benar-benar bergerak ke arah yang dipilih.</w:t>
       </w:r>
     </w:p>
     <w:bookmarkEnd w:id="22"/>
@@ -1286,13 +1298,13 @@
         <w:t xml:space="preserve">Bagian C. Uraian per Slide</w:t>
       </w:r>
     </w:p>
-    <w:bookmarkStart w:id="23" w:name="slide-1-sampul"/>
+    <w:bookmarkStart w:id="23" w:name="slide-1.-sampul"/>
     <w:p>
       <w:pPr>
         <w:pStyle w:val="Heading2"/>
       </w:pPr>
       <w:r>
-        <w:t xml:space="preserve">Slide 1 — Sampul</w:t>
+        <w:t xml:space="preserve">Slide 1. Sampul</w:t>
       </w:r>
     </w:p>
     <w:p>
@@ -1364,13 +1376,13 @@
       </w:r>
     </w:p>
     <w:bookmarkEnd w:id="23"/>
-    <w:bookmarkStart w:id="24" w:name="slide-2-alur-pembahasan"/>
+    <w:bookmarkStart w:id="24" w:name="slide-2.-alur-pembahasan"/>
     <w:p>
       <w:pPr>
         <w:pStyle w:val="Heading2"/>
       </w:pPr>
       <w:r>
-        <w:t xml:space="preserve">Slide 2 — Alur Pembahasan</w:t>
+        <w:t xml:space="preserve">Slide 2. Alur Pembahasan</w:t>
       </w:r>
     </w:p>
     <w:p>
@@ -1410,13 +1422,13 @@
       </w:r>
     </w:p>
     <w:bookmarkEnd w:id="24"/>
-    <w:bookmarkStart w:id="25" w:name="X996d070b781469c682cf70ee3f94b8a88e1e700"/>
+    <w:bookmarkStart w:id="25" w:name="X2b7f4e7e7dc5a9e95f35629e72b27406c9cbb7a"/>
     <w:p>
       <w:pPr>
         <w:pStyle w:val="Heading2"/>
       </w:pPr>
       <w:r>
-        <w:t xml:space="preserve">Slide 3 — Dari Merumuskan ke Mengeksekusi Strategi</w:t>
+        <w:t xml:space="preserve">Slide 3. Dari Merumuskan ke Mengeksekusi Strategi</w:t>
       </w:r>
     </w:p>
     <w:p>
@@ -1627,13 +1639,13 @@
       </w:r>
     </w:p>
     <w:bookmarkEnd w:id="25"/>
-    <w:bookmarkStart w:id="26" w:name="X63fab502ea707a18812237c99f9d922162c6fff"/>
+    <w:bookmarkStart w:id="26" w:name="X032d8ec44bc24e0fc1bf1ff3532f39dab6ac470"/>
     <w:p>
       <w:pPr>
         <w:pStyle w:val="Heading2"/>
       </w:pPr>
       <w:r>
-        <w:t xml:space="preserve">Slide 4 — Mengapa Eksekusi Menjadi Ujian Sesungguhnya</w:t>
+        <w:t xml:space="preserve">Slide 4. Eksekusi adalah Ujian yang Sesungguhnya</w:t>
       </w:r>
     </w:p>
     <w:p>
@@ -1868,13 +1880,13 @@
       </w:r>
     </w:p>
     <w:bookmarkEnd w:id="26"/>
-    <w:bookmarkStart w:id="27" w:name="X3a6caf1526b55e4495186ba6909a6b7cb465ad2"/>
+    <w:bookmarkStart w:id="27" w:name="X70993ef7c6ffb69573361c8fd5b4f3422ffb464"/>
     <w:p>
       <w:pPr>
         <w:pStyle w:val="Heading2"/>
       </w:pPr>
       <w:r>
-        <w:t xml:space="preserve">Slide 5 — Sepuluh Tugas Dasar (Figure 10.1, digambar ulang)</w:t>
+        <w:t xml:space="preserve">Slide 5. Sepuluh Tugas dalam Strategy Execution (Figure 10.1, digambar ulang)</w:t>
       </w:r>
     </w:p>
     <w:p>
@@ -2129,13 +2141,13 @@
       </w:r>
     </w:p>
     <w:bookmarkEnd w:id="27"/>
-    <w:bookmarkStart w:id="28" w:name="X846ce466bd00b8f58d31ed2a36781db73689d7a"/>
+    <w:bookmarkStart w:id="28" w:name="X4f1ce81baef09d0c3ad5b180a77be65db617ec7"/>
     <w:p>
       <w:pPr>
         <w:pStyle w:val="Heading2"/>
       </w:pPr>
       <w:r>
-        <w:t xml:space="preserve">Slide 6 — Tiga Aksi Kunci (Figure 10.2, digambar ulang)</w:t>
+        <w:t xml:space="preserve">Slide 6. Tiga Aksi Kunci Membangun Organisasi yang Mampu (Figure 10.2, digambar ulang)</w:t>
       </w:r>
     </w:p>
     <w:p>
@@ -2277,13 +2289,13 @@
       </w:r>
     </w:p>
     <w:bookmarkEnd w:id="28"/>
-    <w:bookmarkStart w:id="29" w:name="slide-7-menyusun-tim-manajemen-yang-kuat"/>
+    <w:bookmarkStart w:id="29" w:name="X2035c25457a9267863b1a41e268edfd1114f04a"/>
     <w:p>
       <w:pPr>
         <w:pStyle w:val="Heading2"/>
       </w:pPr>
       <w:r>
-        <w:t xml:space="preserve">Slide 7 — Menyusun Tim Manajemen yang Kuat</w:t>
+        <w:t xml:space="preserve">Slide 7. Menyusun Tim Manajemen yang Kuat</w:t>
       </w:r>
     </w:p>
     <w:p>
@@ -2551,13 +2563,13 @@
       </w:r>
     </w:p>
     <w:bookmarkEnd w:id="29"/>
-    <w:bookmarkStart w:id="30" w:name="X91d1c56cede22077be7f3d75768d23e5bc42818"/>
+    <w:bookmarkStart w:id="30" w:name="X68232f1b4141bf6e3659807a218086a84b695cd"/>
     <w:p>
       <w:pPr>
         <w:pStyle w:val="Heading2"/>
       </w:pPr>
       <w:r>
-        <w:t xml:space="preserve">Slide 8 — Merekrut, Melatih, dan Mempertahankan Karyawan</w:t>
+        <w:t xml:space="preserve">Slide 8. Merekrut, Melatih, dan Mempertahankan Karyawan</w:t>
       </w:r>
     </w:p>
     <w:p>
@@ -2862,13 +2874,13 @@
       </w:r>
     </w:p>
     <w:bookmarkEnd w:id="30"/>
-    <w:bookmarkStart w:id="31" w:name="X6c8be05473435c098ddd0ce4b9ffb72b19f4cb8"/>
+    <w:bookmarkStart w:id="31" w:name="X34225e2b3fb2f011dc8b8b0f04168a454ca0265"/>
     <w:p>
       <w:pPr>
         <w:pStyle w:val="Heading2"/>
       </w:pPr>
       <w:r>
-        <w:t xml:space="preserve">Slide 9 — Membangun Resources dan Organizational Capabilities</w:t>
+        <w:t xml:space="preserve">Slide 9. Tiga Jalan Membangun Organizational Capabilities</w:t>
       </w:r>
     </w:p>
     <w:p>
@@ -3006,7 +3018,996 @@
         <w:t xml:space="preserve"> </w:t>
       </w:r>
       <w:r>
-        <w:t xml:space="preserve">Baris</w:t>
+        <w:t xml:space="preserve">Label kecepatan dan kendali pada tiap kartu adalah cara baca penyaji, bukan tabel buku; sampaikan sebagai cara membaca, bukan kutipan.</w:t>
+      </w:r>
+    </w:p>
+    <w:p>
+      <w:pPr>
+        <w:pStyle w:val="BodyText"/>
+      </w:pPr>
+      <w:r>
+        <w:rPr>
+          <w:bCs/>
+          <w:b/>
+        </w:rPr>
+        <w:t xml:space="preserve">Why terus-menerus.</w:t>
+      </w:r>
+      <w:r>
+        <w:t xml:space="preserve"> </w:t>
+      </w:r>
+      <w:r>
+        <w:t xml:space="preserve">Strategi baru menuntut</w:t>
+      </w:r>
+      <w:r>
+        <w:t xml:space="preserve"> </w:t>
+      </w:r>
+      <w:r>
+        <w:rPr>
+          <w:iCs/>
+          <w:i/>
+        </w:rPr>
+        <w:t xml:space="preserve">competency</w:t>
+      </w:r>
+      <w:r>
+        <w:t xml:space="preserve"> </w:t>
+      </w:r>
+      <w:r>
+        <w:t xml:space="preserve">baru; strategi lama pun menuntut</w:t>
+      </w:r>
+      <w:r>
+        <w:t xml:space="preserve"> </w:t>
+      </w:r>
+      <w:r>
+        <w:rPr>
+          <w:iCs/>
+          <w:i/>
+        </w:rPr>
+        <w:t xml:space="preserve">upgrade</w:t>
+      </w:r>
+      <w:r>
+        <w:t xml:space="preserve"> </w:t>
+      </w:r>
+      <w:r>
+        <w:t xml:space="preserve">karena kondisi berubah.</w:t>
+      </w:r>
+    </w:p>
+    <w:bookmarkEnd w:id="31"/>
+    <w:bookmarkStart w:id="32" w:name="X1a0709f97208638886053c934ad8d36e3105f69"/>
+    <w:p>
+      <w:pPr>
+        <w:pStyle w:val="Heading2"/>
+      </w:pPr>
+      <w:r>
+        <w:t xml:space="preserve">Slide 10. Capability Tumbuh Bertahap, Tidak Dibeli Semalam</w:t>
+      </w:r>
+    </w:p>
+    <w:p>
+      <w:pPr>
+        <w:pStyle w:val="FirstParagraph"/>
+      </w:pPr>
+      <w:r>
+        <w:rPr>
+          <w:bCs/>
+          <w:b/>
+        </w:rPr>
+        <w:t xml:space="preserve">Inti pesan.</w:t>
+      </w:r>
+      <w:r>
+        <w:t xml:space="preserve"> </w:t>
+      </w:r>
+      <w:r>
+        <w:t xml:space="preserve">Capability tumbuh bertahap:</w:t>
+      </w:r>
+      <w:r>
+        <w:t xml:space="preserve"> </w:t>
+      </w:r>
+      <w:r>
+        <w:rPr>
+          <w:iCs/>
+          <w:i/>
+        </w:rPr>
+        <w:t xml:space="preserve">ability</w:t>
+      </w:r>
+      <w:r>
+        <w:t xml:space="preserve"> </w:t>
+      </w:r>
+      <w:r>
+        <w:t xml:space="preserve">→</w:t>
+      </w:r>
+      <w:r>
+        <w:t xml:space="preserve"> </w:t>
+      </w:r>
+      <w:r>
+        <w:rPr>
+          <w:iCs/>
+          <w:i/>
+        </w:rPr>
+        <w:t xml:space="preserve">tried-and-true competence</w:t>
+      </w:r>
+      <w:r>
+        <w:t xml:space="preserve"> </w:t>
+      </w:r>
+      <w:r>
+        <w:t xml:space="preserve">→ capability yang terus disegarkan.</w:t>
+      </w:r>
+    </w:p>
+    <w:p>
+      <w:pPr>
+        <w:pStyle w:val="BodyText"/>
+      </w:pPr>
+      <w:r>
+        <w:rPr>
+          <w:bCs/>
+          <w:b/>
+        </w:rPr>
+        <w:t xml:space="preserve">Penjelasan konsep.</w:t>
+      </w:r>
+      <w:r>
+        <w:t xml:space="preserve"> </w:t>
+      </w:r>
+      <w:r>
+        <w:t xml:space="preserve">Tahap pertama adalah kemampuan melakukan sesuatu meski belum sempurna: memilih orang dengan skill relevan, bereksperimen,</w:t>
+      </w:r>
+      <w:r>
+        <w:t xml:space="preserve"> </w:t>
+      </w:r>
+      <w:r>
+        <w:rPr>
+          <w:iCs/>
+          <w:i/>
+        </w:rPr>
+        <w:t xml:space="preserve">trial and error</w:t>
+      </w:r>
+      <w:r>
+        <w:t xml:space="preserve">. Dengan</w:t>
+      </w:r>
+      <w:r>
+        <w:t xml:space="preserve"> </w:t>
+      </w:r>
+      <w:r>
+        <w:rPr>
+          <w:iCs/>
+          <w:i/>
+        </w:rPr>
+        <w:t xml:space="preserve">task repetition</w:t>
+      </w:r>
+      <w:r>
+        <w:t xml:space="preserve"> </w:t>
+      </w:r>
+      <w:r>
+        <w:t xml:space="preserve">dan</w:t>
+      </w:r>
+      <w:r>
+        <w:t xml:space="preserve"> </w:t>
+      </w:r>
+      <w:r>
+        <w:rPr>
+          <w:iCs/>
+          <w:i/>
+        </w:rPr>
+        <w:t xml:space="preserve">learning by doing</w:t>
+      </w:r>
+      <w:r>
+        <w:t xml:space="preserve">, kemampuan berkembang menjadi</w:t>
+      </w:r>
+      <w:r>
+        <w:t xml:space="preserve"> </w:t>
+      </w:r>
+      <w:r>
+        <w:rPr>
+          <w:iCs/>
+          <w:i/>
+        </w:rPr>
+        <w:t xml:space="preserve">competence</w:t>
+      </w:r>
+      <w:r>
+        <w:t xml:space="preserve"> </w:t>
+      </w:r>
+      <w:r>
+        <w:t xml:space="preserve">yang konsisten pada biaya yang dapat diterima; ini menuntut investasi berkelanjutan. Capability harus terus disegarkan agar selaras dengan ekspektasi pelanggan, kondisi persaingan, dan inisiatif baru (</w:t>
+      </w:r>
+      <w:r>
+        <w:rPr>
+          <w:iCs/>
+          <w:i/>
+        </w:rPr>
+        <w:t xml:space="preserve">dynamic capability</w:t>
+      </w:r>
+      <w:r>
+        <w:t xml:space="preserve">, Bab 4). Memperbarui dan merekombinasi capability yang ada jauh lebih mudah daripada membangun dari nol. Akselerator: menjadikan</w:t>
+      </w:r>
+      <w:r>
+        <w:t xml:space="preserve"> </w:t>
+      </w:r>
+      <w:r>
+        <w:rPr>
+          <w:iCs/>
+          <w:i/>
+        </w:rPr>
+        <w:t xml:space="preserve">learning</w:t>
+      </w:r>
+      <w:r>
+        <w:t xml:space="preserve"> </w:t>
+      </w:r>
+      <w:r>
+        <w:t xml:space="preserve">upaya yang disengaja dan memberi insentif.</w:t>
+      </w:r>
+    </w:p>
+    <w:p>
+      <w:pPr>
+        <w:pStyle w:val="BodyText"/>
+      </w:pPr>
+      <w:r>
+        <w:rPr>
+          <w:bCs/>
+          <w:b/>
+        </w:rPr>
+        <w:t xml:space="preserve">Dua bentuk tindakan manajerial.</w:t>
+      </w:r>
+      <w:r>
+        <w:t xml:space="preserve"> </w:t>
+      </w:r>
+      <w:r>
+        <w:t xml:space="preserve">Memperkuat basis skill, knowledge, experience (dapat di semua level) dan mengoordinasikan serta mengintegrasikan work groups (paling baik oleh eksekutif senior yang punya</w:t>
+      </w:r>
+      <w:r>
+        <w:t xml:space="preserve"> </w:t>
+      </w:r>
+      <w:r>
+        <w:rPr>
+          <w:iCs/>
+          <w:i/>
+        </w:rPr>
+        <w:t xml:space="preserve">clout</w:t>
+      </w:r>
+      <w:r>
+        <w:t xml:space="preserve">).</w:t>
+      </w:r>
+    </w:p>
+    <w:p>
+      <w:pPr>
+        <w:pStyle w:val="BodyText"/>
+      </w:pPr>
+      <w:r>
+        <w:rPr>
+          <w:bCs/>
+          <w:b/>
+        </w:rPr>
+        <w:t xml:space="preserve">Contoh buku.</w:t>
+      </w:r>
+      <w:r>
+        <w:t xml:space="preserve"> </w:t>
+      </w:r>
+      <w:r>
+        <w:t xml:space="preserve">Williams-Sonoma: katalog (1970), akuisisi Pottery Barn, e-commerce (2000), masuk Fortune 500 (2019), pendapatan US$8,7 miliar (2022). Toyota:</w:t>
+      </w:r>
+      <w:r>
+        <w:t xml:space="preserve"> </w:t>
+      </w:r>
+      <w:r>
+        <w:rPr>
+          <w:iCs/>
+          <w:i/>
+        </w:rPr>
+        <w:t xml:space="preserve">upgrade</w:t>
+      </w:r>
+      <w:r>
+        <w:t xml:space="preserve"> </w:t>
+      </w:r>
+      <w:r>
+        <w:t xml:space="preserve">teknologi hybrid dan penyempurnaan</w:t>
+      </w:r>
+      <w:r>
+        <w:t xml:space="preserve"> </w:t>
+      </w:r>
+      <w:r>
+        <w:rPr>
+          <w:iCs/>
+          <w:i/>
+        </w:rPr>
+        <w:t xml:space="preserve">Toyota Production System</w:t>
+      </w:r>
+      <w:r>
+        <w:t xml:space="preserve"> </w:t>
+      </w:r>
+      <w:r>
+        <w:t xml:space="preserve">hingga melampaui General Motors.</w:t>
+      </w:r>
+    </w:p>
+    <w:bookmarkEnd w:id="32"/>
+    <w:bookmarkStart w:id="33" w:name="X924cbf855a7a678aae5cd85ace5f96707dd59e8"/>
+    <w:p>
+      <w:pPr>
+        <w:pStyle w:val="Heading2"/>
+      </w:pPr>
+      <w:r>
+        <w:t xml:space="preserve">Slide 11. Akuisisi dan Kemitraan Membeli Waktu, Bukan Integrasi</w:t>
+      </w:r>
+    </w:p>
+    <w:p>
+      <w:pPr>
+        <w:pStyle w:val="FirstParagraph"/>
+      </w:pPr>
+      <w:r>
+        <w:rPr>
+          <w:bCs/>
+          <w:b/>
+        </w:rPr>
+        <w:t xml:space="preserve">Inti pesan.</w:t>
+      </w:r>
+      <w:r>
+        <w:t xml:space="preserve"> </w:t>
+      </w:r>
+      <w:r>
+        <w:t xml:space="preserve">Jalur eksternal membeli waktu, tetapi tidak membeli integrasi.</w:t>
+      </w:r>
+    </w:p>
+    <w:p>
+      <w:pPr>
+        <w:pStyle w:val="BodyText"/>
+      </w:pPr>
+      <w:r>
+        <w:rPr>
+          <w:bCs/>
+          <w:b/>
+        </w:rPr>
+        <w:t xml:space="preserve">Penjelasan konsep.</w:t>
+      </w:r>
+      <w:r>
+        <w:t xml:space="preserve"> </w:t>
+      </w:r>
+      <w:r>
+        <w:rPr>
+          <w:iCs/>
+          <w:i/>
+        </w:rPr>
+        <w:t xml:space="preserve">M&amp;A</w:t>
+      </w:r>
+      <w:r>
+        <w:t xml:space="preserve"> </w:t>
+      </w:r>
+      <w:r>
+        <w:t xml:space="preserve">esensial bila (1) capability tidak dapat dibangun sendiri karena terlalu jauh dari basis yang ada, dan (2) waktu sangat menentukan. Keunggulannya kecepatan. Risikonya: capability berupa</w:t>
+      </w:r>
+      <w:r>
+        <w:t xml:space="preserve"> </w:t>
+      </w:r>
+      <w:r>
+        <w:rPr>
+          <w:iCs/>
+          <w:i/>
+        </w:rPr>
+        <w:t xml:space="preserve">tacit knowledge</w:t>
+      </w:r>
+      <w:r>
+        <w:t xml:space="preserve"> </w:t>
+      </w:r>
+      <w:r>
+        <w:t xml:space="preserve">dan</w:t>
+      </w:r>
+      <w:r>
+        <w:t xml:space="preserve"> </w:t>
+      </w:r>
+      <w:r>
+        <w:rPr>
+          <w:iCs/>
+          <w:i/>
+        </w:rPr>
+        <w:t xml:space="preserve">complex routines</w:t>
+      </w:r>
+      <w:r>
+        <w:t xml:space="preserve"> </w:t>
+      </w:r>
+      <w:r>
+        <w:t xml:space="preserve">yang tidak mudah dipindahkan; inkompatibilitas sistem; produktivitas dapat turun di bawah manajemen baru; dalam kasus terburuk akuisisi merusak capability yang diincar. Contoh: Meta mengeluarkan lebih dari US$25 miliar untuk teknologi AR, pengenalan suara, dan penerjemahan, namun integrasi terbukti sulit.</w:t>
+      </w:r>
+      <w:r>
+        <w:t xml:space="preserve"> </w:t>
+      </w:r>
+      <w:r>
+        <w:rPr>
+          <w:iCs/>
+          <w:i/>
+        </w:rPr>
+        <w:t xml:space="preserve">Collaborative partnerships</w:t>
+      </w:r>
+      <w:r>
+        <w:t xml:space="preserve"> </w:t>
+      </w:r>
+      <w:r>
+        <w:t xml:space="preserve">memiliki tiga jalur:</w:t>
+      </w:r>
+      <w:r>
+        <w:t xml:space="preserve"> </w:t>
+      </w:r>
+      <w:r>
+        <w:rPr>
+          <w:iCs/>
+          <w:i/>
+        </w:rPr>
+        <w:t xml:space="preserve">outsource</w:t>
+      </w:r>
+      <w:r>
+        <w:t xml:space="preserve"> </w:t>
+      </w:r>
+      <w:r>
+        <w:t xml:space="preserve">fungsi yang lemah (Bab 6), berkolaborasi dalam</w:t>
+      </w:r>
+      <w:r>
+        <w:t xml:space="preserve"> </w:t>
+      </w:r>
+      <w:r>
+        <w:rPr>
+          <w:iCs/>
+          <w:i/>
+        </w:rPr>
+        <w:t xml:space="preserve">joint venture</w:t>
+      </w:r>
+      <w:r>
+        <w:t xml:space="preserve"> </w:t>
+      </w:r>
+      <w:r>
+        <w:t xml:space="preserve">atau</w:t>
+      </w:r>
+      <w:r>
+        <w:t xml:space="preserve"> </w:t>
+      </w:r>
+      <w:r>
+        <w:rPr>
+          <w:iCs/>
+          <w:i/>
+        </w:rPr>
+        <w:t xml:space="preserve">strategic alliance</w:t>
+      </w:r>
+      <w:r>
+        <w:t xml:space="preserve"> </w:t>
+      </w:r>
+      <w:r>
+        <w:t xml:space="preserve">dengan mitra komplementer (pilih mitra berdasarkan</w:t>
+      </w:r>
+      <w:r>
+        <w:t xml:space="preserve"> </w:t>
+      </w:r>
+      <w:r>
+        <w:rPr>
+          <w:iCs/>
+          <w:i/>
+        </w:rPr>
+        <w:t xml:space="preserve">management style</w:t>
+      </w:r>
+      <w:r>
+        <w:t xml:space="preserve">,</w:t>
+      </w:r>
+      <w:r>
+        <w:t xml:space="preserve"> </w:t>
+      </w:r>
+      <w:r>
+        <w:rPr>
+          <w:iCs/>
+          <w:i/>
+        </w:rPr>
+        <w:t xml:space="preserve">culture</w:t>
+      </w:r>
+      <w:r>
+        <w:t xml:space="preserve">,</w:t>
+      </w:r>
+      <w:r>
+        <w:t xml:space="preserve"> </w:t>
+      </w:r>
+      <w:r>
+        <w:rPr>
+          <w:iCs/>
+          <w:i/>
+        </w:rPr>
+        <w:t xml:space="preserve">goals</w:t>
+      </w:r>
+      <w:r>
+        <w:t xml:space="preserve">), dan belajar dari mitra lalu menginternalisasi; bila keuntungan hanya sepihak, itu</w:t>
+      </w:r>
+      <w:r>
+        <w:t xml:space="preserve"> </w:t>
+      </w:r>
+      <w:r>
+        <w:rPr>
+          <w:iCs/>
+          <w:i/>
+        </w:rPr>
+        <w:t xml:space="preserve">abuse of trust</w:t>
+      </w:r>
+      <w:r>
+        <w:t xml:space="preserve">. Kemitraan lintas industri lebih aman (kendaraan otonom; Nike, Bluesign).</w:t>
+      </w:r>
+    </w:p>
+    <w:p>
+      <w:pPr>
+        <w:pStyle w:val="BodyText"/>
+      </w:pPr>
+      <w:r>
+        <w:rPr>
+          <w:bCs/>
+          <w:b/>
+        </w:rPr>
+        <w:t xml:space="preserve">Benang merah.</w:t>
+      </w:r>
+      <w:r>
+        <w:t xml:space="preserve"> </w:t>
+      </w:r>
+      <w:r>
+        <w:t xml:space="preserve">Capability yang dibeli tetap harus ditanam ke rutinitas organisasi sendiri; di situlah aksi 1 (orang) dan aksi 3 (struktur) menentukan. Kalimat ini menautkan kembali ke peta Figure 10.2.</w:t>
+      </w:r>
+    </w:p>
+    <w:bookmarkEnd w:id="33"/>
+    <w:bookmarkStart w:id="34" w:name="X0cfeaabce8091a93b959103a91952c885b31209"/>
+    <w:p>
+      <w:pPr>
+        <w:pStyle w:val="Heading2"/>
+      </w:pPr>
+      <w:r>
+        <w:t xml:space="preserve">Slide 12. Eksekusi yang Unggul adalah Keunggulan Itu Sendiri (IC 10.3, Zara)</w:t>
+      </w:r>
+    </w:p>
+    <w:p>
+      <w:pPr>
+        <w:pStyle w:val="FirstParagraph"/>
+      </w:pPr>
+      <w:r>
+        <w:rPr>
+          <w:bCs/>
+          <w:b/>
+        </w:rPr>
+        <w:t xml:space="preserve">Inti pesan.</w:t>
+      </w:r>
+      <w:r>
+        <w:t xml:space="preserve"> </w:t>
+      </w:r>
+      <w:r>
+        <w:t xml:space="preserve">Eksekusi bisa menjadi sumber keunggulan langsung, bukan sekadar penopang strategi.</w:t>
+      </w:r>
+    </w:p>
+    <w:p>
+      <w:pPr>
+        <w:pStyle w:val="BodyText"/>
+      </w:pPr>
+      <w:r>
+        <w:rPr>
+          <w:bCs/>
+          <w:b/>
+        </w:rPr>
+        <w:t xml:space="preserve">Penjelasan konsep.</w:t>
+      </w:r>
+      <w:r>
+        <w:t xml:space="preserve"> </w:t>
+      </w:r>
+      <w:r>
+        <w:t xml:space="preserve">Strategi</w:t>
+      </w:r>
+      <w:r>
+        <w:t xml:space="preserve"> </w:t>
+      </w:r>
+      <w:r>
+        <w:rPr>
+          <w:iCs/>
+          <w:i/>
+        </w:rPr>
+        <w:t xml:space="preserve">fast fashion</w:t>
+      </w:r>
+      <w:r>
+        <w:t xml:space="preserve"> </w:t>
+      </w:r>
+      <w:r>
+        <w:t xml:space="preserve">Zara tidak unik; keunggulannya ada pada eksekusi setiap mata rantai nilai. Angka dengan pembanding: 4 minggu dari desain ke toko (pesaing 6 bulan); 12.000 model baru per tahun (industri 3.000); 17 kunjungan pelanggan per tahun (pesaing 2); item rata-rata hanya 11 hari di toko; RFID menarik item lambat setelah 3 sampai 4 minggu. Produksi lot kecil dekat kantor pusat, rantai pasok terintegrasi vertikal tanpa gudang, nol belanja iklan namun lokasi premium, pengiriman hingga dua kali seminggu. Tantangan: H&amp;M, Uniqlo, Shein, dan pergeseran daring.</w:t>
+      </w:r>
+    </w:p>
+    <w:p>
+      <w:pPr>
+        <w:pStyle w:val="BodyText"/>
+      </w:pPr>
+      <w:r>
+        <w:rPr>
+          <w:bCs/>
+          <w:b/>
+        </w:rPr>
+        <w:t xml:space="preserve">Why keunggulan ini bertahan.</w:t>
+      </w:r>
+      <w:r>
+        <w:t xml:space="preserve"> </w:t>
+      </w:r>
+      <w:r>
+        <w:rPr>
+          <w:iCs/>
+          <w:i/>
+        </w:rPr>
+        <w:t xml:space="preserve">Execution capabilities</w:t>
+      </w:r>
+      <w:r>
+        <w:t xml:space="preserve"> </w:t>
+      </w:r>
+      <w:r>
+        <w:t xml:space="preserve">bersifat</w:t>
+      </w:r>
+      <w:r>
+        <w:t xml:space="preserve"> </w:t>
+      </w:r>
+      <w:r>
+        <w:rPr>
+          <w:iCs/>
+          <w:i/>
+        </w:rPr>
+        <w:t xml:space="preserve">socially complex</w:t>
+      </w:r>
+      <w:r>
+        <w:t xml:space="preserve"> </w:t>
+      </w:r>
+      <w:r>
+        <w:t xml:space="preserve">dan terbentuk lewat pengalaman bertahun-tahun, sehingga sulit ditiru dan tidak tersubstitusi (dua dari empat uji resource Bab 4). Buku menyimpulkan: ketika strategi mudah ditiru, satu-satunya jalan menuju keunggulan yang bertahan adalah</w:t>
+      </w:r>
+      <w:r>
+        <w:t xml:space="preserve"> </w:t>
+      </w:r>
+      <w:r>
+        <w:rPr>
+          <w:iCs/>
+          <w:i/>
+        </w:rPr>
+        <w:t xml:space="preserve">out-execute</w:t>
+      </w:r>
+      <w:r>
+        <w:t xml:space="preserve"> </w:t>
+      </w:r>
+      <w:r>
+        <w:t xml:space="preserve">pesaing.</w:t>
+      </w:r>
+    </w:p>
+    <w:bookmarkEnd w:id="34"/>
+    <w:bookmarkStart w:id="35" w:name="Xc08345fbe0fcd094a0c5c9d5c22576fc0c80554"/>
+    <w:p>
+      <w:pPr>
+        <w:pStyle w:val="Heading2"/>
+      </w:pPr>
+      <w:r>
+        <w:t xml:space="preserve">Slide 13. Struktur Mengikuti Strategi (Figure 10.3, digambar ulang)</w:t>
+      </w:r>
+    </w:p>
+    <w:p>
+      <w:pPr>
+        <w:pStyle w:val="FirstParagraph"/>
+      </w:pPr>
+      <w:r>
+        <w:rPr>
+          <w:bCs/>
+          <w:b/>
+        </w:rPr>
+        <w:t xml:space="preserve">Inti pesan.</w:t>
+      </w:r>
+      <w:r>
+        <w:t xml:space="preserve"> </w:t>
+      </w:r>
+      <w:r>
+        <w:t xml:space="preserve">Satu aturan baku: struktur harus dicocokkan dengan kebutuhan implementasi strategi.</w:t>
+      </w:r>
+    </w:p>
+    <w:p>
+      <w:pPr>
+        <w:pStyle w:val="BodyText"/>
+      </w:pPr>
+      <w:r>
+        <w:rPr>
+          <w:bCs/>
+          <w:b/>
+        </w:rPr>
+        <w:t xml:space="preserve">Penjelasan konsep.</w:t>
+      </w:r>
+      <w:r>
+        <w:t xml:space="preserve"> </w:t>
+      </w:r>
+      <w:r>
+        <w:rPr>
+          <w:iCs/>
+          <w:i/>
+        </w:rPr>
+        <w:t xml:space="preserve">Core concept</w:t>
+      </w:r>
+      <w:r>
+        <w:t xml:space="preserve">:</w:t>
+      </w:r>
+      <w:r>
+        <w:t xml:space="preserve"> </w:t>
+      </w:r>
+      <w:r>
+        <w:rPr>
+          <w:iCs/>
+          <w:i/>
+        </w:rPr>
+        <w:t xml:space="preserve">organizational structure</w:t>
+      </w:r>
+      <w:r>
+        <w:t xml:space="preserve"> </w:t>
+      </w:r>
+      <w:r>
+        <w:t xml:space="preserve">adalah pengaturan formal dan informal atas tugas, tanggung jawab,</w:t>
+      </w:r>
+      <w:r>
+        <w:t xml:space="preserve"> </w:t>
+      </w:r>
+      <w:r>
+        <w:rPr>
+          <w:iCs/>
+          <w:i/>
+        </w:rPr>
+        <w:t xml:space="preserve">lines of authority</w:t>
+      </w:r>
+      <w:r>
+        <w:t xml:space="preserve">, dan</w:t>
+      </w:r>
+      <w:r>
+        <w:t xml:space="preserve"> </w:t>
+      </w:r>
+      <w:r>
+        <w:rPr>
+          <w:iCs/>
+          <w:i/>
+        </w:rPr>
+        <w:t xml:space="preserve">reporting relationships</w:t>
+      </w:r>
+      <w:r>
+        <w:t xml:space="preserve"> </w:t>
+      </w:r>
+      <w:r>
+        <w:t xml:space="preserve">(buku mengutip Chandler, 1962,</w:t>
+      </w:r>
+      <w:r>
+        <w:t xml:space="preserve"> </w:t>
+      </w:r>
+      <w:r>
+        <w:rPr>
+          <w:iCs/>
+          <w:i/>
+        </w:rPr>
+        <w:t xml:space="preserve">Strategy and Structure</w:t>
+      </w:r>
+      <w:r>
+        <w:t xml:space="preserve">). Lima keputusan penataan kerja: (1) aktivitas mana internal dan mana</w:t>
+      </w:r>
+      <w:r>
+        <w:t xml:space="preserve"> </w:t>
+      </w:r>
+      <w:r>
+        <w:rPr>
+          <w:iCs/>
+          <w:i/>
+        </w:rPr>
+        <w:t xml:space="preserve">outsource</w:t>
+      </w:r>
+      <w:r>
+        <w:t xml:space="preserve">; (2) menyelaraskan tipe struktur; (3) derajat sentralisasi vs delegasi; (4) koordinasi lintas unit; (5) kolaborasi dengan mitra eksternal. Semua bermuara pada satu keluaran:</w:t>
+      </w:r>
+      <w:r>
+        <w:t xml:space="preserve"> </w:t>
+      </w:r>
+      <w:r>
+        <w:rPr>
+          <w:iCs/>
+          <w:i/>
+        </w:rPr>
+        <w:t xml:space="preserve">an organizational structure matched to the requirements of successful strategy execution</w:t>
+      </w:r>
+      <w:r>
+        <w:t xml:space="preserve">.</w:t>
+      </w:r>
+    </w:p>
+    <w:p>
+      <w:pPr>
+        <w:pStyle w:val="BodyText"/>
+      </w:pPr>
+      <w:r>
+        <w:rPr>
+          <w:bCs/>
+          <w:b/>
+        </w:rPr>
+        <w:t xml:space="preserve">Why.</w:t>
+      </w:r>
+      <w:r>
+        <w:t xml:space="preserve"> </w:t>
+      </w:r>
+      <w:r>
+        <w:t xml:space="preserve">Struktur yang tidak cocok menimbulkan</w:t>
+      </w:r>
+      <w:r>
+        <w:t xml:space="preserve"> </w:t>
+      </w:r>
+      <w:r>
+        <w:rPr>
+          <w:iCs/>
+          <w:i/>
+        </w:rPr>
+        <w:t xml:space="preserve">bureaucratic costs</w:t>
+      </w:r>
+      <w:r>
+        <w:t xml:space="preserve"> </w:t>
+      </w:r>
+      <w:r>
+        <w:t xml:space="preserve">tinggi dan kegagalan koordinasi; desain yang baik menurunkan biaya, mempercepat</w:t>
+      </w:r>
+      <w:r>
+        <w:t xml:space="preserve"> </w:t>
+      </w:r>
+      <w:r>
+        <w:rPr>
+          <w:iCs/>
+          <w:i/>
+        </w:rPr>
+        <w:t xml:space="preserve">capability-building</w:t>
+      </w:r>
+      <w:r>
+        <w:t xml:space="preserve">, dan memungkinkan lebih dulu ke pasar.</w:t>
+      </w:r>
+    </w:p>
+    <w:bookmarkEnd w:id="35"/>
+    <w:bookmarkStart w:id="36" w:name="X8cc0ee2340a34b04e2442e997b6eedc6c02ac0c"/>
+    <w:p>
+      <w:pPr>
+        <w:pStyle w:val="Heading2"/>
+      </w:pPr>
+      <w:r>
+        <w:t xml:space="preserve">Slide 14. Dikerjakan Sendiri atau Di-outsource? (IC 10.4, Apple)</w:t>
+      </w:r>
+    </w:p>
+    <w:p>
+      <w:pPr>
+        <w:pStyle w:val="FirstParagraph"/>
+      </w:pPr>
+      <w:r>
+        <w:rPr>
+          <w:bCs/>
+          <w:b/>
+        </w:rPr>
+        <w:t xml:space="preserve">Inti pesan.</w:t>
+      </w:r>
+      <w:r>
+        <w:t xml:space="preserve"> </w:t>
+      </w:r>
+      <w:r>
+        <w:t xml:space="preserve">Outsourcing meningkatkan fokus pada aktivitas kritis, dengan batas yang jelas.</w:t>
+      </w:r>
+    </w:p>
+    <w:p>
+      <w:pPr>
+        <w:pStyle w:val="BodyText"/>
+      </w:pPr>
+      <w:r>
+        <w:rPr>
+          <w:bCs/>
+          <w:b/>
+        </w:rPr>
+        <w:t xml:space="preserve">Penjelasan konsep.</w:t>
+      </w:r>
+      <w:r>
+        <w:t xml:space="preserve"> </w:t>
+      </w:r>
+      <w:r>
+        <w:t xml:space="preserve">Tiga manfaat eksekusi: fokus strategis sehingga</w:t>
+      </w:r>
+      <w:r>
+        <w:t xml:space="preserve"> </w:t>
+      </w:r>
+      <w:r>
+        <w:rPr>
+          <w:iCs/>
+          <w:i/>
+        </w:rPr>
+        <w:t xml:space="preserve">competence</w:t>
+      </w:r>
+      <w:r>
+        <w:t xml:space="preserve"> </w:t>
+      </w:r>
+      <w:r>
+        <w:t xml:space="preserve">dapat naik menjadi</w:t>
+      </w:r>
+      <w:r>
+        <w:t xml:space="preserve"> </w:t>
+      </w:r>
+      <w:r>
+        <w:rPr>
+          <w:iCs/>
+          <w:i/>
+        </w:rPr>
+        <w:t xml:space="preserve">distinctive competence</w:t>
+      </w:r>
+      <w:r>
+        <w:t xml:space="preserve">; operasi lebih ramping, struktur lebih datar, respons lebih cepat; mitra kelas satu memperkuat arsenal capability (Boeing, Dell, Apple). Batas (Bab 6): jangan kehilangan</w:t>
+      </w:r>
+      <w:r>
+        <w:t xml:space="preserve"> </w:t>
+      </w:r>
+      <w:r>
+        <w:rPr>
+          <w:iCs/>
+          <w:i/>
+        </w:rPr>
+        <w:t xml:space="preserve">expertise</w:t>
+      </w:r>
+      <w:r>
+        <w:t xml:space="preserve"> </w:t>
+      </w:r>
+      <w:r>
+        <w:t xml:space="preserve">pada aktivitas yang menopang keunggulan jangka panjang; perusahaan harus tetap</w:t>
+      </w:r>
+      <w:r>
+        <w:t xml:space="preserve"> </w:t>
+      </w:r>
+      <w:r>
+        <w:rPr>
+          <w:iCs/>
+          <w:i/>
+        </w:rPr>
+        <w:t xml:space="preserve">master of its own destiny</w:t>
+      </w:r>
+      <w:r>
+        <w:t xml:space="preserve">. Apple memegang inovasi, desain, dan</w:t>
+      </w:r>
+      <w:r>
+        <w:t xml:space="preserve"> </w:t>
+      </w:r>
+      <w:r>
+        <w:rPr>
+          <w:iCs/>
+          <w:i/>
+        </w:rPr>
+        <w:t xml:space="preserve">new product development</w:t>
+      </w:r>
+      <w:r>
+        <w:t xml:space="preserve">, lalu meng-</w:t>
+      </w:r>
+      <w:r>
+        <w:rPr>
+          <w:iCs/>
+          <w:i/>
+        </w:rPr>
+        <w:t xml:space="preserve">outsource</w:t>
+      </w:r>
+      <w:r>
+        <w:t xml:space="preserve"> </w:t>
+      </w:r>
+      <w:r>
+        <w:t xml:space="preserve">manufaktur ke Foxconn (1,3 juta pekerja pada 2023, mampu merekrut 3.000 orang seketika); biayanya adalah berkurangnya kendali langsung atas kondisi kerja, sehingga standar pemasok diperketat dan produksi didiversifikasi ke luar Tiongkok. Pola serupa: 83% dari sepuluh perusahaan farmasi terbesar meng-</w:t>
+      </w:r>
+      <w:r>
+        <w:rPr>
+          <w:iCs/>
+          <w:i/>
+        </w:rPr>
+        <w:t xml:space="preserve">outsource</w:t>
+      </w:r>
+      <w:r>
+        <w:t xml:space="preserve"> </w:t>
+      </w:r>
+      <w:r>
+        <w:rPr>
+          <w:iCs/>
+          <w:i/>
+        </w:rPr>
+        <w:t xml:space="preserve">clinical data management</w:t>
+      </w:r>
+      <w:r>
+        <w:t xml:space="preserve">; Nike; Broadcom.</w:t>
+      </w:r>
+    </w:p>
+    <w:p>
+      <w:pPr>
+        <w:pStyle w:val="BodyText"/>
+      </w:pPr>
+      <w:r>
+        <w:rPr>
+          <w:bCs/>
+          <w:b/>
+        </w:rPr>
+        <w:t xml:space="preserve">Pertanyaan kunci.</w:t>
+      </w:r>
+      <w:r>
+        <w:t xml:space="preserve"> </w:t>
+      </w:r>
+      <w:r>
+        <w:t xml:space="preserve">Bukan</w:t>
       </w:r>
       <w:r>
         <w:t xml:space="preserve"> </w:t>
@@ -3015,16 +4016,63 @@
         <w:t xml:space="preserve">“</w:t>
       </w:r>
       <w:r>
-        <w:t xml:space="preserve">trade-off</w:t>
+        <w:t xml:space="preserve">bisakah di-</w:t>
+      </w:r>
+      <w:r>
+        <w:rPr>
+          <w:iCs/>
+          <w:i/>
+        </w:rPr>
+        <w:t xml:space="preserve">outsource</w:t>
+      </w:r>
+      <w:r>
+        <w:t xml:space="preserve">?</w:t>
       </w:r>
       <w:r>
         <w:t xml:space="preserve">”</w:t>
       </w:r>
       <w:r>
-        <w:t xml:space="preserve"> </w:t>
-      </w:r>
-      <w:r>
-        <w:t xml:space="preserve">(kecepatan, kendali, risiko) adalah sintesis penyaji dari uraian buku, bukan tabel buku; sampaikan sebagai cara membaca, bukan kutipan.</w:t>
+        <w:t xml:space="preserve">, melainkan</w:t>
+      </w:r>
+      <w:r>
+        <w:t xml:space="preserve"> </w:t>
+      </w:r>
+      <w:r>
+        <w:t xml:space="preserve">“</w:t>
+      </w:r>
+      <w:r>
+        <w:t xml:space="preserve">apakah aktivitas ini inti dari strategi kami?</w:t>
+      </w:r>
+      <w:r>
+        <w:t xml:space="preserve">”</w:t>
+      </w:r>
+    </w:p>
+    <w:bookmarkEnd w:id="36"/>
+    <w:bookmarkStart w:id="37" w:name="X07fe30141715afbfadbbe39112210104afe6fed"/>
+    <w:p>
+      <w:pPr>
+        <w:pStyle w:val="Heading2"/>
+      </w:pPr>
+      <w:r>
+        <w:t xml:space="preserve">Slide 15. Empat Tipe Struktur, Satu Prinsip</w:t>
+      </w:r>
+    </w:p>
+    <w:p>
+      <w:pPr>
+        <w:pStyle w:val="FirstParagraph"/>
+      </w:pPr>
+      <w:r>
+        <w:rPr>
+          <w:bCs/>
+          <w:b/>
+        </w:rPr>
+        <w:t xml:space="preserve">Inti pesan.</w:t>
+      </w:r>
+      <w:r>
+        <w:t xml:space="preserve"> </w:t>
+      </w:r>
+      <w:r>
+        <w:t xml:space="preserve">Tipe struktur ditentukan oleh ukuran dan susunan bisnis, dan berevolusi.</w:t>
       </w:r>
     </w:p>
     <w:p>
@@ -3036,55 +4084,328 @@
           <w:bCs/>
           <w:b/>
         </w:rPr>
-        <w:t xml:space="preserve">Why terus-menerus.</w:t>
-      </w:r>
-      <w:r>
-        <w:t xml:space="preserve"> </w:t>
-      </w:r>
-      <w:r>
-        <w:t xml:space="preserve">Strategi baru menuntut</w:t>
-      </w:r>
-      <w:r>
-        <w:t xml:space="preserve"> </w:t>
-      </w:r>
-      <w:r>
-        <w:rPr>
-          <w:iCs/>
-          <w:i/>
-        </w:rPr>
-        <w:t xml:space="preserve">competency</w:t>
-      </w:r>
-      <w:r>
-        <w:t xml:space="preserve"> </w:t>
-      </w:r>
-      <w:r>
-        <w:t xml:space="preserve">baru; strategi lama pun menuntut</w:t>
-      </w:r>
-      <w:r>
-        <w:t xml:space="preserve"> </w:t>
-      </w:r>
-      <w:r>
-        <w:rPr>
-          <w:iCs/>
-          <w:i/>
-        </w:rPr>
-        <w:t xml:space="preserve">upgrade</w:t>
-      </w:r>
-      <w:r>
-        <w:t xml:space="preserve"> </w:t>
-      </w:r>
-      <w:r>
-        <w:t xml:space="preserve">karena kondisi berubah.</w:t>
-      </w:r>
-    </w:p>
-    <w:bookmarkEnd w:id="31"/>
-    <w:bookmarkStart w:id="32" w:name="X1673e216a62ebde0467926d4b235048d580d19f"/>
+        <w:t xml:space="preserve">Penjelasan konsep.</w:t>
+      </w:r>
+      <w:r>
+        <w:t xml:space="preserve"> </w:t>
+      </w:r>
+      <w:r>
+        <w:t xml:space="preserve">Prinsip:</w:t>
+      </w:r>
+      <w:r>
+        <w:t xml:space="preserve"> </w:t>
+      </w:r>
+      <w:r>
+        <w:rPr>
+          <w:iCs/>
+          <w:i/>
+        </w:rPr>
+        <w:t xml:space="preserve">strategy-critical activities</w:t>
+      </w:r>
+      <w:r>
+        <w:t xml:space="preserve"> </w:t>
+      </w:r>
+      <w:r>
+        <w:t xml:space="preserve">menjadi</w:t>
+      </w:r>
+      <w:r>
+        <w:t xml:space="preserve"> </w:t>
+      </w:r>
+      <w:r>
+        <w:rPr>
+          <w:iCs/>
+          <w:i/>
+        </w:rPr>
+        <w:t xml:space="preserve">building blocks</w:t>
+      </w:r>
+      <w:r>
+        <w:t xml:space="preserve"> </w:t>
+      </w:r>
+      <w:r>
+        <w:t xml:space="preserve">utama.</w:t>
+      </w:r>
+      <w:r>
+        <w:t xml:space="preserve"> </w:t>
+      </w:r>
+      <w:r>
+        <w:rPr>
+          <w:bCs/>
+          <w:b/>
+        </w:rPr>
+        <w:t xml:space="preserve">Simple structure</w:t>
+      </w:r>
+      <w:r>
+        <w:t xml:space="preserve"> </w:t>
+      </w:r>
+      <w:r>
+        <w:t xml:space="preserve">(</w:t>
+      </w:r>
+      <w:r>
+        <w:rPr>
+          <w:iCs/>
+          <w:i/>
+        </w:rPr>
+        <w:t xml:space="preserve">line-and-staff</w:t>
+      </w:r>
+      <w:r>
+        <w:t xml:space="preserve">,</w:t>
+      </w:r>
+      <w:r>
+        <w:t xml:space="preserve"> </w:t>
+      </w:r>
+      <w:r>
+        <w:rPr>
+          <w:iCs/>
+          <w:i/>
+        </w:rPr>
+        <w:t xml:space="preserve">flat</w:t>
+      </w:r>
+      <w:r>
+        <w:t xml:space="preserve">): eksekutif pusat dan staf kecil; cocok untuk perusahaan kecil dan</w:t>
+      </w:r>
+      <w:r>
+        <w:t xml:space="preserve"> </w:t>
+      </w:r>
+      <w:r>
+        <w:rPr>
+          <w:iCs/>
+          <w:i/>
+        </w:rPr>
+        <w:t xml:space="preserve">startup</w:t>
+      </w:r>
+      <w:r>
+        <w:t xml:space="preserve">; murah dan lentur; tidak memadai saat tumbuh.</w:t>
+      </w:r>
+      <w:r>
+        <w:t xml:space="preserve"> </w:t>
+      </w:r>
+      <w:r>
+        <w:rPr>
+          <w:bCs/>
+          <w:b/>
+        </w:rPr>
+        <w:t xml:space="preserve">Functional structure</w:t>
+      </w:r>
+      <w:r>
+        <w:t xml:space="preserve"> </w:t>
+      </w:r>
+      <w:r>
+        <w:t xml:space="preserve">(</w:t>
+      </w:r>
+      <w:r>
+        <w:rPr>
+          <w:iCs/>
+          <w:i/>
+        </w:rPr>
+        <w:t xml:space="preserve">U-form</w:t>
+      </w:r>
+      <w:r>
+        <w:t xml:space="preserve">): departemen per fungsi; cocok untuk perusahaan satu bisnis apa pun</w:t>
+      </w:r>
+      <w:r>
+        <w:t xml:space="preserve"> </w:t>
+      </w:r>
+      <w:r>
+        <w:rPr>
+          <w:iCs/>
+          <w:i/>
+        </w:rPr>
+        <w:t xml:space="preserve">generic strategy</w:t>
+      </w:r>
+      <w:r>
+        <w:t xml:space="preserve">-nya (GM kini mengelola semua merek dalam satu struktur fungsional); spesialisasi dan</w:t>
+      </w:r>
+      <w:r>
+        <w:t xml:space="preserve"> </w:t>
+      </w:r>
+      <w:r>
+        <w:rPr>
+          <w:iCs/>
+          <w:i/>
+        </w:rPr>
+        <w:t xml:space="preserve">scale economies</w:t>
+      </w:r>
+      <w:r>
+        <w:t xml:space="preserve">; kelemahannya sekat antardepartemen.</w:t>
+      </w:r>
+      <w:r>
+        <w:t xml:space="preserve"> </w:t>
+      </w:r>
+      <w:r>
+        <w:rPr>
+          <w:bCs/>
+          <w:b/>
+        </w:rPr>
+        <w:t xml:space="preserve">Multidivisional structure</w:t>
+      </w:r>
+      <w:r>
+        <w:t xml:space="preserve"> </w:t>
+      </w:r>
+      <w:r>
+        <w:t xml:space="preserve">(</w:t>
+      </w:r>
+      <w:r>
+        <w:rPr>
+          <w:iCs/>
+          <w:i/>
+        </w:rPr>
+        <w:t xml:space="preserve">M-form</w:t>
+      </w:r>
+      <w:r>
+        <w:t xml:space="preserve">): divisi sebagai</w:t>
+      </w:r>
+      <w:r>
+        <w:t xml:space="preserve"> </w:t>
+      </w:r>
+      <w:r>
+        <w:rPr>
+          <w:iCs/>
+          <w:i/>
+        </w:rPr>
+        <w:t xml:space="preserve">profit center</w:t>
+      </w:r>
+      <w:r>
+        <w:t xml:space="preserve"> </w:t>
+      </w:r>
+      <w:r>
+        <w:t xml:space="preserve">(SBU) dengan kantor pusat; cocok untuk diversifikasi, strategi internasional, integrasi vertikal; mengurangi</w:t>
+      </w:r>
+      <w:r>
+        <w:t xml:space="preserve"> </w:t>
+      </w:r>
+      <w:r>
+        <w:rPr>
+          <w:iCs/>
+          <w:i/>
+        </w:rPr>
+        <w:t xml:space="preserve">information overload</w:t>
+      </w:r>
+      <w:r>
+        <w:t xml:space="preserve"> </w:t>
+      </w:r>
+      <w:r>
+        <w:t xml:space="preserve">dan menyelaraskan insentif; menghambat sinergi lintas bisnis pada</w:t>
+      </w:r>
+      <w:r>
+        <w:t xml:space="preserve"> </w:t>
+      </w:r>
+      <w:r>
+        <w:rPr>
+          <w:iCs/>
+          <w:i/>
+        </w:rPr>
+        <w:t xml:space="preserve">related diversification</w:t>
+      </w:r>
+      <w:r>
+        <w:t xml:space="preserve">.</w:t>
+      </w:r>
+      <w:r>
+        <w:t xml:space="preserve"> </w:t>
+      </w:r>
+      <w:r>
+        <w:rPr>
+          <w:bCs/>
+          <w:b/>
+        </w:rPr>
+        <w:t xml:space="preserve">Matrix structure</w:t>
+      </w:r>
+      <w:r>
+        <w:t xml:space="preserve"> </w:t>
+      </w:r>
+      <w:r>
+        <w:t xml:space="preserve">(</w:t>
+      </w:r>
+      <w:r>
+        <w:rPr>
+          <w:iCs/>
+          <w:i/>
+        </w:rPr>
+        <w:t xml:space="preserve">composite</w:t>
+      </w:r>
+      <w:r>
+        <w:t xml:space="preserve">): dua dimensi atau lebih dengan</w:t>
+      </w:r>
+      <w:r>
+        <w:t xml:space="preserve"> </w:t>
+      </w:r>
+      <w:r>
+        <w:rPr>
+          <w:iCs/>
+          <w:i/>
+        </w:rPr>
+        <w:t xml:space="preserve">multiple reporting</w:t>
+      </w:r>
+      <w:r>
+        <w:t xml:space="preserve">; cocok untuk manajemen berbasis proyek dan capability lintas unit (Texas Instruments, Caterpillar, Philips);</w:t>
+      </w:r>
+      <w:r>
+        <w:t xml:space="preserve"> </w:t>
+      </w:r>
+      <w:r>
+        <w:rPr>
+          <w:iCs/>
+          <w:i/>
+        </w:rPr>
+        <w:t xml:space="preserve">economies of scope</w:t>
+      </w:r>
+      <w:r>
+        <w:t xml:space="preserve">; lapisan tambahan dan</w:t>
+      </w:r>
+      <w:r>
+        <w:t xml:space="preserve"> </w:t>
+      </w:r>
+      <w:r>
+        <w:rPr>
+          <w:iCs/>
+          <w:i/>
+        </w:rPr>
+        <w:t xml:space="preserve">divided loyalties</w:t>
+      </w:r>
+      <w:r>
+        <w:t xml:space="preserve">.</w:t>
+      </w:r>
+    </w:p>
+    <w:p>
+      <w:pPr>
+        <w:pStyle w:val="BodyText"/>
+      </w:pPr>
+      <w:r>
+        <w:rPr>
+          <w:bCs/>
+          <w:b/>
+        </w:rPr>
+        <w:t xml:space="preserve">Catatan penting dari buku.</w:t>
+      </w:r>
+      <w:r>
+        <w:t xml:space="preserve"> </w:t>
+      </w:r>
+      <w:r>
+        <w:t xml:space="preserve">Tipe struktur bergantung pada ukuran dan kompleksitas,</w:t>
+      </w:r>
+      <w:r>
+        <w:t xml:space="preserve"> </w:t>
+      </w:r>
+      <w:r>
+        <w:t xml:space="preserve">“</w:t>
+      </w:r>
+      <w:r>
+        <w:t xml:space="preserve">but not so much on the specifics of its strategy</w:t>
+      </w:r>
+      <w:r>
+        <w:t xml:space="preserve">”</w:t>
+      </w:r>
+      <w:r>
+        <w:t xml:space="preserve">. Jadi kecocokan struktur dengan strategi terwujud melalui penempatan aktivitas kritis sebagai pusat, bukan semata pemilihan tipe.</w:t>
+      </w:r>
+    </w:p>
+    <w:bookmarkEnd w:id="37"/>
+    <w:bookmarkStart w:id="38" w:name="X499e938d3c5905c94810937a5bd6889ebd17a6e"/>
     <w:p>
       <w:pPr>
         <w:pStyle w:val="Heading2"/>
       </w:pPr>
       <w:r>
-        <w:t xml:space="preserve">Slide 10 — Jalur Evolusioner Pengembangan Capability Internal</w:t>
+        <w:t xml:space="preserve">Slide 16. Memusatkan atau Mendelegasikan Keputusan? (Table 10.1, digambar ulang)</w:t>
       </w:r>
     </w:p>
     <w:p>
@@ -3102,17 +4423,510 @@
         <w:t xml:space="preserve"> </w:t>
       </w:r>
       <w:r>
-        <w:t xml:space="preserve">Capability tumbuh bertahap:</w:t>
-      </w:r>
-      <w:r>
-        <w:t xml:space="preserve"> </w:t>
-      </w:r>
-      <w:r>
-        <w:rPr>
-          <w:iCs/>
-          <w:i/>
-        </w:rPr>
-        <w:t xml:space="preserve">ability</w:t>
+        <w:t xml:space="preserve">Keduanya memiliki logika; pilihan bergantung pada letak pengetahuan dan kebutuhan kecepatan.</w:t>
+      </w:r>
+    </w:p>
+    <w:p>
+      <w:pPr>
+        <w:pStyle w:val="BodyText"/>
+      </w:pPr>
+      <w:r>
+        <w:rPr>
+          <w:bCs/>
+          <w:b/>
+        </w:rPr>
+        <w:t xml:space="preserve">Penjelasan konsep.</w:t>
+      </w:r>
+      <w:r>
+        <w:t xml:space="preserve"> </w:t>
+      </w:r>
+      <w:r>
+        <w:t xml:space="preserve">Tabel mengikuti struktur asli buku, dipadatkan menjadi dua sampai tiga butir per sel:</w:t>
+      </w:r>
+      <w:r>
+        <w:t xml:space="preserve"> </w:t>
+      </w:r>
+      <w:r>
+        <w:rPr>
+          <w:iCs/>
+          <w:i/>
+        </w:rPr>
+        <w:t xml:space="preserve">basic tenets</w:t>
+      </w:r>
+      <w:r>
+        <w:t xml:space="preserve">,</w:t>
+      </w:r>
+      <w:r>
+        <w:t xml:space="preserve"> </w:t>
+      </w:r>
+      <w:r>
+        <w:rPr>
+          <w:iCs/>
+          <w:i/>
+        </w:rPr>
+        <w:t xml:space="preserve">chief advantages</w:t>
+      </w:r>
+      <w:r>
+        <w:t xml:space="preserve">,</w:t>
+      </w:r>
+      <w:r>
+        <w:t xml:space="preserve"> </w:t>
+      </w:r>
+      <w:r>
+        <w:rPr>
+          <w:iCs/>
+          <w:i/>
+        </w:rPr>
+        <w:t xml:space="preserve">primary disadvantages</w:t>
+      </w:r>
+      <w:r>
+        <w:t xml:space="preserve"> </w:t>
+      </w:r>
+      <w:r>
+        <w:t xml:space="preserve">untuk masing-masing. Sentralisasi unggul dalam akuntabilitas, konsistensi, dan kepemimpinan saat krisis; lemah dalam kecepatan respons dan inisiatif. Desentralisasi unggul dalam inisiatif, motivasi, ide baru, respons pasar, dan lapisan yang lebih sedikit; lemah dalam konsistensi dan koordinasi lintas unit. Kendali dalam desentralisasi dijaga melalui batas wewenang,</w:t>
+      </w:r>
+      <w:r>
+        <w:t xml:space="preserve"> </w:t>
+      </w:r>
+      <w:r>
+        <w:rPr>
+          <w:iCs/>
+          <w:i/>
+        </w:rPr>
+        <w:t xml:space="preserve">strategic control systems</w:t>
+      </w:r>
+      <w:r>
+        <w:t xml:space="preserve">, akuntabilitas, insentif, dan budaya dengan</w:t>
+      </w:r>
+      <w:r>
+        <w:t xml:space="preserve"> </w:t>
+      </w:r>
+      <w:r>
+        <w:rPr>
+          <w:iCs/>
+          <w:i/>
+        </w:rPr>
+        <w:t xml:space="preserve">peer pressure</w:t>
+      </w:r>
+      <w:r>
+        <w:t xml:space="preserve"> </w:t>
+      </w:r>
+      <w:r>
+        <w:t xml:space="preserve">(buku mengutip Simons, 1995). Contoh: karyawan Starbucks membagikan kopi gratis saat kasir</w:t>
+      </w:r>
+      <w:r>
+        <w:t xml:space="preserve"> </w:t>
+      </w:r>
+      <w:r>
+        <w:rPr>
+          <w:iCs/>
+          <w:i/>
+        </w:rPr>
+        <w:t xml:space="preserve">offline</w:t>
+      </w:r>
+      <w:r>
+        <w:t xml:space="preserve">;</w:t>
+      </w:r>
+      <w:r>
+        <w:t xml:space="preserve"> </w:t>
+      </w:r>
+      <w:r>
+        <w:rPr>
+          <w:iCs/>
+          <w:i/>
+        </w:rPr>
+        <w:t xml:space="preserve">buyer</w:t>
+      </w:r>
+      <w:r>
+        <w:t xml:space="preserve"> </w:t>
+      </w:r>
+      <w:r>
+        <w:t xml:space="preserve">TJX memangkas anggarannya sendiri. Untuk</w:t>
+      </w:r>
+      <w:r>
+        <w:t xml:space="preserve"> </w:t>
+      </w:r>
+      <w:r>
+        <w:rPr>
+          <w:iCs/>
+          <w:i/>
+        </w:rPr>
+        <w:t xml:space="preserve">cross-business strategic fit</w:t>
+      </w:r>
+      <w:r>
+        <w:t xml:space="preserve">, fungsi yang menuntut koordinasi erat (R&amp;D,</w:t>
+      </w:r>
+      <w:r>
+        <w:t xml:space="preserve"> </w:t>
+      </w:r>
+      <w:r>
+        <w:rPr>
+          <w:iCs/>
+          <w:i/>
+        </w:rPr>
+        <w:t xml:space="preserve">sales force</w:t>
+      </w:r>
+      <w:r>
+        <w:t xml:space="preserve"> </w:t>
+      </w:r>
+      <w:r>
+        <w:t xml:space="preserve">bersama) disentralisasi atau dibentuk</w:t>
+      </w:r>
+      <w:r>
+        <w:t xml:space="preserve"> </w:t>
+      </w:r>
+      <w:r>
+        <w:rPr>
+          <w:iCs/>
+          <w:i/>
+        </w:rPr>
+        <w:t xml:space="preserve">business groups</w:t>
+      </w:r>
+      <w:r>
+        <w:t xml:space="preserve">. Tren: pergeseran ke struktur lebih datar karena aset paling bernilai adalah</w:t>
+      </w:r>
+      <w:r>
+        <w:t xml:space="preserve"> </w:t>
+      </w:r>
+      <w:r>
+        <w:rPr>
+          <w:iCs/>
+          <w:i/>
+        </w:rPr>
+        <w:t xml:space="preserve">intellectual capital</w:t>
+      </w:r>
+      <w:r>
+        <w:t xml:space="preserve"> </w:t>
+      </w:r>
+      <w:r>
+        <w:t xml:space="preserve">karyawan.</w:t>
+      </w:r>
+    </w:p>
+    <w:p>
+      <w:pPr>
+        <w:pStyle w:val="BodyText"/>
+      </w:pPr>
+      <w:r>
+        <w:rPr>
+          <w:bCs/>
+          <w:b/>
+        </w:rPr>
+        <w:t xml:space="preserve">Antisipasi pertanyaan.</w:t>
+      </w:r>
+      <w:r>
+        <w:t xml:space="preserve"> </w:t>
+      </w:r>
+      <w:r>
+        <w:t xml:space="preserve">“</w:t>
+      </w:r>
+      <w:r>
+        <w:t xml:space="preserve">Bukankah desentralisasi berarti kehilangan kendali?</w:t>
+      </w:r>
+      <w:r>
+        <w:t xml:space="preserve">”</w:t>
+      </w:r>
+      <w:r>
+        <w:t xml:space="preserve"> </w:t>
+      </w:r>
+      <w:r>
+        <w:t xml:space="preserve">Jawab dengan lima mekanisme kendali di atas; desentralisasi memindahkan keputusan, bukan menghapus akuntabilitas.</w:t>
+      </w:r>
+    </w:p>
+    <w:bookmarkEnd w:id="38"/>
+    <w:bookmarkStart w:id="39" w:name="X9c11913838fccea64177d929aa0f5580d95170f"/>
+    <w:p>
+      <w:pPr>
+        <w:pStyle w:val="Heading2"/>
+      </w:pPr>
+      <w:r>
+        <w:t xml:space="preserve">Slide 17. Koordinasi ke Dalam dan ke Luar</w:t>
+      </w:r>
+    </w:p>
+    <w:p>
+      <w:pPr>
+        <w:pStyle w:val="FirstParagraph"/>
+      </w:pPr>
+      <w:r>
+        <w:rPr>
+          <w:bCs/>
+          <w:b/>
+        </w:rPr>
+        <w:t xml:space="preserve">Inti pesan.</w:t>
+      </w:r>
+      <w:r>
+        <w:t xml:space="preserve"> </w:t>
+      </w:r>
+      <w:r>
+        <w:t xml:space="preserve">Struktur formal tidak cukup; koordinasi harus dirancang ke dalam dan ke luar.</w:t>
+      </w:r>
+    </w:p>
+    <w:p>
+      <w:pPr>
+        <w:pStyle w:val="BodyText"/>
+      </w:pPr>
+      <w:r>
+        <w:rPr>
+          <w:bCs/>
+          <w:b/>
+        </w:rPr>
+        <w:t xml:space="preserve">Penjelasan konsep.</w:t>
+      </w:r>
+      <w:r>
+        <w:t xml:space="preserve"> </w:t>
+      </w:r>
+      <w:r>
+        <w:t xml:space="preserve">Ke dalam: capability seperti</w:t>
+      </w:r>
+      <w:r>
+        <w:t xml:space="preserve"> </w:t>
+      </w:r>
+      <w:r>
+        <w:rPr>
+          <w:iCs/>
+          <w:i/>
+        </w:rPr>
+        <w:t xml:space="preserve">speed-to-market</w:t>
+      </w:r>
+      <w:r>
+        <w:t xml:space="preserve"> </w:t>
+      </w:r>
+      <w:r>
+        <w:t xml:space="preserve">dan layanan pelanggan unggul melintasi banyak unit; eksekutif menegakkan komitmen bersama,</w:t>
+      </w:r>
+      <w:r>
+        <w:t xml:space="preserve"> </w:t>
+      </w:r>
+      <w:r>
+        <w:rPr>
+          <w:iCs/>
+          <w:i/>
+        </w:rPr>
+        <w:t xml:space="preserve">follow-up</w:t>
+      </w:r>
+      <w:r>
+        <w:t xml:space="preserve">, dan intervensi; mekanisme formal berupa</w:t>
+      </w:r>
+      <w:r>
+        <w:t xml:space="preserve"> </w:t>
+      </w:r>
+      <w:r>
+        <w:rPr>
+          <w:iCs/>
+          <w:i/>
+        </w:rPr>
+        <w:t xml:space="preserve">cross-functional committees</w:t>
+      </w:r>
+      <w:r>
+        <w:t xml:space="preserve">,</w:t>
+      </w:r>
+      <w:r>
+        <w:t xml:space="preserve"> </w:t>
+      </w:r>
+      <w:r>
+        <w:rPr>
+          <w:iCs/>
+          <w:i/>
+        </w:rPr>
+        <w:t xml:space="preserve">project teams</w:t>
+      </w:r>
+      <w:r>
+        <w:t xml:space="preserve">,</w:t>
+      </w:r>
+      <w:r>
+        <w:t xml:space="preserve"> </w:t>
+      </w:r>
+      <w:r>
+        <w:rPr>
+          <w:iCs/>
+          <w:i/>
+        </w:rPr>
+        <w:t xml:space="preserve">project management office</w:t>
+      </w:r>
+      <w:r>
+        <w:t xml:space="preserve">; yang paling efektif adalah</w:t>
+      </w:r>
+      <w:r>
+        <w:t xml:space="preserve"> </w:t>
+      </w:r>
+      <w:r>
+        <w:rPr>
+          <w:iCs/>
+          <w:i/>
+        </w:rPr>
+        <w:t xml:space="preserve">incentive compensation</w:t>
+      </w:r>
+      <w:r>
+        <w:t xml:space="preserve"> </w:t>
+      </w:r>
+      <w:r>
+        <w:t xml:space="preserve">yang terikat pada kinerja kelompok lintas unit. Hambatan: dalam struktur terdesentralisasi, kepala departemen cenderung memprioritaskan unitnya. Ke luar:</w:t>
+      </w:r>
+      <w:r>
+        <w:t xml:space="preserve"> </w:t>
+      </w:r>
+      <w:r>
+        <w:rPr>
+          <w:iCs/>
+          <w:i/>
+        </w:rPr>
+        <w:t xml:space="preserve">relationship managers</w:t>
+      </w:r>
+      <w:r>
+        <w:t xml:space="preserve">; dua konfigurasi,</w:t>
+      </w:r>
+      <w:r>
+        <w:t xml:space="preserve"> </w:t>
+      </w:r>
+      <w:r>
+        <w:rPr>
+          <w:bCs/>
+          <w:b/>
+        </w:rPr>
+        <w:t xml:space="preserve">network</w:t>
+      </w:r>
+      <w:r>
+        <w:t xml:space="preserve"> </w:t>
+      </w:r>
+      <w:r>
+        <w:t xml:space="preserve">(kontraktual, diorganisasi</w:t>
+      </w:r>
+      <w:r>
+        <w:t xml:space="preserve"> </w:t>
+      </w:r>
+      <w:r>
+        <w:rPr>
+          <w:iCs/>
+          <w:i/>
+        </w:rPr>
+        <w:t xml:space="preserve">central firm</w:t>
+      </w:r>
+      <w:r>
+        <w:t xml:space="preserve">, contoh Ducati) dan</w:t>
+      </w:r>
+      <w:r>
+        <w:t xml:space="preserve"> </w:t>
+      </w:r>
+      <w:r>
+        <w:rPr>
+          <w:bCs/>
+          <w:b/>
+        </w:rPr>
+        <w:t xml:space="preserve">ecosystem</w:t>
+      </w:r>
+      <w:r>
+        <w:t xml:space="preserve"> </w:t>
+      </w:r>
+      <w:r>
+        <w:t xml:space="preserve">(non-kontraktual, beragam aktor, contoh Silicon Valley).</w:t>
+      </w:r>
+      <w:r>
+        <w:t xml:space="preserve"> </w:t>
+      </w:r>
+      <w:r>
+        <w:rPr>
+          <w:iCs/>
+          <w:i/>
+        </w:rPr>
+        <w:t xml:space="preserve">Further perspective</w:t>
+      </w:r>
+      <w:r>
+        <w:t xml:space="preserve">: pilih desain dasar, lengkapi dengan</w:t>
+      </w:r>
+      <w:r>
+        <w:t xml:space="preserve"> </w:t>
+      </w:r>
+      <w:r>
+        <w:rPr>
+          <w:iCs/>
+          <w:i/>
+        </w:rPr>
+        <w:t xml:space="preserve">coordinating mechanisms</w:t>
+      </w:r>
+      <w:r>
+        <w:t xml:space="preserve">, bangun</w:t>
+      </w:r>
+      <w:r>
+        <w:t xml:space="preserve"> </w:t>
+      </w:r>
+      <w:r>
+        <w:rPr>
+          <w:iCs/>
+          <w:i/>
+        </w:rPr>
+        <w:t xml:space="preserve">networking and communications arrangements</w:t>
+      </w:r>
+      <w:r>
+        <w:t xml:space="preserve">;</w:t>
+      </w:r>
+      <w:r>
+        <w:t xml:space="preserve"> </w:t>
+      </w:r>
+      <w:r>
+        <w:rPr>
+          <w:iCs/>
+          <w:i/>
+        </w:rPr>
+        <w:t xml:space="preserve">organization building</w:t>
+      </w:r>
+      <w:r>
+        <w:t xml:space="preserve"> </w:t>
+      </w:r>
+      <w:r>
+        <w:t xml:space="preserve">adalah</w:t>
+      </w:r>
+      <w:r>
+        <w:t xml:space="preserve"> </w:t>
+      </w:r>
+      <w:r>
+        <w:rPr>
+          <w:iCs/>
+          <w:i/>
+        </w:rPr>
+        <w:t xml:space="preserve">consciously knitting together</w:t>
+      </w:r>
+      <w:r>
+        <w:t xml:space="preserve"> </w:t>
+      </w:r>
+      <w:r>
+        <w:t xml:space="preserve">upaya individu dan kelompok, dan manajemen senior harus terlibat mendalam.</w:t>
+      </w:r>
+    </w:p>
+    <w:bookmarkEnd w:id="39"/>
+    <w:bookmarkStart w:id="40" w:name="Xf0df7708b1f2590a8efcd3636918beccbd8673d"/>
+    <w:p>
+      <w:pPr>
+        <w:pStyle w:val="Heading2"/>
+      </w:pPr>
+      <w:r>
+        <w:t xml:space="preserve">Slide 18. Sintesis: Organisasi yang Mampu Mengeksekusi</w:t>
+      </w:r>
+    </w:p>
+    <w:p>
+      <w:pPr>
+        <w:pStyle w:val="FirstParagraph"/>
+      </w:pPr>
+      <w:r>
+        <w:rPr>
+          <w:bCs/>
+          <w:b/>
+        </w:rPr>
+        <w:t xml:space="preserve">Inti pesan.</w:t>
+      </w:r>
+      <w:r>
+        <w:t xml:space="preserve"> </w:t>
+      </w:r>
+      <w:r>
+        <w:t xml:space="preserve">Rangkaian logika: staffing → capabilities → structure →</w:t>
+      </w:r>
+      <w:r>
+        <w:t xml:space="preserve"> </w:t>
+      </w:r>
+      <w:r>
+        <w:rPr>
+          <w:iCs/>
+          <w:i/>
+        </w:rPr>
+        <w:t xml:space="preserve">proficient strategy execution</w:t>
       </w:r>
       <w:r>
         <w:t xml:space="preserve"> </w:t>
@@ -3128,13 +4942,10 @@
           <w:iCs/>
           <w:i/>
         </w:rPr>
-        <w:t xml:space="preserve">tried-and-true competence</w:t>
-      </w:r>
-      <w:r>
-        <w:t xml:space="preserve"> </w:t>
-      </w:r>
-      <w:r>
-        <w:t xml:space="preserve">→ capability yang terus disegarkan.</w:t>
+        <w:t xml:space="preserve">sustainable competitive advantage</w:t>
+      </w:r>
+      <w:r>
+        <w:t xml:space="preserve">.</w:t>
       </w:r>
     </w:p>
     <w:p>
@@ -3146,97 +4957,19 @@
           <w:bCs/>
           <w:b/>
         </w:rPr>
-        <w:t xml:space="preserve">Penjelasan konsep.</w:t>
-      </w:r>
-      <w:r>
-        <w:t xml:space="preserve"> </w:t>
-      </w:r>
-      <w:r>
-        <w:t xml:space="preserve">Tahap pertama adalah kemampuan melakukan sesuatu meski belum sempurna: memilih orang dengan skill relevan, bereksperimen,</w:t>
-      </w:r>
-      <w:r>
-        <w:t xml:space="preserve"> </w:t>
-      </w:r>
-      <w:r>
-        <w:rPr>
-          <w:iCs/>
-          <w:i/>
-        </w:rPr>
-        <w:t xml:space="preserve">trial and error</w:t>
-      </w:r>
-      <w:r>
-        <w:t xml:space="preserve">. Dengan</w:t>
-      </w:r>
-      <w:r>
-        <w:t xml:space="preserve"> </w:t>
-      </w:r>
-      <w:r>
-        <w:rPr>
-          <w:iCs/>
-          <w:i/>
-        </w:rPr>
-        <w:t xml:space="preserve">task repetition</w:t>
-      </w:r>
-      <w:r>
-        <w:t xml:space="preserve"> </w:t>
-      </w:r>
-      <w:r>
-        <w:t xml:space="preserve">dan</w:t>
-      </w:r>
-      <w:r>
-        <w:t xml:space="preserve"> </w:t>
-      </w:r>
-      <w:r>
-        <w:rPr>
-          <w:iCs/>
-          <w:i/>
-        </w:rPr>
-        <w:t xml:space="preserve">learning by doing</w:t>
-      </w:r>
-      <w:r>
-        <w:t xml:space="preserve">, kemampuan berkembang menjadi</w:t>
-      </w:r>
-      <w:r>
-        <w:t xml:space="preserve"> </w:t>
-      </w:r>
-      <w:r>
-        <w:rPr>
-          <w:iCs/>
-          <w:i/>
-        </w:rPr>
-        <w:t xml:space="preserve">competence</w:t>
-      </w:r>
-      <w:r>
-        <w:t xml:space="preserve"> </w:t>
-      </w:r>
-      <w:r>
-        <w:t xml:space="preserve">yang konsisten pada biaya yang dapat diterima; ini menuntut investasi berkelanjutan. Capability harus terus disegarkan agar selaras dengan ekspektasi pelanggan, kondisi persaingan, dan inisiatif baru (</w:t>
-      </w:r>
-      <w:r>
-        <w:rPr>
-          <w:iCs/>
-          <w:i/>
-        </w:rPr>
-        <w:t xml:space="preserve">dynamic capability</w:t>
-      </w:r>
-      <w:r>
-        <w:t xml:space="preserve">, Bab 4). Memperbarui dan merekombinasi capability yang ada jauh lebih mudah daripada membangun dari nol. Akselerator: menjadikan</w:t>
-      </w:r>
-      <w:r>
-        <w:t xml:space="preserve"> </w:t>
-      </w:r>
-      <w:r>
-        <w:rPr>
-          <w:iCs/>
-          <w:i/>
-        </w:rPr>
-        <w:t xml:space="preserve">learning</w:t>
-      </w:r>
-      <w:r>
-        <w:t xml:space="preserve"> </w:t>
-      </w:r>
-      <w:r>
-        <w:t xml:space="preserve">upaya yang disengaja dan memberi insentif.</w:t>
+        <w:t xml:space="preserve">Naskah bicara.</w:t>
+      </w:r>
+      <w:r>
+        <w:t xml:space="preserve"> </w:t>
+      </w:r>
+      <w:r>
+        <w:t xml:space="preserve">“</w:t>
+      </w:r>
+      <w:r>
+        <w:t xml:space="preserve">Strategi sebaik apa pun hanya setengah pekerjaan. Keunggulan yang bertahan lahir ketika orang, capability, dan struktur dibangun untuk menjalankan strategi lebih baik daripada pesaing. Ketiganya saling bergantung: orang membangun capability, capability menuntut struktur yang tepat, struktur menentukan bagaimana orang bekerja.</w:t>
+      </w:r>
+      <w:r>
+        <w:t xml:space="preserve">”</w:t>
       </w:r>
     </w:p>
     <w:p>
@@ -3248,1827 +4981,88 @@
           <w:bCs/>
           <w:b/>
         </w:rPr>
-        <w:t xml:space="preserve">Dua bentuk tindakan manajerial.</w:t>
-      </w:r>
-      <w:r>
-        <w:t xml:space="preserve"> </w:t>
-      </w:r>
-      <w:r>
-        <w:t xml:space="preserve">Memperkuat basis skill, knowledge, experience (dapat di semua level) dan mengoordinasikan serta mengintegrasikan work groups (paling baik oleh eksekutif senior yang punya</w:t>
-      </w:r>
-      <w:r>
-        <w:t xml:space="preserve"> </w:t>
-      </w:r>
-      <w:r>
-        <w:rPr>
-          <w:iCs/>
-          <w:i/>
-        </w:rPr>
-        <w:t xml:space="preserve">clout</w:t>
-      </w:r>
-      <w:r>
-        <w:t xml:space="preserve">).</w:t>
-      </w:r>
-    </w:p>
-    <w:p>
-      <w:pPr>
-        <w:pStyle w:val="BodyText"/>
-      </w:pPr>
-      <w:r>
-        <w:rPr>
-          <w:bCs/>
-          <w:b/>
-        </w:rPr>
-        <w:t xml:space="preserve">Contoh buku.</w:t>
-      </w:r>
-      <w:r>
-        <w:t xml:space="preserve"> </w:t>
-      </w:r>
-      <w:r>
-        <w:t xml:space="preserve">Williams-Sonoma: katalog (1970), akuisisi Pottery Barn, e-commerce (2000), masuk Fortune 500 (2019), pendapatan US$8,7 miliar (2022). Toyota:</w:t>
-      </w:r>
-      <w:r>
-        <w:t xml:space="preserve"> </w:t>
-      </w:r>
-      <w:r>
-        <w:rPr>
-          <w:iCs/>
-          <w:i/>
-        </w:rPr>
-        <w:t xml:space="preserve">upgrade</w:t>
-      </w:r>
-      <w:r>
-        <w:t xml:space="preserve"> </w:t>
-      </w:r>
-      <w:r>
-        <w:t xml:space="preserve">teknologi hybrid dan penyempurnaan</w:t>
-      </w:r>
-      <w:r>
-        <w:t xml:space="preserve"> </w:t>
-      </w:r>
-      <w:r>
-        <w:rPr>
-          <w:iCs/>
-          <w:i/>
-        </w:rPr>
-        <w:t xml:space="preserve">Toyota Production System</w:t>
-      </w:r>
-      <w:r>
-        <w:t xml:space="preserve"> </w:t>
-      </w:r>
-      <w:r>
-        <w:t xml:space="preserve">hingga melampaui General Motors.</w:t>
-      </w:r>
-    </w:p>
-    <w:bookmarkEnd w:id="32"/>
-    <w:bookmarkStart w:id="33" w:name="slide-11-akuisisi-dan-kemitraan"/>
+        <w:t xml:space="preserve">Jembatan.</w:t>
+      </w:r>
+      <w:r>
+        <w:t xml:space="preserve"> </w:t>
+      </w:r>
+      <w:r>
+        <w:t xml:space="preserve">Bab 11 menggerakkan organisasi (tugas 4 sampai 8); Bab 12 menopangnya (tugas 9 sampai 10); kerangka 4DX (McChesney, Covey &amp; Huling) memberi disiplin eksekusi di tingkat tim:</w:t>
+      </w:r>
+      <w:r>
+        <w:t xml:space="preserve"> </w:t>
+      </w:r>
+      <w:r>
+        <w:rPr>
+          <w:iCs/>
+          <w:i/>
+        </w:rPr>
+        <w:t xml:space="preserve">focus on the wildly important</w:t>
+      </w:r>
+      <w:r>
+        <w:t xml:space="preserve">,</w:t>
+      </w:r>
+      <w:r>
+        <w:t xml:space="preserve"> </w:t>
+      </w:r>
+      <w:r>
+        <w:rPr>
+          <w:iCs/>
+          <w:i/>
+        </w:rPr>
+        <w:t xml:space="preserve">act on lead measures</w:t>
+      </w:r>
+      <w:r>
+        <w:t xml:space="preserve">,</w:t>
+      </w:r>
+      <w:r>
+        <w:t xml:space="preserve"> </w:t>
+      </w:r>
+      <w:r>
+        <w:rPr>
+          <w:iCs/>
+          <w:i/>
+        </w:rPr>
+        <w:t xml:space="preserve">keep a compelling scoreboard</w:t>
+      </w:r>
+      <w:r>
+        <w:t xml:space="preserve">,</w:t>
+      </w:r>
+      <w:r>
+        <w:t xml:space="preserve"> </w:t>
+      </w:r>
+      <w:r>
+        <w:rPr>
+          <w:iCs/>
+          <w:i/>
+        </w:rPr>
+        <w:t xml:space="preserve">create a cadence of accountability</w:t>
+      </w:r>
+      <w:r>
+        <w:t xml:space="preserve">. Katakan bahwa 4DX akan dibahas Kelompok 3 pada presentasi</w:t>
+      </w:r>
+      <w:r>
+        <w:t xml:space="preserve"> </w:t>
+      </w:r>
+      <w:r>
+        <w:rPr>
+          <w:iCs/>
+          <w:i/>
+        </w:rPr>
+        <w:t xml:space="preserve">framework</w:t>
+      </w:r>
+      <w:r>
+        <w:t xml:space="preserve">.</w:t>
+      </w:r>
+    </w:p>
+    <w:bookmarkEnd w:id="40"/>
+    <w:bookmarkStart w:id="41" w:name="slide-19.-bahan-renungan-untuk-diskusi"/>
     <w:p>
       <w:pPr>
         <w:pStyle w:val="Heading2"/>
       </w:pPr>
       <w:r>
-        <w:t xml:space="preserve">Slide 11 — Akuisisi dan Kemitraan</w:t>
-      </w:r>
-    </w:p>
-    <w:p>
-      <w:pPr>
-        <w:pStyle w:val="FirstParagraph"/>
-      </w:pPr>
-      <w:r>
-        <w:rPr>
-          <w:bCs/>
-          <w:b/>
-        </w:rPr>
-        <w:t xml:space="preserve">Inti pesan.</w:t>
-      </w:r>
-      <w:r>
-        <w:t xml:space="preserve"> </w:t>
-      </w:r>
-      <w:r>
-        <w:t xml:space="preserve">Jalur eksternal membeli waktu, tetapi tidak membeli integrasi.</w:t>
-      </w:r>
-    </w:p>
-    <w:p>
-      <w:pPr>
-        <w:pStyle w:val="BodyText"/>
-      </w:pPr>
-      <w:r>
-        <w:rPr>
-          <w:bCs/>
-          <w:b/>
-        </w:rPr>
-        <w:t xml:space="preserve">Penjelasan konsep.</w:t>
-      </w:r>
-      <w:r>
-        <w:t xml:space="preserve"> </w:t>
-      </w:r>
-      <w:r>
-        <w:rPr>
-          <w:iCs/>
-          <w:i/>
-        </w:rPr>
-        <w:t xml:space="preserve">M&amp;A</w:t>
-      </w:r>
-      <w:r>
-        <w:t xml:space="preserve"> </w:t>
-      </w:r>
-      <w:r>
-        <w:t xml:space="preserve">esensial bila (1) capability tidak dapat dibangun sendiri karena terlalu jauh dari basis yang ada, dan (2) waktu sangat menentukan. Keunggulannya kecepatan. Risikonya: capability berupa</w:t>
-      </w:r>
-      <w:r>
-        <w:t xml:space="preserve"> </w:t>
-      </w:r>
-      <w:r>
-        <w:rPr>
-          <w:iCs/>
-          <w:i/>
-        </w:rPr>
-        <w:t xml:space="preserve">tacit knowledge</w:t>
-      </w:r>
-      <w:r>
-        <w:t xml:space="preserve"> </w:t>
-      </w:r>
-      <w:r>
-        <w:t xml:space="preserve">dan</w:t>
-      </w:r>
-      <w:r>
-        <w:t xml:space="preserve"> </w:t>
-      </w:r>
-      <w:r>
-        <w:rPr>
-          <w:iCs/>
-          <w:i/>
-        </w:rPr>
-        <w:t xml:space="preserve">complex routines</w:t>
-      </w:r>
-      <w:r>
-        <w:t xml:space="preserve"> </w:t>
-      </w:r>
-      <w:r>
-        <w:t xml:space="preserve">yang tidak mudah dipindahkan; inkompatibilitas sistem; produktivitas dapat turun di bawah manajemen baru; dalam kasus terburuk akuisisi merusak capability yang diincar. Contoh: Meta mengeluarkan lebih dari US$25 miliar untuk teknologi AR, pengenalan suara, dan penerjemahan, namun integrasi terbukti sulit.</w:t>
-      </w:r>
-      <w:r>
-        <w:t xml:space="preserve"> </w:t>
-      </w:r>
-      <w:r>
-        <w:rPr>
-          <w:iCs/>
-          <w:i/>
-        </w:rPr>
-        <w:t xml:space="preserve">Collaborative partnerships</w:t>
-      </w:r>
-      <w:r>
-        <w:t xml:space="preserve"> </w:t>
-      </w:r>
-      <w:r>
-        <w:t xml:space="preserve">memiliki tiga jalur:</w:t>
-      </w:r>
-      <w:r>
-        <w:t xml:space="preserve"> </w:t>
-      </w:r>
-      <w:r>
-        <w:rPr>
-          <w:iCs/>
-          <w:i/>
-        </w:rPr>
-        <w:t xml:space="preserve">outsource</w:t>
-      </w:r>
-      <w:r>
-        <w:t xml:space="preserve"> </w:t>
-      </w:r>
-      <w:r>
-        <w:t xml:space="preserve">fungsi yang lemah (Bab 6), berkolaborasi dalam</w:t>
-      </w:r>
-      <w:r>
-        <w:t xml:space="preserve"> </w:t>
-      </w:r>
-      <w:r>
-        <w:rPr>
-          <w:iCs/>
-          <w:i/>
-        </w:rPr>
-        <w:t xml:space="preserve">joint venture</w:t>
-      </w:r>
-      <w:r>
-        <w:t xml:space="preserve"> </w:t>
-      </w:r>
-      <w:r>
-        <w:t xml:space="preserve">atau</w:t>
-      </w:r>
-      <w:r>
-        <w:t xml:space="preserve"> </w:t>
-      </w:r>
-      <w:r>
-        <w:rPr>
-          <w:iCs/>
-          <w:i/>
-        </w:rPr>
-        <w:t xml:space="preserve">strategic alliance</w:t>
-      </w:r>
-      <w:r>
-        <w:t xml:space="preserve"> </w:t>
-      </w:r>
-      <w:r>
-        <w:t xml:space="preserve">dengan mitra komplementer (pilih mitra berdasarkan</w:t>
-      </w:r>
-      <w:r>
-        <w:t xml:space="preserve"> </w:t>
-      </w:r>
-      <w:r>
-        <w:rPr>
-          <w:iCs/>
-          <w:i/>
-        </w:rPr>
-        <w:t xml:space="preserve">management style</w:t>
-      </w:r>
-      <w:r>
-        <w:t xml:space="preserve">,</w:t>
-      </w:r>
-      <w:r>
-        <w:t xml:space="preserve"> </w:t>
-      </w:r>
-      <w:r>
-        <w:rPr>
-          <w:iCs/>
-          <w:i/>
-        </w:rPr>
-        <w:t xml:space="preserve">culture</w:t>
-      </w:r>
-      <w:r>
-        <w:t xml:space="preserve">,</w:t>
-      </w:r>
-      <w:r>
-        <w:t xml:space="preserve"> </w:t>
-      </w:r>
-      <w:r>
-        <w:rPr>
-          <w:iCs/>
-          <w:i/>
-        </w:rPr>
-        <w:t xml:space="preserve">goals</w:t>
-      </w:r>
-      <w:r>
-        <w:t xml:space="preserve">), dan belajar dari mitra lalu menginternalisasi; bila keuntungan hanya sepihak, itu</w:t>
-      </w:r>
-      <w:r>
-        <w:t xml:space="preserve"> </w:t>
-      </w:r>
-      <w:r>
-        <w:rPr>
-          <w:iCs/>
-          <w:i/>
-        </w:rPr>
-        <w:t xml:space="preserve">abuse of trust</w:t>
-      </w:r>
-      <w:r>
-        <w:t xml:space="preserve">. Kemitraan lintas industri lebih aman (kendaraan otonom; Nike–Bluesign).</w:t>
-      </w:r>
-    </w:p>
-    <w:p>
-      <w:pPr>
-        <w:pStyle w:val="BodyText"/>
-      </w:pPr>
-      <w:r>
-        <w:rPr>
-          <w:bCs/>
-          <w:b/>
-        </w:rPr>
-        <w:t xml:space="preserve">Benang merah.</w:t>
-      </w:r>
-      <w:r>
-        <w:t xml:space="preserve"> </w:t>
-      </w:r>
-      <w:r>
-        <w:t xml:space="preserve">Capability yang dibeli tetap harus ditanam ke rutinitas organisasi sendiri; di situlah aksi 1 (orang) dan aksi 3 (struktur) menentukan. Kalimat ini menautkan kembali ke peta Figure 10.2.</w:t>
-      </w:r>
-    </w:p>
-    <w:bookmarkEnd w:id="33"/>
-    <w:bookmarkStart w:id="34" w:name="Xfbc25a19ed86de1ec68b65eee1a2d386d5ae6be"/>
-    <w:p>
-      <w:pPr>
-        <w:pStyle w:val="Heading2"/>
-      </w:pPr>
-      <w:r>
-        <w:t xml:space="preserve">Slide 12 — Execution Capability sebagai Competitive Advantage (IC 10.3, Zara)</w:t>
-      </w:r>
-    </w:p>
-    <w:p>
-      <w:pPr>
-        <w:pStyle w:val="FirstParagraph"/>
-      </w:pPr>
-      <w:r>
-        <w:rPr>
-          <w:bCs/>
-          <w:b/>
-        </w:rPr>
-        <w:t xml:space="preserve">Inti pesan.</w:t>
-      </w:r>
-      <w:r>
-        <w:t xml:space="preserve"> </w:t>
-      </w:r>
-      <w:r>
-        <w:t xml:space="preserve">Eksekusi bisa menjadi sumber keunggulan langsung, bukan sekadar penopang strategi.</w:t>
-      </w:r>
-    </w:p>
-    <w:p>
-      <w:pPr>
-        <w:pStyle w:val="BodyText"/>
-      </w:pPr>
-      <w:r>
-        <w:rPr>
-          <w:bCs/>
-          <w:b/>
-        </w:rPr>
-        <w:t xml:space="preserve">Penjelasan konsep.</w:t>
-      </w:r>
-      <w:r>
-        <w:t xml:space="preserve"> </w:t>
-      </w:r>
-      <w:r>
-        <w:t xml:space="preserve">Strategi</w:t>
-      </w:r>
-      <w:r>
-        <w:t xml:space="preserve"> </w:t>
-      </w:r>
-      <w:r>
-        <w:rPr>
-          <w:iCs/>
-          <w:i/>
-        </w:rPr>
-        <w:t xml:space="preserve">fast fashion</w:t>
-      </w:r>
-      <w:r>
-        <w:t xml:space="preserve"> </w:t>
-      </w:r>
-      <w:r>
-        <w:t xml:space="preserve">Zara tidak unik; keunggulannya ada pada eksekusi setiap mata rantai nilai. Angka dengan pembanding: 4 minggu dari desain ke toko (pesaing 6 bulan); 12.000 model baru per tahun (industri 3.000); 17 kunjungan pelanggan per tahun (pesaing 2); item rata-rata hanya 11 hari di toko; RFID menarik item lambat setelah 3–4 minggu. Produksi lot kecil dekat kantor pusat, rantai pasok terintegrasi vertikal tanpa gudang, nol belanja iklan namun lokasi premium, pengiriman hingga dua kali seminggu. Tantangan: H&amp;M, Uniqlo, Shein, dan pergeseran daring.</w:t>
-      </w:r>
-    </w:p>
-    <w:p>
-      <w:pPr>
-        <w:pStyle w:val="BodyText"/>
-      </w:pPr>
-      <w:r>
-        <w:rPr>
-          <w:bCs/>
-          <w:b/>
-        </w:rPr>
-        <w:t xml:space="preserve">Why keunggulan ini bertahan.</w:t>
-      </w:r>
-      <w:r>
-        <w:t xml:space="preserve"> </w:t>
-      </w:r>
-      <w:r>
-        <w:rPr>
-          <w:iCs/>
-          <w:i/>
-        </w:rPr>
-        <w:t xml:space="preserve">Execution capabilities</w:t>
-      </w:r>
-      <w:r>
-        <w:t xml:space="preserve"> </w:t>
-      </w:r>
-      <w:r>
-        <w:t xml:space="preserve">bersifat</w:t>
-      </w:r>
-      <w:r>
-        <w:t xml:space="preserve"> </w:t>
-      </w:r>
-      <w:r>
-        <w:rPr>
-          <w:iCs/>
-          <w:i/>
-        </w:rPr>
-        <w:t xml:space="preserve">socially complex</w:t>
-      </w:r>
-      <w:r>
-        <w:t xml:space="preserve"> </w:t>
-      </w:r>
-      <w:r>
-        <w:t xml:space="preserve">dan terbentuk lewat pengalaman bertahun-tahun, sehingga sulit ditiru dan tidak tersubstitusi (dua dari empat uji resource Bab 4). Buku menyimpulkan: ketika strategi mudah ditiru, satu-satunya jalan menuju keunggulan yang bertahan adalah</w:t>
-      </w:r>
-      <w:r>
-        <w:t xml:space="preserve"> </w:t>
-      </w:r>
-      <w:r>
-        <w:rPr>
-          <w:iCs/>
-          <w:i/>
-        </w:rPr>
-        <w:t xml:space="preserve">out-execute</w:t>
-      </w:r>
-      <w:r>
-        <w:t xml:space="preserve"> </w:t>
-      </w:r>
-      <w:r>
-        <w:t xml:space="preserve">pesaing.</w:t>
-      </w:r>
-    </w:p>
-    <w:bookmarkEnd w:id="34"/>
-    <w:bookmarkStart w:id="35" w:name="X1b347d97996b77cc3e53ddf2f7c586b15e74017"/>
-    <w:p>
-      <w:pPr>
-        <w:pStyle w:val="Heading2"/>
-      </w:pPr>
-      <w:r>
-        <w:t xml:space="preserve">Slide 13 — Menyelaraskan Struktur dengan Strategi (Figure 10.3, digambar ulang)</w:t>
-      </w:r>
-    </w:p>
-    <w:p>
-      <w:pPr>
-        <w:pStyle w:val="FirstParagraph"/>
-      </w:pPr>
-      <w:r>
-        <w:rPr>
-          <w:bCs/>
-          <w:b/>
-        </w:rPr>
-        <w:t xml:space="preserve">Inti pesan.</w:t>
-      </w:r>
-      <w:r>
-        <w:t xml:space="preserve"> </w:t>
-      </w:r>
-      <w:r>
-        <w:t xml:space="preserve">Satu aturan baku: struktur harus dicocokkan dengan kebutuhan implementasi strategi.</w:t>
-      </w:r>
-    </w:p>
-    <w:p>
-      <w:pPr>
-        <w:pStyle w:val="BodyText"/>
-      </w:pPr>
-      <w:r>
-        <w:rPr>
-          <w:bCs/>
-          <w:b/>
-        </w:rPr>
-        <w:t xml:space="preserve">Penjelasan konsep.</w:t>
-      </w:r>
-      <w:r>
-        <w:t xml:space="preserve"> </w:t>
-      </w:r>
-      <w:r>
-        <w:rPr>
-          <w:iCs/>
-          <w:i/>
-        </w:rPr>
-        <w:t xml:space="preserve">Core concept</w:t>
-      </w:r>
-      <w:r>
-        <w:t xml:space="preserve">:</w:t>
-      </w:r>
-      <w:r>
-        <w:t xml:space="preserve"> </w:t>
-      </w:r>
-      <w:r>
-        <w:rPr>
-          <w:iCs/>
-          <w:i/>
-        </w:rPr>
-        <w:t xml:space="preserve">organizational structure</w:t>
-      </w:r>
-      <w:r>
-        <w:t xml:space="preserve"> </w:t>
-      </w:r>
-      <w:r>
-        <w:t xml:space="preserve">adalah pengaturan formal dan informal atas tugas, tanggung jawab,</w:t>
-      </w:r>
-      <w:r>
-        <w:t xml:space="preserve"> </w:t>
-      </w:r>
-      <w:r>
-        <w:rPr>
-          <w:iCs/>
-          <w:i/>
-        </w:rPr>
-        <w:t xml:space="preserve">lines of authority</w:t>
-      </w:r>
-      <w:r>
-        <w:t xml:space="preserve">, dan</w:t>
-      </w:r>
-      <w:r>
-        <w:t xml:space="preserve"> </w:t>
-      </w:r>
-      <w:r>
-        <w:rPr>
-          <w:iCs/>
-          <w:i/>
-        </w:rPr>
-        <w:t xml:space="preserve">reporting relationships</w:t>
-      </w:r>
-      <w:r>
-        <w:t xml:space="preserve"> </w:t>
-      </w:r>
-      <w:r>
-        <w:t xml:space="preserve">(buku mengutip Chandler, 1962,</w:t>
-      </w:r>
-      <w:r>
-        <w:t xml:space="preserve"> </w:t>
-      </w:r>
-      <w:r>
-        <w:rPr>
-          <w:iCs/>
-          <w:i/>
-        </w:rPr>
-        <w:t xml:space="preserve">Strategy and Structure</w:t>
-      </w:r>
-      <w:r>
-        <w:t xml:space="preserve">). Lima keputusan penataan kerja: (1) aktivitas mana internal dan mana</w:t>
-      </w:r>
-      <w:r>
-        <w:t xml:space="preserve"> </w:t>
-      </w:r>
-      <w:r>
-        <w:rPr>
-          <w:iCs/>
-          <w:i/>
-        </w:rPr>
-        <w:t xml:space="preserve">outsource</w:t>
-      </w:r>
-      <w:r>
-        <w:t xml:space="preserve">; (2) menyelaraskan tipe struktur; (3) derajat sentralisasi vs delegasi; (4) koordinasi lintas unit; (5) kolaborasi dengan mitra eksternal. Semua bermuara pada satu keluaran:</w:t>
-      </w:r>
-      <w:r>
-        <w:t xml:space="preserve"> </w:t>
-      </w:r>
-      <w:r>
-        <w:rPr>
-          <w:iCs/>
-          <w:i/>
-        </w:rPr>
-        <w:t xml:space="preserve">an organizational structure matched to the requirements of successful strategy execution</w:t>
-      </w:r>
-      <w:r>
-        <w:t xml:space="preserve">.</w:t>
-      </w:r>
-    </w:p>
-    <w:p>
-      <w:pPr>
-        <w:pStyle w:val="BodyText"/>
-      </w:pPr>
-      <w:r>
-        <w:rPr>
-          <w:bCs/>
-          <w:b/>
-        </w:rPr>
-        <w:t xml:space="preserve">Why.</w:t>
-      </w:r>
-      <w:r>
-        <w:t xml:space="preserve"> </w:t>
-      </w:r>
-      <w:r>
-        <w:t xml:space="preserve">Struktur yang tidak cocok menimbulkan</w:t>
-      </w:r>
-      <w:r>
-        <w:t xml:space="preserve"> </w:t>
-      </w:r>
-      <w:r>
-        <w:rPr>
-          <w:iCs/>
-          <w:i/>
-        </w:rPr>
-        <w:t xml:space="preserve">bureaucratic costs</w:t>
-      </w:r>
-      <w:r>
-        <w:t xml:space="preserve"> </w:t>
-      </w:r>
-      <w:r>
-        <w:t xml:space="preserve">tinggi dan kegagalan koordinasi; desain yang baik menurunkan biaya, mempercepat</w:t>
-      </w:r>
-      <w:r>
-        <w:t xml:space="preserve"> </w:t>
-      </w:r>
-      <w:r>
-        <w:rPr>
-          <w:iCs/>
-          <w:i/>
-        </w:rPr>
-        <w:t xml:space="preserve">capability-building</w:t>
-      </w:r>
-      <w:r>
-        <w:t xml:space="preserve">, dan memungkinkan lebih dulu ke pasar.</w:t>
-      </w:r>
-    </w:p>
-    <w:bookmarkEnd w:id="35"/>
-    <w:bookmarkStart w:id="36" w:name="Xb2b51d9ed614ce96cb844bbb25a0b33e00342cd"/>
-    <w:p>
-      <w:pPr>
-        <w:pStyle w:val="Heading2"/>
-      </w:pPr>
-      <w:r>
-        <w:t xml:space="preserve">Slide 14 — Keputusan 1: Outsourcing (IC 10.4, Apple)</w:t>
-      </w:r>
-    </w:p>
-    <w:p>
-      <w:pPr>
-        <w:pStyle w:val="FirstParagraph"/>
-      </w:pPr>
-      <w:r>
-        <w:rPr>
-          <w:bCs/>
-          <w:b/>
-        </w:rPr>
-        <w:t xml:space="preserve">Inti pesan.</w:t>
-      </w:r>
-      <w:r>
-        <w:t xml:space="preserve"> </w:t>
-      </w:r>
-      <w:r>
-        <w:t xml:space="preserve">Outsourcing meningkatkan fokus pada aktivitas kritis, dengan batas yang jelas.</w:t>
-      </w:r>
-    </w:p>
-    <w:p>
-      <w:pPr>
-        <w:pStyle w:val="BodyText"/>
-      </w:pPr>
-      <w:r>
-        <w:rPr>
-          <w:bCs/>
-          <w:b/>
-        </w:rPr>
-        <w:t xml:space="preserve">Penjelasan konsep.</w:t>
-      </w:r>
-      <w:r>
-        <w:t xml:space="preserve"> </w:t>
-      </w:r>
-      <w:r>
-        <w:t xml:space="preserve">Tiga manfaat eksekusi: fokus strategis sehingga</w:t>
-      </w:r>
-      <w:r>
-        <w:t xml:space="preserve"> </w:t>
-      </w:r>
-      <w:r>
-        <w:rPr>
-          <w:iCs/>
-          <w:i/>
-        </w:rPr>
-        <w:t xml:space="preserve">competence</w:t>
-      </w:r>
-      <w:r>
-        <w:t xml:space="preserve"> </w:t>
-      </w:r>
-      <w:r>
-        <w:t xml:space="preserve">dapat naik menjadi</w:t>
-      </w:r>
-      <w:r>
-        <w:t xml:space="preserve"> </w:t>
-      </w:r>
-      <w:r>
-        <w:rPr>
-          <w:iCs/>
-          <w:i/>
-        </w:rPr>
-        <w:t xml:space="preserve">distinctive competence</w:t>
-      </w:r>
-      <w:r>
-        <w:t xml:space="preserve">; operasi lebih ramping, struktur lebih datar, respons lebih cepat; mitra kelas satu memperkuat arsenal capability (Boeing, Dell, Apple). Batas (Bab 6): jangan kehilangan</w:t>
-      </w:r>
-      <w:r>
-        <w:t xml:space="preserve"> </w:t>
-      </w:r>
-      <w:r>
-        <w:rPr>
-          <w:iCs/>
-          <w:i/>
-        </w:rPr>
-        <w:t xml:space="preserve">expertise</w:t>
-      </w:r>
-      <w:r>
-        <w:t xml:space="preserve"> </w:t>
-      </w:r>
-      <w:r>
-        <w:t xml:space="preserve">pada aktivitas yang menopang keunggulan jangka panjang; perusahaan harus tetap</w:t>
-      </w:r>
-      <w:r>
-        <w:t xml:space="preserve"> </w:t>
-      </w:r>
-      <w:r>
-        <w:rPr>
-          <w:iCs/>
-          <w:i/>
-        </w:rPr>
-        <w:t xml:space="preserve">master of its own destiny</w:t>
-      </w:r>
-      <w:r>
-        <w:t xml:space="preserve">. Apple memegang inovasi, desain, dan</w:t>
-      </w:r>
-      <w:r>
-        <w:t xml:space="preserve"> </w:t>
-      </w:r>
-      <w:r>
-        <w:rPr>
-          <w:iCs/>
-          <w:i/>
-        </w:rPr>
-        <w:t xml:space="preserve">new product development</w:t>
-      </w:r>
-      <w:r>
-        <w:t xml:space="preserve">, lalu meng-</w:t>
-      </w:r>
-      <w:r>
-        <w:rPr>
-          <w:iCs/>
-          <w:i/>
-        </w:rPr>
-        <w:t xml:space="preserve">outsource</w:t>
-      </w:r>
-      <w:r>
-        <w:t xml:space="preserve"> </w:t>
-      </w:r>
-      <w:r>
-        <w:t xml:space="preserve">manufaktur ke Foxconn (1,3 juta pekerja pada 2023, mampu merekrut 3.000 orang seketika); biayanya adalah berkurangnya kendali langsung atas kondisi kerja, sehingga standar pemasok diperketat dan produksi didiversifikasi ke luar Tiongkok. Pola serupa: 83% dari sepuluh perusahaan farmasi terbesar meng-</w:t>
-      </w:r>
-      <w:r>
-        <w:rPr>
-          <w:iCs/>
-          <w:i/>
-        </w:rPr>
-        <w:t xml:space="preserve">outsource</w:t>
-      </w:r>
-      <w:r>
-        <w:t xml:space="preserve"> </w:t>
-      </w:r>
-      <w:r>
-        <w:rPr>
-          <w:iCs/>
-          <w:i/>
-        </w:rPr>
-        <w:t xml:space="preserve">clinical data management</w:t>
-      </w:r>
-      <w:r>
-        <w:t xml:space="preserve">; Nike; Broadcom.</w:t>
-      </w:r>
-    </w:p>
-    <w:p>
-      <w:pPr>
-        <w:pStyle w:val="BodyText"/>
-      </w:pPr>
-      <w:r>
-        <w:rPr>
-          <w:bCs/>
-          <w:b/>
-        </w:rPr>
-        <w:t xml:space="preserve">Pertanyaan kunci.</w:t>
-      </w:r>
-      <w:r>
-        <w:t xml:space="preserve"> </w:t>
-      </w:r>
-      <w:r>
-        <w:t xml:space="preserve">Bukan</w:t>
-      </w:r>
-      <w:r>
-        <w:t xml:space="preserve"> </w:t>
-      </w:r>
-      <w:r>
-        <w:t xml:space="preserve">“</w:t>
-      </w:r>
-      <w:r>
-        <w:t xml:space="preserve">bisakah di-</w:t>
-      </w:r>
-      <w:r>
-        <w:rPr>
-          <w:iCs/>
-          <w:i/>
-        </w:rPr>
-        <w:t xml:space="preserve">outsource</w:t>
-      </w:r>
-      <w:r>
-        <w:t xml:space="preserve">?</w:t>
-      </w:r>
-      <w:r>
-        <w:t xml:space="preserve">”</w:t>
-      </w:r>
-      <w:r>
-        <w:t xml:space="preserve">, melainkan</w:t>
-      </w:r>
-      <w:r>
-        <w:t xml:space="preserve"> </w:t>
-      </w:r>
-      <w:r>
-        <w:t xml:space="preserve">“</w:t>
-      </w:r>
-      <w:r>
-        <w:t xml:space="preserve">apakah aktivitas ini inti dari strategi kami?</w:t>
-      </w:r>
-      <w:r>
-        <w:t xml:space="preserve">”</w:t>
-      </w:r>
-    </w:p>
-    <w:bookmarkEnd w:id="36"/>
-    <w:bookmarkStart w:id="37" w:name="slide-15-keputusan-2-empat-tipe-struktur"/>
-    <w:p>
-      <w:pPr>
-        <w:pStyle w:val="Heading2"/>
-      </w:pPr>
-      <w:r>
-        <w:t xml:space="preserve">Slide 15 — Keputusan 2: Empat Tipe Struktur</w:t>
-      </w:r>
-    </w:p>
-    <w:p>
-      <w:pPr>
-        <w:pStyle w:val="FirstParagraph"/>
-      </w:pPr>
-      <w:r>
-        <w:rPr>
-          <w:bCs/>
-          <w:b/>
-        </w:rPr>
-        <w:t xml:space="preserve">Inti pesan.</w:t>
-      </w:r>
-      <w:r>
-        <w:t xml:space="preserve"> </w:t>
-      </w:r>
-      <w:r>
-        <w:t xml:space="preserve">Tipe struktur ditentukan oleh ukuran dan susunan bisnis, dan berevolusi.</w:t>
-      </w:r>
-    </w:p>
-    <w:p>
-      <w:pPr>
-        <w:pStyle w:val="BodyText"/>
-      </w:pPr>
-      <w:r>
-        <w:rPr>
-          <w:bCs/>
-          <w:b/>
-        </w:rPr>
-        <w:t xml:space="preserve">Penjelasan konsep.</w:t>
-      </w:r>
-      <w:r>
-        <w:t xml:space="preserve"> </w:t>
-      </w:r>
-      <w:r>
-        <w:t xml:space="preserve">Prinsip:</w:t>
-      </w:r>
-      <w:r>
-        <w:t xml:space="preserve"> </w:t>
-      </w:r>
-      <w:r>
-        <w:rPr>
-          <w:iCs/>
-          <w:i/>
-        </w:rPr>
-        <w:t xml:space="preserve">strategy-critical activities</w:t>
-      </w:r>
-      <w:r>
-        <w:t xml:space="preserve"> </w:t>
-      </w:r>
-      <w:r>
-        <w:t xml:space="preserve">menjadi</w:t>
-      </w:r>
-      <w:r>
-        <w:t xml:space="preserve"> </w:t>
-      </w:r>
-      <w:r>
-        <w:rPr>
-          <w:iCs/>
-          <w:i/>
-        </w:rPr>
-        <w:t xml:space="preserve">building blocks</w:t>
-      </w:r>
-      <w:r>
-        <w:t xml:space="preserve"> </w:t>
-      </w:r>
-      <w:r>
-        <w:t xml:space="preserve">utama.</w:t>
-      </w:r>
-      <w:r>
-        <w:t xml:space="preserve"> </w:t>
-      </w:r>
-      <w:r>
-        <w:rPr>
-          <w:bCs/>
-          <w:b/>
-        </w:rPr>
-        <w:t xml:space="preserve">Simple structure</w:t>
-      </w:r>
-      <w:r>
-        <w:t xml:space="preserve"> </w:t>
-      </w:r>
-      <w:r>
-        <w:t xml:space="preserve">(</w:t>
-      </w:r>
-      <w:r>
-        <w:rPr>
-          <w:iCs/>
-          <w:i/>
-        </w:rPr>
-        <w:t xml:space="preserve">line-and-staff</w:t>
-      </w:r>
-      <w:r>
-        <w:t xml:space="preserve">,</w:t>
-      </w:r>
-      <w:r>
-        <w:t xml:space="preserve"> </w:t>
-      </w:r>
-      <w:r>
-        <w:rPr>
-          <w:iCs/>
-          <w:i/>
-        </w:rPr>
-        <w:t xml:space="preserve">flat</w:t>
-      </w:r>
-      <w:r>
-        <w:t xml:space="preserve">): eksekutif pusat dan staf kecil; cocok untuk perusahaan kecil dan</w:t>
-      </w:r>
-      <w:r>
-        <w:t xml:space="preserve"> </w:t>
-      </w:r>
-      <w:r>
-        <w:rPr>
-          <w:iCs/>
-          <w:i/>
-        </w:rPr>
-        <w:t xml:space="preserve">startup</w:t>
-      </w:r>
-      <w:r>
-        <w:t xml:space="preserve">; murah dan lentur; tidak memadai saat tumbuh.</w:t>
-      </w:r>
-      <w:r>
-        <w:t xml:space="preserve"> </w:t>
-      </w:r>
-      <w:r>
-        <w:rPr>
-          <w:bCs/>
-          <w:b/>
-        </w:rPr>
-        <w:t xml:space="preserve">Functional structure</w:t>
-      </w:r>
-      <w:r>
-        <w:t xml:space="preserve"> </w:t>
-      </w:r>
-      <w:r>
-        <w:t xml:space="preserve">(</w:t>
-      </w:r>
-      <w:r>
-        <w:rPr>
-          <w:iCs/>
-          <w:i/>
-        </w:rPr>
-        <w:t xml:space="preserve">U-form</w:t>
-      </w:r>
-      <w:r>
-        <w:t xml:space="preserve">): departemen per fungsi; cocok untuk perusahaan satu bisnis apa pun</w:t>
-      </w:r>
-      <w:r>
-        <w:t xml:space="preserve"> </w:t>
-      </w:r>
-      <w:r>
-        <w:rPr>
-          <w:iCs/>
-          <w:i/>
-        </w:rPr>
-        <w:t xml:space="preserve">generic strategy</w:t>
-      </w:r>
-      <w:r>
-        <w:t xml:space="preserve">-nya (GM kini mengelola semua merek dalam satu struktur fungsional); spesialisasi dan</w:t>
-      </w:r>
-      <w:r>
-        <w:t xml:space="preserve"> </w:t>
-      </w:r>
-      <w:r>
-        <w:rPr>
-          <w:iCs/>
-          <w:i/>
-        </w:rPr>
-        <w:t xml:space="preserve">scale economies</w:t>
-      </w:r>
-      <w:r>
-        <w:t xml:space="preserve">; kelemahannya sekat antardepartemen.</w:t>
-      </w:r>
-      <w:r>
-        <w:t xml:space="preserve"> </w:t>
-      </w:r>
-      <w:r>
-        <w:rPr>
-          <w:bCs/>
-          <w:b/>
-        </w:rPr>
-        <w:t xml:space="preserve">Multidivisional structure</w:t>
-      </w:r>
-      <w:r>
-        <w:t xml:space="preserve"> </w:t>
-      </w:r>
-      <w:r>
-        <w:t xml:space="preserve">(</w:t>
-      </w:r>
-      <w:r>
-        <w:rPr>
-          <w:iCs/>
-          <w:i/>
-        </w:rPr>
-        <w:t xml:space="preserve">M-form</w:t>
-      </w:r>
-      <w:r>
-        <w:t xml:space="preserve">): divisi sebagai</w:t>
-      </w:r>
-      <w:r>
-        <w:t xml:space="preserve"> </w:t>
-      </w:r>
-      <w:r>
-        <w:rPr>
-          <w:iCs/>
-          <w:i/>
-        </w:rPr>
-        <w:t xml:space="preserve">profit center</w:t>
-      </w:r>
-      <w:r>
-        <w:t xml:space="preserve"> </w:t>
-      </w:r>
-      <w:r>
-        <w:t xml:space="preserve">(SBU) dengan kantor pusat; cocok untuk diversifikasi, strategi internasional, integrasi vertikal; mengurangi</w:t>
-      </w:r>
-      <w:r>
-        <w:t xml:space="preserve"> </w:t>
-      </w:r>
-      <w:r>
-        <w:rPr>
-          <w:iCs/>
-          <w:i/>
-        </w:rPr>
-        <w:t xml:space="preserve">information overload</w:t>
-      </w:r>
-      <w:r>
-        <w:t xml:space="preserve"> </w:t>
-      </w:r>
-      <w:r>
-        <w:t xml:space="preserve">dan menyelaraskan insentif; menghambat sinergi lintas bisnis pada</w:t>
-      </w:r>
-      <w:r>
-        <w:t xml:space="preserve"> </w:t>
-      </w:r>
-      <w:r>
-        <w:rPr>
-          <w:iCs/>
-          <w:i/>
-        </w:rPr>
-        <w:t xml:space="preserve">related diversification</w:t>
-      </w:r>
-      <w:r>
-        <w:t xml:space="preserve">.</w:t>
-      </w:r>
-      <w:r>
-        <w:t xml:space="preserve"> </w:t>
-      </w:r>
-      <w:r>
-        <w:rPr>
-          <w:bCs/>
-          <w:b/>
-        </w:rPr>
-        <w:t xml:space="preserve">Matrix structure</w:t>
-      </w:r>
-      <w:r>
-        <w:t xml:space="preserve"> </w:t>
-      </w:r>
-      <w:r>
-        <w:t xml:space="preserve">(</w:t>
-      </w:r>
-      <w:r>
-        <w:rPr>
-          <w:iCs/>
-          <w:i/>
-        </w:rPr>
-        <w:t xml:space="preserve">composite</w:t>
-      </w:r>
-      <w:r>
-        <w:t xml:space="preserve">): dua dimensi atau lebih dengan</w:t>
-      </w:r>
-      <w:r>
-        <w:t xml:space="preserve"> </w:t>
-      </w:r>
-      <w:r>
-        <w:rPr>
-          <w:iCs/>
-          <w:i/>
-        </w:rPr>
-        <w:t xml:space="preserve">multiple reporting</w:t>
-      </w:r>
-      <w:r>
-        <w:t xml:space="preserve">; cocok untuk manajemen berbasis proyek dan capability lintas unit (Texas Instruments, Caterpillar, Philips);</w:t>
-      </w:r>
-      <w:r>
-        <w:t xml:space="preserve"> </w:t>
-      </w:r>
-      <w:r>
-        <w:rPr>
-          <w:iCs/>
-          <w:i/>
-        </w:rPr>
-        <w:t xml:space="preserve">economies of scope</w:t>
-      </w:r>
-      <w:r>
-        <w:t xml:space="preserve">; lapisan tambahan dan</w:t>
-      </w:r>
-      <w:r>
-        <w:t xml:space="preserve"> </w:t>
-      </w:r>
-      <w:r>
-        <w:rPr>
-          <w:iCs/>
-          <w:i/>
-        </w:rPr>
-        <w:t xml:space="preserve">divided loyalties</w:t>
-      </w:r>
-      <w:r>
-        <w:t xml:space="preserve">.</w:t>
-      </w:r>
-    </w:p>
-    <w:p>
-      <w:pPr>
-        <w:pStyle w:val="BodyText"/>
-      </w:pPr>
-      <w:r>
-        <w:rPr>
-          <w:bCs/>
-          <w:b/>
-        </w:rPr>
-        <w:t xml:space="preserve">Catatan penting dari buku.</w:t>
-      </w:r>
-      <w:r>
-        <w:t xml:space="preserve"> </w:t>
-      </w:r>
-      <w:r>
-        <w:t xml:space="preserve">Tipe struktur bergantung pada ukuran dan kompleksitas,</w:t>
-      </w:r>
-      <w:r>
-        <w:t xml:space="preserve"> </w:t>
-      </w:r>
-      <w:r>
-        <w:t xml:space="preserve">“</w:t>
-      </w:r>
-      <w:r>
-        <w:t xml:space="preserve">but not so much on the specifics of its strategy</w:t>
-      </w:r>
-      <w:r>
-        <w:t xml:space="preserve">”</w:t>
-      </w:r>
-      <w:r>
-        <w:t xml:space="preserve">. Jadi kecocokan struktur dengan strategi terwujud melalui penempatan aktivitas kritis sebagai pusat, bukan semata pemilihan tipe.</w:t>
-      </w:r>
-    </w:p>
-    <w:bookmarkEnd w:id="37"/>
-    <w:bookmarkStart w:id="38" w:name="Xac9956d89ab7a9093c5c5d4d760c343c5459ab9"/>
-    <w:p>
-      <w:pPr>
-        <w:pStyle w:val="Heading2"/>
-      </w:pPr>
-      <w:r>
-        <w:t xml:space="preserve">Slide 16 — Keputusan 3: Sentralisasi vs Desentralisasi (Table 10.1, digambar ulang)</w:t>
-      </w:r>
-    </w:p>
-    <w:p>
-      <w:pPr>
-        <w:pStyle w:val="FirstParagraph"/>
-      </w:pPr>
-      <w:r>
-        <w:rPr>
-          <w:bCs/>
-          <w:b/>
-        </w:rPr>
-        <w:t xml:space="preserve">Inti pesan.</w:t>
-      </w:r>
-      <w:r>
-        <w:t xml:space="preserve"> </w:t>
-      </w:r>
-      <w:r>
-        <w:t xml:space="preserve">Keduanya memiliki logika; pilihan bergantung pada letak pengetahuan dan kebutuhan kecepatan.</w:t>
-      </w:r>
-    </w:p>
-    <w:p>
-      <w:pPr>
-        <w:pStyle w:val="BodyText"/>
-      </w:pPr>
-      <w:r>
-        <w:rPr>
-          <w:bCs/>
-          <w:b/>
-        </w:rPr>
-        <w:t xml:space="preserve">Penjelasan konsep.</w:t>
-      </w:r>
-      <w:r>
-        <w:t xml:space="preserve"> </w:t>
-      </w:r>
-      <w:r>
-        <w:t xml:space="preserve">Tabel mengikuti struktur asli buku:</w:t>
-      </w:r>
-      <w:r>
-        <w:t xml:space="preserve"> </w:t>
-      </w:r>
-      <w:r>
-        <w:rPr>
-          <w:iCs/>
-          <w:i/>
-        </w:rPr>
-        <w:t xml:space="preserve">basic tenets</w:t>
-      </w:r>
-      <w:r>
-        <w:t xml:space="preserve">,</w:t>
-      </w:r>
-      <w:r>
-        <w:t xml:space="preserve"> </w:t>
-      </w:r>
-      <w:r>
-        <w:rPr>
-          <w:iCs/>
-          <w:i/>
-        </w:rPr>
-        <w:t xml:space="preserve">chief advantages</w:t>
-      </w:r>
-      <w:r>
-        <w:t xml:space="preserve">,</w:t>
-      </w:r>
-      <w:r>
-        <w:t xml:space="preserve"> </w:t>
-      </w:r>
-      <w:r>
-        <w:rPr>
-          <w:iCs/>
-          <w:i/>
-        </w:rPr>
-        <w:t xml:space="preserve">primary disadvantages</w:t>
-      </w:r>
-      <w:r>
-        <w:t xml:space="preserve"> </w:t>
-      </w:r>
-      <w:r>
-        <w:t xml:space="preserve">untuk masing-masing. Sentralisasi unggul dalam akuntabilitas, konsistensi, dan kepemimpinan saat krisis; lemah dalam kecepatan respons dan inisiatif. Desentralisasi unggul dalam inisiatif, motivasi, ide baru, respons pasar, dan lapisan yang lebih sedikit; lemah dalam konsistensi dan koordinasi lintas unit. Kendali dalam desentralisasi dijaga melalui batas wewenang,</w:t>
-      </w:r>
-      <w:r>
-        <w:t xml:space="preserve"> </w:t>
-      </w:r>
-      <w:r>
-        <w:rPr>
-          <w:iCs/>
-          <w:i/>
-        </w:rPr>
-        <w:t xml:space="preserve">strategic control systems</w:t>
-      </w:r>
-      <w:r>
-        <w:t xml:space="preserve">, akuntabilitas, insentif, dan budaya dengan</w:t>
-      </w:r>
-      <w:r>
-        <w:t xml:space="preserve"> </w:t>
-      </w:r>
-      <w:r>
-        <w:rPr>
-          <w:iCs/>
-          <w:i/>
-        </w:rPr>
-        <w:t xml:space="preserve">peer pressure</w:t>
-      </w:r>
-      <w:r>
-        <w:t xml:space="preserve"> </w:t>
-      </w:r>
-      <w:r>
-        <w:t xml:space="preserve">(buku mengutip Simons, 1995). Contoh: karyawan Starbucks membagikan kopi gratis saat kasir</w:t>
-      </w:r>
-      <w:r>
-        <w:t xml:space="preserve"> </w:t>
-      </w:r>
-      <w:r>
-        <w:rPr>
-          <w:iCs/>
-          <w:i/>
-        </w:rPr>
-        <w:t xml:space="preserve">offline</w:t>
-      </w:r>
-      <w:r>
-        <w:t xml:space="preserve">;</w:t>
-      </w:r>
-      <w:r>
-        <w:t xml:space="preserve"> </w:t>
-      </w:r>
-      <w:r>
-        <w:rPr>
-          <w:iCs/>
-          <w:i/>
-        </w:rPr>
-        <w:t xml:space="preserve">buyer</w:t>
-      </w:r>
-      <w:r>
-        <w:t xml:space="preserve"> </w:t>
-      </w:r>
-      <w:r>
-        <w:t xml:space="preserve">TJX memangkas anggarannya sendiri. Untuk</w:t>
-      </w:r>
-      <w:r>
-        <w:t xml:space="preserve"> </w:t>
-      </w:r>
-      <w:r>
-        <w:rPr>
-          <w:iCs/>
-          <w:i/>
-        </w:rPr>
-        <w:t xml:space="preserve">cross-business strategic fit</w:t>
-      </w:r>
-      <w:r>
-        <w:t xml:space="preserve">, fungsi yang menuntut koordinasi erat (R&amp;D,</w:t>
-      </w:r>
-      <w:r>
-        <w:t xml:space="preserve"> </w:t>
-      </w:r>
-      <w:r>
-        <w:rPr>
-          <w:iCs/>
-          <w:i/>
-        </w:rPr>
-        <w:t xml:space="preserve">sales force</w:t>
-      </w:r>
-      <w:r>
-        <w:t xml:space="preserve"> </w:t>
-      </w:r>
-      <w:r>
-        <w:t xml:space="preserve">bersama) disentralisasi atau dibentuk</w:t>
-      </w:r>
-      <w:r>
-        <w:t xml:space="preserve"> </w:t>
-      </w:r>
-      <w:r>
-        <w:rPr>
-          <w:iCs/>
-          <w:i/>
-        </w:rPr>
-        <w:t xml:space="preserve">business groups</w:t>
-      </w:r>
-      <w:r>
-        <w:t xml:space="preserve">. Tren: pergeseran ke struktur lebih datar karena aset paling bernilai adalah</w:t>
-      </w:r>
-      <w:r>
-        <w:t xml:space="preserve"> </w:t>
-      </w:r>
-      <w:r>
-        <w:rPr>
-          <w:iCs/>
-          <w:i/>
-        </w:rPr>
-        <w:t xml:space="preserve">intellectual capital</w:t>
-      </w:r>
-      <w:r>
-        <w:t xml:space="preserve"> </w:t>
-      </w:r>
-      <w:r>
-        <w:t xml:space="preserve">karyawan.</w:t>
-      </w:r>
-    </w:p>
-    <w:p>
-      <w:pPr>
-        <w:pStyle w:val="BodyText"/>
-      </w:pPr>
-      <w:r>
-        <w:rPr>
-          <w:bCs/>
-          <w:b/>
-        </w:rPr>
-        <w:t xml:space="preserve">Antisipasi pertanyaan.</w:t>
-      </w:r>
-      <w:r>
-        <w:t xml:space="preserve"> </w:t>
-      </w:r>
-      <w:r>
-        <w:t xml:space="preserve">“</w:t>
-      </w:r>
-      <w:r>
-        <w:t xml:space="preserve">Bukankah desentralisasi berarti kehilangan kendali?</w:t>
-      </w:r>
-      <w:r>
-        <w:t xml:space="preserve">”</w:t>
-      </w:r>
-      <w:r>
-        <w:t xml:space="preserve"> </w:t>
-      </w:r>
-      <w:r>
-        <w:t xml:space="preserve">Jawab dengan lima mekanisme kendali di atas; desentralisasi memindahkan keputusan, bukan menghapus akuntabilitas.</w:t>
-      </w:r>
-    </w:p>
-    <w:bookmarkEnd w:id="38"/>
-    <w:bookmarkStart w:id="39" w:name="X5b0e1cf4ee6f9a3f2910cf8bc683c6078b99e95"/>
-    <w:p>
-      <w:pPr>
-        <w:pStyle w:val="Heading2"/>
-      </w:pPr>
-      <w:r>
-        <w:t xml:space="preserve">Slide 17 — Keputusan 4 dan 5: Koordinasi Lintas Unit dan Mitra Eksternal</w:t>
-      </w:r>
-    </w:p>
-    <w:p>
-      <w:pPr>
-        <w:pStyle w:val="FirstParagraph"/>
-      </w:pPr>
-      <w:r>
-        <w:rPr>
-          <w:bCs/>
-          <w:b/>
-        </w:rPr>
-        <w:t xml:space="preserve">Inti pesan.</w:t>
-      </w:r>
-      <w:r>
-        <w:t xml:space="preserve"> </w:t>
-      </w:r>
-      <w:r>
-        <w:t xml:space="preserve">Struktur formal tidak cukup; koordinasi harus dirancang ke dalam dan ke luar.</w:t>
-      </w:r>
-    </w:p>
-    <w:p>
-      <w:pPr>
-        <w:pStyle w:val="BodyText"/>
-      </w:pPr>
-      <w:r>
-        <w:rPr>
-          <w:bCs/>
-          <w:b/>
-        </w:rPr>
-        <w:t xml:space="preserve">Penjelasan konsep.</w:t>
-      </w:r>
-      <w:r>
-        <w:t xml:space="preserve"> </w:t>
-      </w:r>
-      <w:r>
-        <w:t xml:space="preserve">Ke dalam: capability seperti</w:t>
-      </w:r>
-      <w:r>
-        <w:t xml:space="preserve"> </w:t>
-      </w:r>
-      <w:r>
-        <w:rPr>
-          <w:iCs/>
-          <w:i/>
-        </w:rPr>
-        <w:t xml:space="preserve">speed-to-market</w:t>
-      </w:r>
-      <w:r>
-        <w:t xml:space="preserve"> </w:t>
-      </w:r>
-      <w:r>
-        <w:t xml:space="preserve">dan layanan pelanggan unggul melintasi banyak unit; eksekutif menegakkan komitmen bersama,</w:t>
-      </w:r>
-      <w:r>
-        <w:t xml:space="preserve"> </w:t>
-      </w:r>
-      <w:r>
-        <w:rPr>
-          <w:iCs/>
-          <w:i/>
-        </w:rPr>
-        <w:t xml:space="preserve">follow-up</w:t>
-      </w:r>
-      <w:r>
-        <w:t xml:space="preserve">, dan intervensi; mekanisme formal berupa</w:t>
-      </w:r>
-      <w:r>
-        <w:t xml:space="preserve"> </w:t>
-      </w:r>
-      <w:r>
-        <w:rPr>
-          <w:iCs/>
-          <w:i/>
-        </w:rPr>
-        <w:t xml:space="preserve">cross-functional committees</w:t>
-      </w:r>
-      <w:r>
-        <w:t xml:space="preserve">,</w:t>
-      </w:r>
-      <w:r>
-        <w:t xml:space="preserve"> </w:t>
-      </w:r>
-      <w:r>
-        <w:rPr>
-          <w:iCs/>
-          <w:i/>
-        </w:rPr>
-        <w:t xml:space="preserve">project teams</w:t>
-      </w:r>
-      <w:r>
-        <w:t xml:space="preserve">,</w:t>
-      </w:r>
-      <w:r>
-        <w:t xml:space="preserve"> </w:t>
-      </w:r>
-      <w:r>
-        <w:rPr>
-          <w:iCs/>
-          <w:i/>
-        </w:rPr>
-        <w:t xml:space="preserve">project management office</w:t>
-      </w:r>
-      <w:r>
-        <w:t xml:space="preserve">; yang paling efektif adalah</w:t>
-      </w:r>
-      <w:r>
-        <w:t xml:space="preserve"> </w:t>
-      </w:r>
-      <w:r>
-        <w:rPr>
-          <w:iCs/>
-          <w:i/>
-        </w:rPr>
-        <w:t xml:space="preserve">incentive compensation</w:t>
-      </w:r>
-      <w:r>
-        <w:t xml:space="preserve"> </w:t>
-      </w:r>
-      <w:r>
-        <w:t xml:space="preserve">yang terikat pada kinerja kelompok lintas unit. Hambatan: dalam struktur terdesentralisasi, kepala departemen cenderung memprioritaskan unitnya. Ke luar:</w:t>
-      </w:r>
-      <w:r>
-        <w:t xml:space="preserve"> </w:t>
-      </w:r>
-      <w:r>
-        <w:rPr>
-          <w:iCs/>
-          <w:i/>
-        </w:rPr>
-        <w:t xml:space="preserve">relationship managers</w:t>
-      </w:r>
-      <w:r>
-        <w:t xml:space="preserve">; dua konfigurasi,</w:t>
-      </w:r>
-      <w:r>
-        <w:t xml:space="preserve"> </w:t>
-      </w:r>
-      <w:r>
-        <w:rPr>
-          <w:bCs/>
-          <w:b/>
-        </w:rPr>
-        <w:t xml:space="preserve">network</w:t>
-      </w:r>
-      <w:r>
-        <w:t xml:space="preserve"> </w:t>
-      </w:r>
-      <w:r>
-        <w:t xml:space="preserve">(kontraktual, diorganisasi</w:t>
-      </w:r>
-      <w:r>
-        <w:t xml:space="preserve"> </w:t>
-      </w:r>
-      <w:r>
-        <w:rPr>
-          <w:iCs/>
-          <w:i/>
-        </w:rPr>
-        <w:t xml:space="preserve">central firm</w:t>
-      </w:r>
-      <w:r>
-        <w:t xml:space="preserve">, contoh Ducati) dan</w:t>
-      </w:r>
-      <w:r>
-        <w:t xml:space="preserve"> </w:t>
-      </w:r>
-      <w:r>
-        <w:rPr>
-          <w:bCs/>
-          <w:b/>
-        </w:rPr>
-        <w:t xml:space="preserve">ecosystem</w:t>
-      </w:r>
-      <w:r>
-        <w:t xml:space="preserve"> </w:t>
-      </w:r>
-      <w:r>
-        <w:t xml:space="preserve">(non-kontraktual, beragam aktor, contoh Silicon Valley).</w:t>
-      </w:r>
-      <w:r>
-        <w:t xml:space="preserve"> </w:t>
-      </w:r>
-      <w:r>
-        <w:rPr>
-          <w:iCs/>
-          <w:i/>
-        </w:rPr>
-        <w:t xml:space="preserve">Further perspective</w:t>
-      </w:r>
-      <w:r>
-        <w:t xml:space="preserve">: pilih desain dasar, lengkapi dengan</w:t>
-      </w:r>
-      <w:r>
-        <w:t xml:space="preserve"> </w:t>
-      </w:r>
-      <w:r>
-        <w:rPr>
-          <w:iCs/>
-          <w:i/>
-        </w:rPr>
-        <w:t xml:space="preserve">coordinating mechanisms</w:t>
-      </w:r>
-      <w:r>
-        <w:t xml:space="preserve">, bangun</w:t>
-      </w:r>
-      <w:r>
-        <w:t xml:space="preserve"> </w:t>
-      </w:r>
-      <w:r>
-        <w:rPr>
-          <w:iCs/>
-          <w:i/>
-        </w:rPr>
-        <w:t xml:space="preserve">networking and communications arrangements</w:t>
-      </w:r>
-      <w:r>
-        <w:t xml:space="preserve">;</w:t>
-      </w:r>
-      <w:r>
-        <w:t xml:space="preserve"> </w:t>
-      </w:r>
-      <w:r>
-        <w:rPr>
-          <w:iCs/>
-          <w:i/>
-        </w:rPr>
-        <w:t xml:space="preserve">organization building</w:t>
-      </w:r>
-      <w:r>
-        <w:t xml:space="preserve"> </w:t>
-      </w:r>
-      <w:r>
-        <w:t xml:space="preserve">adalah</w:t>
-      </w:r>
-      <w:r>
-        <w:t xml:space="preserve"> </w:t>
-      </w:r>
-      <w:r>
-        <w:rPr>
-          <w:iCs/>
-          <w:i/>
-        </w:rPr>
-        <w:t xml:space="preserve">consciously knitting together</w:t>
-      </w:r>
-      <w:r>
-        <w:t xml:space="preserve"> </w:t>
-      </w:r>
-      <w:r>
-        <w:t xml:space="preserve">upaya individu dan kelompok, dan manajemen senior harus terlibat mendalam.</w:t>
-      </w:r>
-    </w:p>
-    <w:bookmarkEnd w:id="39"/>
-    <w:bookmarkStart w:id="40" w:name="slide-18-sintesis"/>
-    <w:p>
-      <w:pPr>
-        <w:pStyle w:val="Heading2"/>
-      </w:pPr>
-      <w:r>
-        <w:t xml:space="preserve">Slide 18 — Sintesis</w:t>
-      </w:r>
-    </w:p>
-    <w:p>
-      <w:pPr>
-        <w:pStyle w:val="FirstParagraph"/>
-      </w:pPr>
-      <w:r>
-        <w:rPr>
-          <w:bCs/>
-          <w:b/>
-        </w:rPr>
-        <w:t xml:space="preserve">Inti pesan.</w:t>
-      </w:r>
-      <w:r>
-        <w:t xml:space="preserve"> </w:t>
-      </w:r>
-      <w:r>
-        <w:t xml:space="preserve">Rangkaian logika: staffing → capabilities → structure →</w:t>
-      </w:r>
-      <w:r>
-        <w:t xml:space="preserve"> </w:t>
-      </w:r>
-      <w:r>
-        <w:rPr>
-          <w:iCs/>
-          <w:i/>
-        </w:rPr>
-        <w:t xml:space="preserve">proficient strategy execution</w:t>
-      </w:r>
-      <w:r>
-        <w:t xml:space="preserve"> </w:t>
-      </w:r>
-      <w:r>
-        <w:t xml:space="preserve">→</w:t>
-      </w:r>
-      <w:r>
-        <w:t xml:space="preserve"> </w:t>
-      </w:r>
-      <w:r>
-        <w:rPr>
-          <w:iCs/>
-          <w:i/>
-        </w:rPr>
-        <w:t xml:space="preserve">sustainable competitive advantage</w:t>
-      </w:r>
-      <w:r>
-        <w:t xml:space="preserve">.</w:t>
-      </w:r>
-    </w:p>
-    <w:p>
-      <w:pPr>
-        <w:pStyle w:val="BodyText"/>
-      </w:pPr>
-      <w:r>
-        <w:rPr>
-          <w:bCs/>
-          <w:b/>
-        </w:rPr>
-        <w:t xml:space="preserve">Naskah bicara.</w:t>
-      </w:r>
-      <w:r>
-        <w:t xml:space="preserve"> </w:t>
-      </w:r>
-      <w:r>
-        <w:t xml:space="preserve">“</w:t>
-      </w:r>
-      <w:r>
-        <w:t xml:space="preserve">Strategi sebaik apa pun hanya setengah pekerjaan. Keunggulan yang bertahan lahir ketika orang, capability, dan struktur dibangun untuk menjalankan strategi lebih baik daripada pesaing. Ketiganya saling bergantung: orang membangun capability, capability menuntut struktur yang tepat, struktur menentukan bagaimana orang bekerja.</w:t>
-      </w:r>
-      <w:r>
-        <w:t xml:space="preserve">”</w:t>
-      </w:r>
-    </w:p>
-    <w:p>
-      <w:pPr>
-        <w:pStyle w:val="BodyText"/>
-      </w:pPr>
-      <w:r>
-        <w:rPr>
-          <w:bCs/>
-          <w:b/>
-        </w:rPr>
-        <w:t xml:space="preserve">Jembatan.</w:t>
-      </w:r>
-      <w:r>
-        <w:t xml:space="preserve"> </w:t>
-      </w:r>
-      <w:r>
-        <w:t xml:space="preserve">Bab 11 menggerakkan organisasi (tugas 4–8); Bab 12 menopangnya (tugas 9–10); kerangka 4DX (McChesney, Covey &amp; Huling) memberi disiplin eksekusi di tingkat tim:</w:t>
-      </w:r>
-      <w:r>
-        <w:t xml:space="preserve"> </w:t>
-      </w:r>
-      <w:r>
-        <w:rPr>
-          <w:iCs/>
-          <w:i/>
-        </w:rPr>
-        <w:t xml:space="preserve">focus on the wildly important</w:t>
-      </w:r>
-      <w:r>
-        <w:t xml:space="preserve">,</w:t>
-      </w:r>
-      <w:r>
-        <w:t xml:space="preserve"> </w:t>
-      </w:r>
-      <w:r>
-        <w:rPr>
-          <w:iCs/>
-          <w:i/>
-        </w:rPr>
-        <w:t xml:space="preserve">act on lead measures</w:t>
-      </w:r>
-      <w:r>
-        <w:t xml:space="preserve">,</w:t>
-      </w:r>
-      <w:r>
-        <w:t xml:space="preserve"> </w:t>
-      </w:r>
-      <w:r>
-        <w:rPr>
-          <w:iCs/>
-          <w:i/>
-        </w:rPr>
-        <w:t xml:space="preserve">keep a compelling scoreboard</w:t>
-      </w:r>
-      <w:r>
-        <w:t xml:space="preserve">,</w:t>
-      </w:r>
-      <w:r>
-        <w:t xml:space="preserve"> </w:t>
-      </w:r>
-      <w:r>
-        <w:rPr>
-          <w:iCs/>
-          <w:i/>
-        </w:rPr>
-        <w:t xml:space="preserve">create a cadence of accountability</w:t>
-      </w:r>
-      <w:r>
-        <w:t xml:space="preserve">. Katakan bahwa 4DX akan dibahas Kelompok 3 pada presentasi</w:t>
-      </w:r>
-      <w:r>
-        <w:t xml:space="preserve"> </w:t>
-      </w:r>
-      <w:r>
-        <w:rPr>
-          <w:iCs/>
-          <w:i/>
-        </w:rPr>
-        <w:t xml:space="preserve">framework</w:t>
-      </w:r>
-      <w:r>
-        <w:t xml:space="preserve">.</w:t>
-      </w:r>
-    </w:p>
-    <w:bookmarkEnd w:id="40"/>
-    <w:bookmarkStart w:id="41" w:name="slide-19-pertanyaan-untuk-diskusi-kelas"/>
-    <w:p>
-      <w:pPr>
-        <w:pStyle w:val="Heading2"/>
-      </w:pPr>
-      <w:r>
-        <w:t xml:space="preserve">Slide 19 — Pertanyaan untuk Diskusi Kelas</w:t>
+        <w:t xml:space="preserve">Slide 19. Bahan Renungan untuk Diskusi</w:t>
       </w:r>
     </w:p>
     <w:p>
@@ -5149,7 +5143,7 @@
           <w:bCs/>
           <w:b/>
         </w:rPr>
-        <w:t xml:space="preserve">Membeli capability (Gojek–Tokopedia, 2021).</w:t>
+        <w:t xml:space="preserve">Membeli capability (Gojek, Tokopedia, 2021).</w:t>
       </w:r>
       <w:r>
         <w:t xml:space="preserve"> </w:t>
@@ -5197,13 +5191,13 @@
       </w:r>
     </w:p>
     <w:bookmarkEnd w:id="41"/>
-    <w:bookmarkStart w:id="42" w:name="slide-20-daftar-referensi"/>
+    <w:bookmarkStart w:id="42" w:name="slide-20.-referensi"/>
     <w:p>
       <w:pPr>
         <w:pStyle w:val="Heading2"/>
       </w:pPr>
       <w:r>
-        <w:t xml:space="preserve">Slide 20 — Daftar Referensi</w:t>
+        <w:t xml:space="preserve">Slide 20. Referensi</w:t>
       </w:r>
     </w:p>
     <w:p>
@@ -5211,17 +5205,17 @@
         <w:pStyle w:val="FirstParagraph"/>
       </w:pPr>
       <w:r>
-        <w:t xml:space="preserve">Referensi utama adalah buku teks edisi 2024 (halaman 294–325) dan edisi 22 (2019) yang tercantum dalam silabus; sumber sekunder adalah rujukan yang dikutip bab tersebut.</w:t>
+        <w:t xml:space="preserve">Referensi utama adalah buku teks edisi 2024 (halaman 294 sampai 325) dan edisi 22 (2019) yang tercantum dalam silabus; sumber sekunder adalah rujukan yang dikutip bab tersebut.</w:t>
       </w:r>
     </w:p>
     <w:bookmarkEnd w:id="42"/>
-    <w:bookmarkStart w:id="43" w:name="slide-21-penutup"/>
+    <w:bookmarkStart w:id="43" w:name="slide-21.-penutup"/>
     <w:p>
       <w:pPr>
         <w:pStyle w:val="Heading2"/>
       </w:pPr>
       <w:r>
-        <w:t xml:space="preserve">Slide 21 — Penutup</w:t>
+        <w:t xml:space="preserve">Slide 21. Penutup</w:t>
       </w:r>
     </w:p>
     <w:p>
@@ -5641,7 +5635,7 @@
         <w:pStyle w:val="Compact"/>
       </w:pPr>
       <w:r>
-        <w:t xml:space="preserve">Seluruh konsep, angka, dan contoh pada slide bersumber dari Bab 10 buku Thompson, Peteraf, Gamble &amp; Strickland (2024), kecuali yang ditandai sebagai sintesis penyaji (baris trade-off pada slide 9) dan contoh Indonesia pada slide 19 yang diajukan sebagai pertanyaan, bukan klaim.</w:t>
+        <w:t xml:space="preserve">Seluruh konsep, angka, dan contoh pada slide bersumber dari Bab 10 buku Thompson, Peteraf, Gamble &amp; Strickland (2024), kecuali yang ditandai sebagai sintesis penyaji (label kecepatan dan kendali pada kartu slide 9) dan contoh Indonesia pada slide 19 yang diajukan sebagai pertanyaan, bukan klaim.</w:t>
       </w:r>
     </w:p>
     <w:p>

</xml_diff>

<commit_message>
Rebuild Chapter 10 deck on the reference layout system
Eight layout patterns cloned from the reference deck (banner with
overlaid title, tall right image with chips, lime vertical panel,
three-image row, numbered cards, row cards with image and title,
stat card with chart, two-image conclusion). Color high-key photos
without filters, Outfit typography, gray E8E8E8 cards with large radius.
Outfit font files included for installation.

Co-Authored-By: Claude Fable 5.1 <noreply@anthropic.com>
Claude-Session: https://claude.ai/code/session_01Ljehy9D2DPqSYfPX6Gsiea
</commit_message>
<xml_diff>
--- a/presentasi_ch10_kelompok3/SMJKT_Group 3_Aslih_Materi Pemahaman Chapter 10.docx
+++ b/presentasi_ch10_kelompok3/SMJKT_Group 3_Aslih_Materi Pemahaman Chapter 10.docx
@@ -402,7 +402,7 @@
         <w:t xml:space="preserve"> </w:t>
       </w:r>
       <w:r>
-        <w:t xml:space="preserve">Palet dan tipografi disamakan dengan deck referensi: latar F4F4F4, lime D4FC00, hitam 141417, font Inter. Inter adalah font gratis (Google Fonts). Bila belum terpasang di komputer presentasi, PowerPoint akan mengganti dengan font sistem; pasang Inter agar tampilan sama persis dengan PDF. Foto bersifat ilustratif, dibuat khusus dan diproses monokrom; gambar kerangka buku digambar ulang sebagai objek PowerPoint yang dapat diedit.</w:t>
+        <w:t xml:space="preserve">Palet dan tipografi disamakan dengan deck referensi: latar F4F4F4, kartu abu E8E8E8, lime D4FC00, hitam 141417, font Outfit (judul memakai Outfit Medium). Outfit adalah font gratis dari Google Fonts; pasang di komputer presentasi agar tampilan PPTX sama persis dengan PDF, karena tanpa itu PowerPoint mengganti dengan font sistem. Foto bersifat ilustratif berwarna dengan nuansa putih dan abu terang, dibuat khusus tanpa filter; gambar kerangka buku digambar ulang sebagai objek PowerPoint yang dapat diedit.</w:t>
       </w:r>
     </w:p>
     <w:p>
@@ -937,7 +937,7 @@
         <w:t xml:space="preserve"> </w:t>
       </w:r>
       <w:r>
-        <w:t xml:space="preserve">slide yang boleh dilewati tanpa memutus logika adalah 4 (statistik), 8 (praktik rekrutmen), 11 (M&amp;A dan kemitraan), dan 17 (koordinasi). Slide 5, 6, 9, 13, 18 adalah tulang punggung dan tidak boleh dilewati.</w:t>
+        <w:t xml:space="preserve">slide yang boleh dilewati tanpa memutus logika adalah 4 (statistik), 8 (praktik rekrutmen), 11 (M&amp;A dan kemitraan), dan 17 (koordinasi). Slide 5, 6, 9, 13, dan 18 adalah tulang punggung dan tidak boleh dilewati.</w:t>
       </w:r>
     </w:p>
     <w:bookmarkEnd w:id="20"/>
@@ -1880,13 +1880,13 @@
       </w:r>
     </w:p>
     <w:bookmarkEnd w:id="26"/>
-    <w:bookmarkStart w:id="27" w:name="X70993ef7c6ffb69573361c8fd5b4f3422ffb464"/>
+    <w:bookmarkStart w:id="27" w:name="Xeaa72b851b9b76931f31a697843d05d631c7073"/>
     <w:p>
       <w:pPr>
         <w:pStyle w:val="Heading2"/>
       </w:pPr>
       <w:r>
-        <w:t xml:space="preserve">Slide 5. Sepuluh Tugas dalam Strategy Execution (Figure 10.1, digambar ulang)</w:t>
+        <w:t xml:space="preserve">Slide 5. Sepuluh Tugas Eksekusi (Figure 10.1, digambar ulang)</w:t>
       </w:r>
     </w:p>
     <w:p>
@@ -3072,13 +3072,13 @@
       </w:r>
     </w:p>
     <w:bookmarkEnd w:id="31"/>
-    <w:bookmarkStart w:id="32" w:name="X1a0709f97208638886053c934ad8d36e3105f69"/>
+    <w:bookmarkStart w:id="32" w:name="slide-10.-capability-tumbuh-bertahap"/>
     <w:p>
       <w:pPr>
         <w:pStyle w:val="Heading2"/>
       </w:pPr>
       <w:r>
-        <w:t xml:space="preserve">Slide 10. Capability Tumbuh Bertahap, Tidak Dibeli Semalam</w:t>
+        <w:t xml:space="preserve">Slide 10. Capability Tumbuh Bertahap</w:t>
       </w:r>
     </w:p>
     <w:p>
@@ -3849,7 +3849,7 @@
         <w:pStyle w:val="Heading2"/>
       </w:pPr>
       <w:r>
-        <w:t xml:space="preserve">Slide 14. Dikerjakan Sendiri atau Di-outsource? (IC 10.4, Apple)</w:t>
+        <w:t xml:space="preserve">Slide 14. Dikerjakan Sendiri atau Di-outsource (IC 10.4, Apple)</w:t>
       </w:r>
     </w:p>
     <w:p>
@@ -4399,13 +4399,13 @@
       </w:r>
     </w:p>
     <w:bookmarkEnd w:id="37"/>
-    <w:bookmarkStart w:id="38" w:name="X499e938d3c5905c94810937a5bd6889ebd17a6e"/>
+    <w:bookmarkStart w:id="38" w:name="Xeec270689e84a98b35880e27b315c57dae1da56"/>
     <w:p>
       <w:pPr>
         <w:pStyle w:val="Heading2"/>
       </w:pPr>
       <w:r>
-        <w:t xml:space="preserve">Slide 16. Memusatkan atau Mendelegasikan Keputusan? (Table 10.1, digambar ulang)</w:t>
+        <w:t xml:space="preserve">Slide 16. Memusatkan atau Mendelegasikan Keputusan (Table 10.1, dipadatkan)</w:t>
       </w:r>
     </w:p>
     <w:p>
@@ -4892,13 +4892,13 @@
       </w:r>
     </w:p>
     <w:bookmarkEnd w:id="39"/>
-    <w:bookmarkStart w:id="40" w:name="Xf0df7708b1f2590a8efcd3636918beccbd8673d"/>
+    <w:bookmarkStart w:id="40" w:name="X512cd0d35aeb9cb74d7b00de2bfab6126c06aa3"/>
     <w:p>
       <w:pPr>
         <w:pStyle w:val="Heading2"/>
       </w:pPr>
       <w:r>
-        <w:t xml:space="preserve">Slide 18. Sintesis: Organisasi yang Mampu Mengeksekusi</w:t>
+        <w:t xml:space="preserve">Slide 18. Organisasi yang Mampu Mengeksekusi (Sintesis)</w:t>
       </w:r>
     </w:p>
     <w:p>
@@ -5056,13 +5056,13 @@
       </w:r>
     </w:p>
     <w:bookmarkEnd w:id="40"/>
-    <w:bookmarkStart w:id="41" w:name="slide-19.-bahan-renungan-untuk-diskusi"/>
+    <w:bookmarkStart w:id="41" w:name="slide-19.-bahan-renungan"/>
     <w:p>
       <w:pPr>
         <w:pStyle w:val="Heading2"/>
       </w:pPr>
       <w:r>
-        <w:t xml:space="preserve">Slide 19. Bahan Renungan untuk Diskusi</w:t>
+        <w:t xml:space="preserve">Slide 19. Bahan Renungan</w:t>
       </w:r>
     </w:p>
     <w:p>

</xml_diff>

<commit_message>
Audit pass: projector-legible type and content corrections
Body text raised to 13.5-14 pt, labels 12 pt, darker text color after a
projector-legibility audit (92 percent of text was under 12 pt). Content
audit fixes: Meta figure stated as more than US$25 billion, Chandler
attribution moved to the structure definition, capability path described
as two stages per the book, Table 10.1 basic tenets restored, matrix
structure wording corrected, knowledge-based and collaborative-advantage
closing line added, references cleaned. Study guide synchronized.

Co-Authored-By: Claude Fable 5.1 <noreply@anthropic.com>
Claude-Session: https://claude.ai/code/session_01Ljehy9D2DPqSYfPX6Gsiea
</commit_message>
<xml_diff>
--- a/presentasi_ch10_kelompok3/SMJKT_Group 3_Aslih_Materi Pemahaman Chapter 10.docx
+++ b/presentasi_ch10_kelompok3/SMJKT_Group 3_Aslih_Materi Pemahaman Chapter 10.docx
@@ -385,6 +385,24 @@
       </w:r>
       <w:r>
         <w:t xml:space="preserve">singkat yang dapat dibaca presenter. Istilah teori dipertahankan dalam bahasa Inggris sesuai buku; penjelasan menggunakan bahasa Indonesia.</w:t>
+      </w:r>
+    </w:p>
+    <w:p>
+      <w:pPr>
+        <w:pStyle w:val="BodyText"/>
+      </w:pPr>
+      <w:r>
+        <w:rPr>
+          <w:bCs/>
+          <w:b/>
+        </w:rPr>
+        <w:t xml:space="preserve">Keterbacaan di proyektor.</w:t>
+      </w:r>
+      <w:r>
+        <w:t xml:space="preserve"> </w:t>
+      </w:r>
+      <w:r>
+        <w:t xml:space="preserve">Teks isi slide berukuran 13,5 sampai 14 pt, label 12 pt, judul 30 sampai 38 pt, dengan warna teks gelap berkontras tinggi. Di layar selebar 2,4 m, teks 14 pt terbaca nyaman sampai sekitar 5 m dan judul sampai lebih dari 10 m; untuk kelas yang lebih dalam, andalkan judul dan angka besar, dan pastikan kecerahan proyektor cukup. Header kecil dan baris sumber (8,5 sampai 9,5 pt) adalah metadata, bukan bahan baca.</w:t>
       </w:r>
     </w:p>
     <w:p>
@@ -937,7 +955,7 @@
         <w:t xml:space="preserve"> </w:t>
       </w:r>
       <w:r>
-        <w:t xml:space="preserve">slide yang boleh dilewati tanpa memutus logika adalah 4 (statistik), 8 (praktik rekrutmen), 11 (M&amp;A dan kemitraan), dan 17 (koordinasi). Slide 5, 6, 9, 13, dan 18 adalah tulang punggung dan tidak boleh dilewati.</w:t>
+        <w:t xml:space="preserve">lewati slide 4 (statistik) dan 10 (jalur internal), dan gabungkan penjelasan slide 5 dan 6. Jangan melewati slide 8 (separuh aksi 1) atau 17 (keputusan 4 dan 5). Slide 18 adalah titik lompat bila diminta langsung ke kesimpulan.</w:t>
       </w:r>
     </w:p>
     <w:bookmarkEnd w:id="20"/>
@@ -3072,13 +3090,13 @@
       </w:r>
     </w:p>
     <w:bookmarkEnd w:id="31"/>
-    <w:bookmarkStart w:id="32" w:name="slide-10.-capability-tumbuh-bertahap"/>
+    <w:bookmarkStart w:id="32" w:name="X4f96cff5cea9c582ff99ff56546ef90f420707e"/>
     <w:p>
       <w:pPr>
         <w:pStyle w:val="Heading2"/>
       </w:pPr>
       <w:r>
-        <w:t xml:space="preserve">Slide 10. Capability Tumbuh Bertahap</w:t>
+        <w:t xml:space="preserve">Slide 10. Capability Tumbuh Bertahap (dua tahap menurut buku, lalu dijaga)</w:t>
       </w:r>
     </w:p>
     <w:p>
@@ -3096,7 +3114,7 @@
         <w:t xml:space="preserve"> </w:t>
       </w:r>
       <w:r>
-        <w:t xml:space="preserve">Capability tumbuh bertahap:</w:t>
+        <w:t xml:space="preserve">Buku menamai dua tahap:</w:t>
       </w:r>
       <w:r>
         <w:t xml:space="preserve"> </w:t>
@@ -3112,7 +3130,7 @@
         <w:t xml:space="preserve"> </w:t>
       </w:r>
       <w:r>
-        <w:t xml:space="preserve">→</w:t>
+        <w:t xml:space="preserve">yang belum sempurna menjadi</w:t>
       </w:r>
       <w:r>
         <w:t xml:space="preserve"> </w:t>
@@ -3125,10 +3143,17 @@
         <w:t xml:space="preserve">tried-and-true competence</w:t>
       </w:r>
       <w:r>
-        <w:t xml:space="preserve"> </w:t>
-      </w:r>
-      <w:r>
-        <w:t xml:space="preserve">→ capability yang terus disegarkan.</w:t>
+        <w:t xml:space="preserve">; setelah itu capability harus dijaga dan diperbarui (</w:t>
+      </w:r>
+      <w:r>
+        <w:rPr>
+          <w:iCs/>
+          <w:i/>
+        </w:rPr>
+        <w:t xml:space="preserve">dynamic capability</w:t>
+      </w:r>
+      <w:r>
+        <w:t xml:space="preserve">, Bab 4). Batang ketiga pada grafik slide adalah fase penjagaan itu, bukan tahap ketiga versi buku; katakan demikian bila ditanya.</w:t>
       </w:r>
     </w:p>
     <w:p>
@@ -3753,20 +3778,25 @@
         <w:t xml:space="preserve"> </w:t>
       </w:r>
       <w:r>
-        <w:t xml:space="preserve">(buku mengutip Chandler, 1962,</w:t>
-      </w:r>
-      <w:r>
-        <w:t xml:space="preserve"> </w:t>
-      </w:r>
-      <w:r>
-        <w:rPr>
-          <w:iCs/>
-          <w:i/>
-        </w:rPr>
-        <w:t xml:space="preserve">Strategy and Structure</w:t>
-      </w:r>
-      <w:r>
-        <w:t xml:space="preserve">). Lima keputusan penataan kerja: (1) aktivitas mana internal dan mana</w:t>
+        <w:t xml:space="preserve">dan untuk definisi ini buku merujuk Chandler (1962). Frasa</w:t>
+      </w:r>
+      <w:r>
+        <w:t xml:space="preserve"> </w:t>
+      </w:r>
+      <w:r>
+        <w:t xml:space="preserve">“</w:t>
+      </w:r>
+      <w:r>
+        <w:t xml:space="preserve">struktur mengikuti strategi</w:t>
+      </w:r>
+      <w:r>
+        <w:t xml:space="preserve">”</w:t>
+      </w:r>
+      <w:r>
+        <w:t xml:space="preserve"> </w:t>
+      </w:r>
+      <w:r>
+        <w:t xml:space="preserve">pada judul slide adalah ringkasan penyaji atas aturan baku bab, bukan kutipan. Lima keputusan penataan kerja: (1) aktivitas mana internal dan mana</w:t>
       </w:r>
       <w:r>
         <w:t xml:space="preserve"> </w:t>
@@ -4970,6 +5000,149 @@
       </w:r>
       <w:r>
         <w:t xml:space="preserve">”</w:t>
+      </w:r>
+    </w:p>
+    <w:p>
+      <w:pPr>
+        <w:pStyle w:val="BodyText"/>
+      </w:pPr>
+      <w:r>
+        <w:rPr>
+          <w:bCs/>
+          <w:b/>
+        </w:rPr>
+        <w:t xml:space="preserve">Narasi penutup ala Pak Rangga.</w:t>
+      </w:r>
+      <w:r>
+        <w:t xml:space="preserve"> </w:t>
+      </w:r>
+      <w:r>
+        <w:t xml:space="preserve">Capability yang</w:t>
+      </w:r>
+      <w:r>
+        <w:t xml:space="preserve"> </w:t>
+      </w:r>
+      <w:r>
+        <w:rPr>
+          <w:iCs/>
+          <w:i/>
+        </w:rPr>
+        <w:t xml:space="preserve">tacit</w:t>
+      </w:r>
+      <w:r>
+        <w:t xml:space="preserve"> </w:t>
+      </w:r>
+      <w:r>
+        <w:t xml:space="preserve">dan</w:t>
+      </w:r>
+      <w:r>
+        <w:t xml:space="preserve"> </w:t>
+      </w:r>
+      <w:r>
+        <w:rPr>
+          <w:iCs/>
+          <w:i/>
+        </w:rPr>
+        <w:t xml:space="preserve">socially complex</w:t>
+      </w:r>
+      <w:r>
+        <w:t xml:space="preserve"> </w:t>
+      </w:r>
+      <w:r>
+        <w:t xml:space="preserve">adalah pengetahuan yang sulit ditiru (pergeseran dari</w:t>
+      </w:r>
+      <w:r>
+        <w:t xml:space="preserve"> </w:t>
+      </w:r>
+      <w:r>
+        <w:rPr>
+          <w:iCs/>
+          <w:i/>
+        </w:rPr>
+        <w:t xml:space="preserve">resource-based</w:t>
+      </w:r>
+      <w:r>
+        <w:t xml:space="preserve"> </w:t>
+      </w:r>
+      <w:r>
+        <w:t xml:space="preserve">ke</w:t>
+      </w:r>
+      <w:r>
+        <w:t xml:space="preserve"> </w:t>
+      </w:r>
+      <w:r>
+        <w:rPr>
+          <w:iCs/>
+          <w:i/>
+        </w:rPr>
+        <w:t xml:space="preserve">knowledge-based</w:t>
+      </w:r>
+      <w:r>
+        <w:t xml:space="preserve">);</w:t>
+      </w:r>
+      <w:r>
+        <w:t xml:space="preserve"> </w:t>
+      </w:r>
+      <w:r>
+        <w:rPr>
+          <w:iCs/>
+          <w:i/>
+        </w:rPr>
+        <w:t xml:space="preserve">network</w:t>
+      </w:r>
+      <w:r>
+        <w:t xml:space="preserve"> </w:t>
+      </w:r>
+      <w:r>
+        <w:t xml:space="preserve">dan</w:t>
+      </w:r>
+      <w:r>
+        <w:t xml:space="preserve"> </w:t>
+      </w:r>
+      <w:r>
+        <w:rPr>
+          <w:iCs/>
+          <w:i/>
+        </w:rPr>
+        <w:t xml:space="preserve">ecosystem</w:t>
+      </w:r>
+      <w:r>
+        <w:t xml:space="preserve"> </w:t>
+      </w:r>
+      <w:r>
+        <w:t xml:space="preserve">menggeser</w:t>
+      </w:r>
+      <w:r>
+        <w:t xml:space="preserve"> </w:t>
+      </w:r>
+      <w:r>
+        <w:rPr>
+          <w:iCs/>
+          <w:i/>
+        </w:rPr>
+        <w:t xml:space="preserve">competitive advantage</w:t>
+      </w:r>
+      <w:r>
+        <w:t xml:space="preserve"> </w:t>
+      </w:r>
+      <w:r>
+        <w:t xml:space="preserve">menuju</w:t>
+      </w:r>
+      <w:r>
+        <w:t xml:space="preserve"> </w:t>
+      </w:r>
+      <w:r>
+        <w:rPr>
+          <w:iCs/>
+          <w:i/>
+        </w:rPr>
+        <w:t xml:space="preserve">collaborative advantage</w:t>
+      </w:r>
+      <w:r>
+        <w:t xml:space="preserve"> </w:t>
+      </w:r>
+      <w:r>
+        <w:t xml:space="preserve">(Kanter, 1994, dikutip bab sebagai catatan akhir 27).</w:t>
       </w:r>
     </w:p>
     <w:p>
@@ -5205,7 +5378,7 @@
         <w:pStyle w:val="FirstParagraph"/>
       </w:pPr>
       <w:r>
-        <w:t xml:space="preserve">Referensi utama adalah buku teks edisi 2024 (halaman 294 sampai 325) dan edisi 22 (2019) yang tercantum dalam silabus; sumber sekunder adalah rujukan yang dikutip bab tersebut.</w:t>
+        <w:t xml:space="preserve">Referensi utama adalah buku teks edisi 2024 (halaman 294 sampai 325) dan buku acuan silabus (edisi 22, 2019). Chandler, Sull dkk., Collins, Helfat dan Peteraf, Simons, serta Kanter adalah rujukan yang dikutip bab; McChesney dkk. adalah sumber kerangka 4DX.</w:t>
       </w:r>
     </w:p>
     <w:bookmarkEnd w:id="42"/>

</xml_diff>

<commit_message>
Raise body type to 18 pt for back-row legibility; drop discussion and reference slides
Deck is now 19 slides. Body text 16-18 pt, labels 13-14 pt, copy cut
to fit. Discussion questions kept in the study guide as Q&A prep.

Co-Authored-By: Claude Fable 5.1 <noreply@anthropic.com>
Claude-Session: https://claude.ai/code/session_01Ljehy9D2DPqSYfPX6Gsiea
</commit_message>
<xml_diff>
--- a/presentasi_ch10_kelompok3/SMJKT_Group 3_Aslih_Materi Pemahaman Chapter 10.docx
+++ b/presentasi_ch10_kelompok3/SMJKT_Group 3_Aslih_Materi Pemahaman Chapter 10.docx
@@ -288,7 +288,7 @@
         <w:pStyle w:val="FirstParagraph"/>
       </w:pPr>
       <w:r>
-        <w:t xml:space="preserve">Dokumen ini mendampingi deck 21 slide. Setiap slide diuraikan dalam empat lapis:</w:t>
+        <w:t xml:space="preserve">Dokumen ini mendampingi deck 19 slide (slide bahan renungan dan referensi dihapus atas permintaan; pertanyaan diskusinya tetap dipakai sebagai persiapan tanya jawab di Bagian C akhir). Setiap slide diuraikan dalam empat lapis:</w:t>
       </w:r>
       <w:r>
         <w:t xml:space="preserve"> </w:t>
@@ -396,13 +396,13 @@
           <w:bCs/>
           <w:b/>
         </w:rPr>
-        <w:t xml:space="preserve">Keterbacaan di proyektor.</w:t>
-      </w:r>
-      <w:r>
-        <w:t xml:space="preserve"> </w:t>
-      </w:r>
-      <w:r>
-        <w:t xml:space="preserve">Teks isi slide berukuran 13,5 sampai 14 pt, label 12 pt, judul 30 sampai 38 pt, dengan warna teks gelap berkontras tinggi. Di layar selebar 2,4 m, teks 14 pt terbaca nyaman sampai sekitar 5 m dan judul sampai lebih dari 10 m; untuk kelas yang lebih dalam, andalkan judul dan angka besar, dan pastikan kecerahan proyektor cukup. Header kecil dan baris sumber (8,5 sampai 9,5 pt) adalah metadata, bukan bahan baca.</w:t>
+        <w:t xml:space="preserve">Keterbacaan di proyektor (hasil audit terukur).</w:t>
+      </w:r>
+      <w:r>
+        <w:t xml:space="preserve"> </w:t>
+      </w:r>
+      <w:r>
+        <w:t xml:space="preserve">Teks isi 16 sampai 18 pt, label kategori 13 sampai 14 pt, angka besar 24 sampai 34 pt, judul 28 sampai 38 pt, semua dengan kontras di atas 12:1. Pada layar selebar 2,4 m: teks 18 pt terbaca nyaman sampai sekitar 6,3 m dan masih terbaca sampai 7,9 m; label 14 pt sampai 4,9 m dan 6,1 m; judul 32 pt sampai lebih dari 11 m. Untuk ruang yang lebih dalam dari 8 m, penonton paling belakang mengandalkan judul, angka besar, dan narasi presenter. Header dan baris sumber (9 sampai 10,5 pt) adalah metadata, bukan bahan baca.</w:t>
       </w:r>
     </w:p>
     <w:p>
@@ -898,7 +898,7 @@
               <w:jc w:val="left"/>
             </w:pPr>
             <w:r>
-              <w:t xml:space="preserve">Sintesis, Bahan Renungan, Penutup</w:t>
+              <w:t xml:space="preserve">Sintesis dan Penutup</w:t>
             </w:r>
           </w:p>
         </w:tc>
@@ -910,7 +910,7 @@
               <w:jc w:val="left"/>
             </w:pPr>
             <w:r>
-              <w:t xml:space="preserve">18 sampai 21</w:t>
+              <w:t xml:space="preserve">18 sampai 19</w:t>
             </w:r>
           </w:p>
         </w:tc>
@@ -5229,13 +5229,13 @@
       </w:r>
     </w:p>
     <w:bookmarkEnd w:id="40"/>
-    <w:bookmarkStart w:id="41" w:name="slide-19.-bahan-renungan"/>
+    <w:bookmarkStart w:id="41" w:name="slide-19.-penutup"/>
     <w:p>
       <w:pPr>
         <w:pStyle w:val="Heading2"/>
       </w:pPr>
       <w:r>
-        <w:t xml:space="preserve">Slide 19. Bahan Renungan</w:t>
+        <w:t xml:space="preserve">Slide 19. Penutup</w:t>
       </w:r>
     </w:p>
     <w:p>
@@ -5243,7 +5243,25 @@
         <w:pStyle w:val="FirstParagraph"/>
       </w:pPr>
       <w:r>
-        <w:t xml:space="preserve">Empat pertanyaan dirancang bergaya sokratik, masing-masing menguji satu klaim bab. Jawaban pegangan presenter:</w:t>
+        <w:t xml:space="preserve">Hanya ucapan terima kasih, tanpa teks lain, sesuai permintaan.</w:t>
+      </w:r>
+    </w:p>
+    <w:bookmarkEnd w:id="41"/>
+    <w:bookmarkStart w:id="42" w:name="X57d30e36735e5bb79267f8dbbf8bf0b68e48f58"/>
+    <w:p>
+      <w:pPr>
+        <w:pStyle w:val="Heading2"/>
+      </w:pPr>
+      <w:r>
+        <w:t xml:space="preserve">Persiapan Tanya Jawab (bekas slide bahan renungan)</w:t>
+      </w:r>
+    </w:p>
+    <w:p>
+      <w:pPr>
+        <w:pStyle w:val="FirstParagraph"/>
+      </w:pPr>
+      <w:r>
+        <w:t xml:space="preserve">Empat pertanyaan ini tidak lagi ditayangkan, tetapi kemungkinan besar muncul dalam diskusi. Pegangan jawaban:</w:t>
       </w:r>
     </w:p>
     <w:p>
@@ -5363,14 +5381,14 @@
         <w:t xml:space="preserve">Sentralisasi unggul saat krisis yang menuntut respons seragam dan cepat; desentralisasi unggul saat pengetahuan relevan berada di lini depan dan inovasi dibutuhkan; kendali dijaga melalui lima mekanisme Table 10.1.</w:t>
       </w:r>
     </w:p>
-    <w:bookmarkEnd w:id="41"/>
-    <w:bookmarkStart w:id="42" w:name="slide-20.-referensi"/>
+    <w:bookmarkEnd w:id="42"/>
+    <w:bookmarkStart w:id="43" w:name="catatan-referensi"/>
     <w:p>
       <w:pPr>
         <w:pStyle w:val="Heading2"/>
       </w:pPr>
       <w:r>
-        <w:t xml:space="preserve">Slide 20. Referensi</w:t>
+        <w:t xml:space="preserve">Catatan Referensi</w:t>
       </w:r>
     </w:p>
     <w:p>
@@ -5379,24 +5397,6 @@
       </w:pPr>
       <w:r>
         <w:t xml:space="preserve">Referensi utama adalah buku teks edisi 2024 (halaman 294 sampai 325) dan buku acuan silabus (edisi 22, 2019). Chandler, Sull dkk., Collins, Helfat dan Peteraf, Simons, serta Kanter adalah rujukan yang dikutip bab; McChesney dkk. adalah sumber kerangka 4DX.</w:t>
-      </w:r>
-    </w:p>
-    <w:bookmarkEnd w:id="42"/>
-    <w:bookmarkStart w:id="43" w:name="slide-21.-penutup"/>
-    <w:p>
-      <w:pPr>
-        <w:pStyle w:val="Heading2"/>
-      </w:pPr>
-      <w:r>
-        <w:t xml:space="preserve">Slide 21. Penutup</w:t>
-      </w:r>
-    </w:p>
-    <w:p>
-      <w:pPr>
-        <w:pStyle w:val="FirstParagraph"/>
-      </w:pPr>
-      <w:r>
-        <w:t xml:space="preserve">Hanya ucapan terima kasih, tanpa teks lain, sesuai permintaan.</w:t>
       </w:r>
     </w:p>
     <w:bookmarkEnd w:id="43"/>

</xml_diff>

<commit_message>
Add whitespace at the same type sizes; add framework map slide
Shorter copy per block, 1.2 line spacing, wider card gaps and padding.
New slide 3 maps all Chapter 10 frameworks to the slides that cover them.
Deck is 20 slides; study guide renumbered.

Co-Authored-By: Claude Fable 5.1 <noreply@anthropic.com>
Claude-Session: https://claude.ai/code/session_01Ljehy9D2DPqSYfPX6Gsiea
</commit_message>
<xml_diff>
--- a/presentasi_ch10_kelompok3/SMJKT_Group 3_Aslih_Materi Pemahaman Chapter 10.docx
+++ b/presentasi_ch10_kelompok3/SMJKT_Group 3_Aslih_Materi Pemahaman Chapter 10.docx
@@ -288,7 +288,7 @@
         <w:pStyle w:val="FirstParagraph"/>
       </w:pPr>
       <w:r>
-        <w:t xml:space="preserve">Dokumen ini mendampingi deck 19 slide (slide bahan renungan dan referensi dihapus atas permintaan; pertanyaan diskusinya tetap dipakai sebagai persiapan tanya jawab di Bagian C akhir). Setiap slide diuraikan dalam empat lapis:</w:t>
+        <w:t xml:space="preserve">Dokumen ini mendampingi deck 20 slide (slide bahan renungan dan referensi dihapus atas permintaan; pertanyaan diskusinya tetap dipakai sebagai persiapan tanya jawab di Bagian C akhir). Setiap slide diuraikan dalam empat lapis:</w:t>
       </w:r>
       <w:r>
         <w:t xml:space="preserve"> </w:t>
@@ -710,7 +710,7 @@
               <w:jc w:val="left"/>
             </w:pPr>
             <w:r>
-              <w:t xml:space="preserve">1 sampai 6</w:t>
+              <w:t xml:space="preserve">1 sampai 7</w:t>
             </w:r>
           </w:p>
         </w:tc>
@@ -760,7 +760,7 @@
               <w:jc w:val="left"/>
             </w:pPr>
             <w:r>
-              <w:t xml:space="preserve">7 sampai 8</w:t>
+              <w:t xml:space="preserve">8 sampai 9</w:t>
             </w:r>
           </w:p>
         </w:tc>
@@ -810,7 +810,7 @@
               <w:jc w:val="left"/>
             </w:pPr>
             <w:r>
-              <w:t xml:space="preserve">9 sampai 12</w:t>
+              <w:t xml:space="preserve">10 sampai 13</w:t>
             </w:r>
           </w:p>
         </w:tc>
@@ -860,7 +860,7 @@
               <w:jc w:val="left"/>
             </w:pPr>
             <w:r>
-              <w:t xml:space="preserve">13 sampai 17</w:t>
+              <w:t xml:space="preserve">14 sampai 18</w:t>
             </w:r>
           </w:p>
         </w:tc>
@@ -910,7 +910,7 @@
               <w:jc w:val="left"/>
             </w:pPr>
             <w:r>
-              <w:t xml:space="preserve">18 sampai 19</w:t>
+              <w:t xml:space="preserve">19 sampai 20</w:t>
             </w:r>
           </w:p>
         </w:tc>
@@ -955,7 +955,7 @@
         <w:t xml:space="preserve"> </w:t>
       </w:r>
       <w:r>
-        <w:t xml:space="preserve">lewati slide 4 (statistik) dan 10 (jalur internal), dan gabungkan penjelasan slide 5 dan 6. Jangan melewati slide 8 (separuh aksi 1) atau 17 (keputusan 4 dan 5). Slide 18 adalah titik lompat bila diminta langsung ke kesimpulan.</w:t>
+        <w:t xml:space="preserve">lewati slide 5 (statistik) dan 11 (jalur internal), dan gabungkan penjelasan slide 6 dan 7. Jangan melewati slide 9 (separuh aksi 1) atau 18 (keputusan 4 dan 5). Slide 19 adalah titik lompat bila diminta langsung ke kesimpulan.</w:t>
       </w:r>
     </w:p>
     <w:bookmarkEnd w:id="20"/>
@@ -1307,7 +1307,7 @@
       </w:r>
     </w:p>
     <w:bookmarkEnd w:id="22"/>
-    <w:bookmarkStart w:id="44" w:name="bagian-c.-uraian-per-slide"/>
+    <w:bookmarkStart w:id="45" w:name="bagian-c.-uraian-per-slide"/>
     <w:p>
       <w:pPr>
         <w:pStyle w:val="Heading1"/>
@@ -1440,13 +1440,13 @@
       </w:r>
     </w:p>
     <w:bookmarkEnd w:id="24"/>
-    <w:bookmarkStart w:id="25" w:name="X2b7f4e7e7dc5a9e95f35629e72b27406c9cbb7a"/>
+    <w:bookmarkStart w:id="25" w:name="slide-3.-kerangka-yang-dipakai-bab-10"/>
     <w:p>
       <w:pPr>
         <w:pStyle w:val="Heading2"/>
       </w:pPr>
       <w:r>
-        <w:t xml:space="preserve">Slide 3. Dari Merumuskan ke Mengeksekusi Strategi</w:t>
+        <w:t xml:space="preserve">Slide 3. Kerangka yang Dipakai Bab 10</w:t>
       </w:r>
     </w:p>
     <w:p>
@@ -1464,6 +1464,58 @@
         <w:t xml:space="preserve"> </w:t>
       </w:r>
       <w:r>
+        <w:t xml:space="preserve">Peta kerangka bab, ditampilkan di depan karena Pak Rangga meminta kerangka dibahas lebih dulu. Empat kerangka bergambar: Figure 10.1 (sepuluh tugas, slide 6), Figure 10.2 (tiga aksi kunci, slide 7), Figure 10.3 (lima keputusan struktur, slide 14), Table 10.1 (centralized vs decentralized, slide 17). Empat taksonomi: tiga jalan membangun capability (slide 10), empat tipe struktur (slide 16), tiga jalur kemitraan (slide 12), dua tanda eksekusi yang baik (slide 5).</w:t>
+      </w:r>
+    </w:p>
+    <w:p>
+      <w:pPr>
+        <w:pStyle w:val="BodyText"/>
+      </w:pPr>
+      <w:r>
+        <w:rPr>
+          <w:bCs/>
+          <w:b/>
+        </w:rPr>
+        <w:t xml:space="preserve">Naskah bicara.</w:t>
+      </w:r>
+      <w:r>
+        <w:t xml:space="preserve"> </w:t>
+      </w:r>
+      <w:r>
+        <w:t xml:space="preserve">“</w:t>
+      </w:r>
+      <w:r>
+        <w:t xml:space="preserve">Bab ini memakai empat kerangka bergambar dan empat taksonomi. Kami akan melewati semuanya dalam urutan buku, dari kerangka ke contoh.</w:t>
+      </w:r>
+      <w:r>
+        <w:t xml:space="preserve">”</w:t>
+      </w:r>
+    </w:p>
+    <w:bookmarkEnd w:id="25"/>
+    <w:bookmarkStart w:id="26" w:name="Xd5b75c90721b05d34d375a35cd2c1aa0a360b35"/>
+    <w:p>
+      <w:pPr>
+        <w:pStyle w:val="Heading2"/>
+      </w:pPr>
+      <w:r>
+        <w:t xml:space="preserve">Slide 4. Dari Merumuskan ke Mengeksekusi Strategi</w:t>
+      </w:r>
+    </w:p>
+    <w:p>
+      <w:pPr>
+        <w:pStyle w:val="FirstParagraph"/>
+      </w:pPr>
+      <w:r>
+        <w:rPr>
+          <w:bCs/>
+          <w:b/>
+        </w:rPr>
+        <w:t xml:space="preserve">Inti pesan.</w:t>
+      </w:r>
+      <w:r>
+        <w:t xml:space="preserve"> </w:t>
+      </w:r>
+      <w:r>
         <w:t xml:space="preserve">Eksekusi menuntut keterampilan manajerial yang berbeda dari perumusan.</w:t>
       </w:r>
     </w:p>
@@ -1656,14 +1708,14 @@
         <w:t xml:space="preserve">”</w:t>
       </w:r>
     </w:p>
-    <w:bookmarkEnd w:id="25"/>
-    <w:bookmarkStart w:id="26" w:name="X032d8ec44bc24e0fc1bf1ff3532f39dab6ac470"/>
+    <w:bookmarkEnd w:id="26"/>
+    <w:bookmarkStart w:id="27" w:name="Xaf0da2d95e900388c1a33618f9c7daa2e8d72c0"/>
     <w:p>
       <w:pPr>
         <w:pStyle w:val="Heading2"/>
       </w:pPr>
       <w:r>
-        <w:t xml:space="preserve">Slide 4. Eksekusi adalah Ujian yang Sesungguhnya</w:t>
+        <w:t xml:space="preserve">Slide 5. Eksekusi adalah Ujian yang Sesungguhnya</w:t>
       </w:r>
     </w:p>
     <w:p>
@@ -1897,14 +1949,14 @@
         <w:t xml:space="preserve">Jawab: periksa tanda kedua. Bila aktivitas kritis sudah dijalankan dengan mahir namun target tetap meleset, masalah ada pada strategi; bila aktivitas kritis belum mahir, masalah ada pada eksekusi.</w:t>
       </w:r>
     </w:p>
-    <w:bookmarkEnd w:id="26"/>
-    <w:bookmarkStart w:id="27" w:name="Xeaa72b851b9b76931f31a697843d05d631c7073"/>
+    <w:bookmarkEnd w:id="27"/>
+    <w:bookmarkStart w:id="28" w:name="Xaae1eb91d723edba7c6e343d43058a34a1b35f9"/>
     <w:p>
       <w:pPr>
         <w:pStyle w:val="Heading2"/>
       </w:pPr>
       <w:r>
-        <w:t xml:space="preserve">Slide 5. Sepuluh Tugas Eksekusi (Figure 10.1, digambar ulang)</w:t>
+        <w:t xml:space="preserve">Slide 6. Sepuluh Tugas Eksekusi (Figure 10.1, digambar ulang)</w:t>
       </w:r>
     </w:p>
     <w:p>
@@ -2158,14 +2210,14 @@
         <w:t xml:space="preserve">”</w:t>
       </w:r>
     </w:p>
-    <w:bookmarkEnd w:id="27"/>
-    <w:bookmarkStart w:id="28" w:name="X4f1ce81baef09d0c3ad5b180a77be65db617ec7"/>
+    <w:bookmarkEnd w:id="28"/>
+    <w:bookmarkStart w:id="29" w:name="Xaf2613f314ddd942c616967d88d1534f0805e9c"/>
     <w:p>
       <w:pPr>
         <w:pStyle w:val="Heading2"/>
       </w:pPr>
       <w:r>
-        <w:t xml:space="preserve">Slide 6. Tiga Aksi Kunci Membangun Organisasi yang Mampu (Figure 10.2, digambar ulang)</w:t>
+        <w:t xml:space="preserve">Slide 7. Tiga Aksi Kunci Membangun Organisasi yang Mampu (Figure 10.2, digambar ulang)</w:t>
       </w:r>
     </w:p>
     <w:p>
@@ -2306,14 +2358,14 @@
         <w:t xml:space="preserve">terdepresiasi dan kondisi berubah, sehingga pembaruan diperlukan bahkan ketika strategi tidak berubah.</w:t>
       </w:r>
     </w:p>
-    <w:bookmarkEnd w:id="28"/>
-    <w:bookmarkStart w:id="29" w:name="X2035c25457a9267863b1a41e268edfd1114f04a"/>
+    <w:bookmarkEnd w:id="29"/>
+    <w:bookmarkStart w:id="30" w:name="X9e7002e8ba70658f2b34d3da2cc8066e418a6c7"/>
     <w:p>
       <w:pPr>
         <w:pStyle w:val="Heading2"/>
       </w:pPr>
       <w:r>
-        <w:t xml:space="preserve">Slide 7. Menyusun Tim Manajemen yang Kuat</w:t>
+        <w:t xml:space="preserve">Slide 8. Menyusun Tim Manajemen yang Kuat</w:t>
       </w:r>
     </w:p>
     <w:p>
@@ -2580,14 +2632,14 @@
         <w:t xml:space="preserve">, serta kesediaan mengakui perubahan diperlukan.</w:t>
       </w:r>
     </w:p>
-    <w:bookmarkEnd w:id="29"/>
-    <w:bookmarkStart w:id="30" w:name="X68232f1b4141bf6e3659807a218086a84b695cd"/>
+    <w:bookmarkEnd w:id="30"/>
+    <w:bookmarkStart w:id="31" w:name="Xdf3f59c9ac252a9a5e0e7edba3d851fd1ff962c"/>
     <w:p>
       <w:pPr>
         <w:pStyle w:val="Heading2"/>
       </w:pPr>
       <w:r>
-        <w:t xml:space="preserve">Slide 8. Merekrut, Melatih, dan Mempertahankan Karyawan</w:t>
+        <w:t xml:space="preserve">Slide 9. Merekrut, Melatih, dan Mempertahankan Karyawan</w:t>
       </w:r>
     </w:p>
     <w:p>
@@ -2891,14 +2943,14 @@
         <w:t xml:space="preserve">.</w:t>
       </w:r>
     </w:p>
-    <w:bookmarkEnd w:id="30"/>
-    <w:bookmarkStart w:id="31" w:name="X34225e2b3fb2f011dc8b8b0f04168a454ca0265"/>
+    <w:bookmarkEnd w:id="31"/>
+    <w:bookmarkStart w:id="32" w:name="X64ba6a23d3b5d9316a40eaa5dde36a271c0a0a2"/>
     <w:p>
       <w:pPr>
         <w:pStyle w:val="Heading2"/>
       </w:pPr>
       <w:r>
-        <w:t xml:space="preserve">Slide 9. Tiga Jalan Membangun Organizational Capabilities</w:t>
+        <w:t xml:space="preserve">Slide 10. Tiga Jalan Membangun Organizational Capabilities</w:t>
       </w:r>
     </w:p>
     <w:p>
@@ -3089,14 +3141,14 @@
         <w:t xml:space="preserve">karena kondisi berubah.</w:t>
       </w:r>
     </w:p>
-    <w:bookmarkEnd w:id="31"/>
-    <w:bookmarkStart w:id="32" w:name="X4f96cff5cea9c582ff99ff56546ef90f420707e"/>
+    <w:bookmarkEnd w:id="32"/>
+    <w:bookmarkStart w:id="33" w:name="Xf90ea2dd498683f9f8cf77772cd6d1a672356af"/>
     <w:p>
       <w:pPr>
         <w:pStyle w:val="Heading2"/>
       </w:pPr>
       <w:r>
-        <w:t xml:space="preserve">Slide 10. Capability Tumbuh Bertahap (dua tahap menurut buku, lalu dijaga)</w:t>
+        <w:t xml:space="preserve">Slide 11. Capability Tumbuh Bertahap (dua tahap menurut buku, lalu dijaga)</w:t>
       </w:r>
     </w:p>
     <w:p>
@@ -3339,14 +3391,14 @@
         <w:t xml:space="preserve">hingga melampaui General Motors.</w:t>
       </w:r>
     </w:p>
-    <w:bookmarkEnd w:id="32"/>
-    <w:bookmarkStart w:id="33" w:name="X924cbf855a7a678aae5cd85ace5f96707dd59e8"/>
+    <w:bookmarkEnd w:id="33"/>
+    <w:bookmarkStart w:id="34" w:name="Xe270a9da7cadf039e402c6d81ded6724e1f6183"/>
     <w:p>
       <w:pPr>
         <w:pStyle w:val="Heading2"/>
       </w:pPr>
       <w:r>
-        <w:t xml:space="preserve">Slide 11. Akuisisi dan Kemitraan Membeli Waktu, Bukan Integrasi</w:t>
+        <w:t xml:space="preserve">Slide 12. Akuisisi dan Kemitraan Membeli Waktu, Bukan Integrasi</w:t>
       </w:r>
     </w:p>
     <w:p>
@@ -3561,14 +3613,14 @@
         <w:t xml:space="preserve">Capability yang dibeli tetap harus ditanam ke rutinitas organisasi sendiri; di situlah aksi 1 (orang) dan aksi 3 (struktur) menentukan. Kalimat ini menautkan kembali ke peta Figure 10.2.</w:t>
       </w:r>
     </w:p>
-    <w:bookmarkEnd w:id="33"/>
-    <w:bookmarkStart w:id="34" w:name="X0cfeaabce8091a93b959103a91952c885b31209"/>
+    <w:bookmarkEnd w:id="34"/>
+    <w:bookmarkStart w:id="35" w:name="Xa491ca327c444ca0755b9fa81015b4af48c79e1"/>
     <w:p>
       <w:pPr>
         <w:pStyle w:val="Heading2"/>
       </w:pPr>
       <w:r>
-        <w:t xml:space="preserve">Slide 12. Eksekusi yang Unggul adalah Keunggulan Itu Sendiri (IC 10.3, Zara)</w:t>
+        <w:t xml:space="preserve">Slide 13. Eksekusi yang Unggul adalah Keunggulan Itu Sendiri (IC 10.3, Zara)</w:t>
       </w:r>
     </w:p>
     <w:p>
@@ -3683,14 +3735,14 @@
         <w:t xml:space="preserve">pesaing.</w:t>
       </w:r>
     </w:p>
-    <w:bookmarkEnd w:id="34"/>
-    <w:bookmarkStart w:id="35" w:name="Xc08345fbe0fcd094a0c5c9d5c22576fc0c80554"/>
+    <w:bookmarkEnd w:id="35"/>
+    <w:bookmarkStart w:id="36" w:name="Xd19262ef5645713e7097bac24032e932987daa2"/>
     <w:p>
       <w:pPr>
         <w:pStyle w:val="Heading2"/>
       </w:pPr>
       <w:r>
-        <w:t xml:space="preserve">Slide 13. Struktur Mengikuti Strategi (Figure 10.3, digambar ulang)</w:t>
+        <w:t xml:space="preserve">Slide 14. Struktur Mengikuti Strategi (Figure 10.3, digambar ulang)</w:t>
       </w:r>
     </w:p>
     <w:p>
@@ -3872,14 +3924,14 @@
         <w:t xml:space="preserve">, dan memungkinkan lebih dulu ke pasar.</w:t>
       </w:r>
     </w:p>
-    <w:bookmarkEnd w:id="35"/>
-    <w:bookmarkStart w:id="36" w:name="X8cc0ee2340a34b04e2442e997b6eedc6c02ac0c"/>
+    <w:bookmarkEnd w:id="36"/>
+    <w:bookmarkStart w:id="37" w:name="X2990fafd55ef9ef88ebfaeb4edbcc1c3b9d4234"/>
     <w:p>
       <w:pPr>
         <w:pStyle w:val="Heading2"/>
       </w:pPr>
       <w:r>
-        <w:t xml:space="preserve">Slide 14. Dikerjakan Sendiri atau Di-outsource (IC 10.4, Apple)</w:t>
+        <w:t xml:space="preserve">Slide 15. Dikerjakan Sendiri atau Di-outsource (IC 10.4, Apple)</w:t>
       </w:r>
     </w:p>
     <w:p>
@@ -4077,14 +4129,14 @@
         <w:t xml:space="preserve">”</w:t>
       </w:r>
     </w:p>
-    <w:bookmarkEnd w:id="36"/>
-    <w:bookmarkStart w:id="37" w:name="X07fe30141715afbfadbbe39112210104afe6fed"/>
+    <w:bookmarkEnd w:id="37"/>
+    <w:bookmarkStart w:id="38" w:name="X3260dccb93207354fbcc6eb55cfd6b5aa99b68a"/>
     <w:p>
       <w:pPr>
         <w:pStyle w:val="Heading2"/>
       </w:pPr>
       <w:r>
-        <w:t xml:space="preserve">Slide 15. Empat Tipe Struktur, Satu Prinsip</w:t>
+        <w:t xml:space="preserve">Slide 16. Empat Tipe Struktur, Satu Prinsip</w:t>
       </w:r>
     </w:p>
     <w:p>
@@ -4428,14 +4480,14 @@
         <w:t xml:space="preserve">. Jadi kecocokan struktur dengan strategi terwujud melalui penempatan aktivitas kritis sebagai pusat, bukan semata pemilihan tipe.</w:t>
       </w:r>
     </w:p>
-    <w:bookmarkEnd w:id="37"/>
-    <w:bookmarkStart w:id="38" w:name="Xeec270689e84a98b35880e27b315c57dae1da56"/>
+    <w:bookmarkEnd w:id="38"/>
+    <w:bookmarkStart w:id="39" w:name="X3fdd0b9552565d1a5ae99ccf6451ebe3b0a59ed"/>
     <w:p>
       <w:pPr>
         <w:pStyle w:val="Heading2"/>
       </w:pPr>
       <w:r>
-        <w:t xml:space="preserve">Slide 16. Memusatkan atau Mendelegasikan Keputusan (Table 10.1, dipadatkan)</w:t>
+        <w:t xml:space="preserve">Slide 17. Memusatkan atau Mendelegasikan Keputusan (Table 10.1, dipadatkan)</w:t>
       </w:r>
     </w:p>
     <w:p>
@@ -4662,14 +4714,14 @@
         <w:t xml:space="preserve">Jawab dengan lima mekanisme kendali di atas; desentralisasi memindahkan keputusan, bukan menghapus akuntabilitas.</w:t>
       </w:r>
     </w:p>
-    <w:bookmarkEnd w:id="38"/>
-    <w:bookmarkStart w:id="39" w:name="X9c11913838fccea64177d929aa0f5580d95170f"/>
+    <w:bookmarkEnd w:id="39"/>
+    <w:bookmarkStart w:id="40" w:name="X8657725e90d7f341a2a68069a0a8187b7cc8308"/>
     <w:p>
       <w:pPr>
         <w:pStyle w:val="Heading2"/>
       </w:pPr>
       <w:r>
-        <w:t xml:space="preserve">Slide 17. Koordinasi ke Dalam dan ke Luar</w:t>
+        <w:t xml:space="preserve">Slide 18. Koordinasi ke Dalam dan ke Luar</w:t>
       </w:r>
     </w:p>
     <w:p>
@@ -4921,14 +4973,14 @@
         <w:t xml:space="preserve">upaya individu dan kelompok, dan manajemen senior harus terlibat mendalam.</w:t>
       </w:r>
     </w:p>
-    <w:bookmarkEnd w:id="39"/>
-    <w:bookmarkStart w:id="40" w:name="X512cd0d35aeb9cb74d7b00de2bfab6126c06aa3"/>
+    <w:bookmarkEnd w:id="40"/>
+    <w:bookmarkStart w:id="41" w:name="X2d611493ac91d1e881a4ea68360ae5746d47091"/>
     <w:p>
       <w:pPr>
         <w:pStyle w:val="Heading2"/>
       </w:pPr>
       <w:r>
-        <w:t xml:space="preserve">Slide 18. Organisasi yang Mampu Mengeksekusi (Sintesis)</w:t>
+        <w:t xml:space="preserve">Slide 19. Organisasi yang Mampu Mengeksekusi (Sintesis)</w:t>
       </w:r>
     </w:p>
     <w:p>
@@ -5228,14 +5280,14 @@
         <w:t xml:space="preserve">.</w:t>
       </w:r>
     </w:p>
-    <w:bookmarkEnd w:id="40"/>
-    <w:bookmarkStart w:id="41" w:name="slide-19.-penutup"/>
+    <w:bookmarkEnd w:id="41"/>
+    <w:bookmarkStart w:id="42" w:name="slide-20.-penutup"/>
     <w:p>
       <w:pPr>
         <w:pStyle w:val="Heading2"/>
       </w:pPr>
       <w:r>
-        <w:t xml:space="preserve">Slide 19. Penutup</w:t>
+        <w:t xml:space="preserve">Slide 20. Penutup</w:t>
       </w:r>
     </w:p>
     <w:p>
@@ -5246,8 +5298,8 @@
         <w:t xml:space="preserve">Hanya ucapan terima kasih, tanpa teks lain, sesuai permintaan.</w:t>
       </w:r>
     </w:p>
-    <w:bookmarkEnd w:id="41"/>
-    <w:bookmarkStart w:id="42" w:name="X57d30e36735e5bb79267f8dbbf8bf0b68e48f58"/>
+    <w:bookmarkEnd w:id="42"/>
+    <w:bookmarkStart w:id="43" w:name="X57d30e36735e5bb79267f8dbbf8bf0b68e48f58"/>
     <w:p>
       <w:pPr>
         <w:pStyle w:val="Heading2"/>
@@ -5381,8 +5433,8 @@
         <w:t xml:space="preserve">Sentralisasi unggul saat krisis yang menuntut respons seragam dan cepat; desentralisasi unggul saat pengetahuan relevan berada di lini depan dan inovasi dibutuhkan; kendali dijaga melalui lima mekanisme Table 10.1.</w:t>
       </w:r>
     </w:p>
-    <w:bookmarkEnd w:id="42"/>
-    <w:bookmarkStart w:id="43" w:name="catatan-referensi"/>
+    <w:bookmarkEnd w:id="43"/>
+    <w:bookmarkStart w:id="44" w:name="catatan-referensi"/>
     <w:p>
       <w:pPr>
         <w:pStyle w:val="Heading2"/>
@@ -5399,9 +5451,9 @@
         <w:t xml:space="preserve">Referensi utama adalah buku teks edisi 2024 (halaman 294 sampai 325) dan buku acuan silabus (edisi 22, 2019). Chandler, Sull dkk., Collins, Helfat dan Peteraf, Simons, serta Kanter adalah rujukan yang dikutip bab; McChesney dkk. adalah sumber kerangka 4DX.</w:t>
       </w:r>
     </w:p>
-    <w:bookmarkEnd w:id="43"/>
     <w:bookmarkEnd w:id="44"/>
-    <w:bookmarkStart w:id="45" w:name="X7763ca7516d643c2a47dbc05df76a03f6f93e56"/>
+    <w:bookmarkEnd w:id="45"/>
+    <w:bookmarkStart w:id="46" w:name="X7763ca7516d643c2a47dbc05df76a03f6f93e56"/>
     <w:p>
       <w:pPr>
         <w:pStyle w:val="Heading1"/>
@@ -5789,8 +5841,8 @@
         </w:tc>
       </w:tr>
     </w:tbl>
-    <w:bookmarkEnd w:id="45"/>
-    <w:bookmarkStart w:id="46" w:name="Xbdc01fce5430fc20b682bc40189fef7d7f90d6a"/>
+    <w:bookmarkEnd w:id="46"/>
+    <w:bookmarkStart w:id="47" w:name="Xbdc01fce5430fc20b682bc40189fef7d7f90d6a"/>
     <w:p>
       <w:pPr>
         <w:pStyle w:val="Heading1"/>
@@ -5835,7 +5887,7 @@
         <w:t xml:space="preserve">Foto pada deck adalah ilustrasi monokrom yang dibuat khusus untuk presentasi ini, bukan foto perusahaan yang dibahas.</w:t>
       </w:r>
     </w:p>
-    <w:bookmarkEnd w:id="46"/>
+    <w:bookmarkEnd w:id="47"/>
     <w:sectPr/>
   </w:body>
 </w:document>

</xml_diff>

<commit_message>
Sync study guide heading with slide 16 title
Co-Authored-By: Claude Fable 5.1 <noreply@anthropic.com>
Claude-Session: https://claude.ai/code/session_01Ljehy9D2DPqSYfPX6Gsiea
</commit_message>
<xml_diff>
--- a/presentasi_ch10_kelompok3/SMJKT_Group 3_Aslih_Materi Pemahaman Chapter 10.docx
+++ b/presentasi_ch10_kelompok3/SMJKT_Group 3_Aslih_Materi Pemahaman Chapter 10.docx
@@ -4130,13 +4130,13 @@
       </w:r>
     </w:p>
     <w:bookmarkEnd w:id="37"/>
-    <w:bookmarkStart w:id="38" w:name="X3260dccb93207354fbcc6eb55cfd6b5aa99b68a"/>
+    <w:bookmarkStart w:id="38" w:name="X548828c7b62058c1c3be48b95ace59814af777f"/>
     <w:p>
       <w:pPr>
         <w:pStyle w:val="Heading2"/>
       </w:pPr>
       <w:r>
-        <w:t xml:space="preserve">Slide 16. Empat Tipe Struktur, Satu Prinsip</w:t>
+        <w:t xml:space="preserve">Slide 16. Empat Tipe Struktur (satu prinsip: aktivitas kritis menjadi building blocks)</w:t>
       </w:r>
     </w:p>
     <w:p>

</xml_diff>

<commit_message>
Section navbar in the header with active-section highlight
Co-Authored-By: Claude Fable 5.1 <noreply@anthropic.com>
Claude-Session: https://claude.ai/code/session_01Ljehy9D2DPqSYfPX6Gsiea
</commit_message>
<xml_diff>
--- a/presentasi_ch10_kelompok3/SMJKT_Group 3_Aslih_Materi Pemahaman Chapter 10.docx
+++ b/presentasi_ch10_kelompok3/SMJKT_Group 3_Aslih_Materi Pemahaman Chapter 10.docx
@@ -403,6 +403,24 @@
       </w:r>
       <w:r>
         <w:t xml:space="preserve">Teks isi 16 sampai 18 pt, label kategori 13 sampai 14 pt, angka besar 24 sampai 34 pt, judul 28 sampai 38 pt, semua dengan kontras di atas 12:1. Pada layar selebar 2,4 m: teks 18 pt terbaca nyaman sampai sekitar 6,3 m dan masih terbaca sampai 7,9 m; label 14 pt sampai 4,9 m dan 6,1 m; judul 32 pt sampai lebih dari 11 m. Untuk ruang yang lebih dalam dari 8 m, penonton paling belakang mengandalkan judul, angka besar, dan narasi presenter. Header dan baris sumber (9 sampai 10,5 pt) adalah metadata, bukan bahan baca.</w:t>
+      </w:r>
+    </w:p>
+    <w:p>
+      <w:pPr>
+        <w:pStyle w:val="BodyText"/>
+      </w:pPr>
+      <w:r>
+        <w:rPr>
+          <w:bCs/>
+          <w:b/>
+        </w:rPr>
+        <w:t xml:space="preserve">Navigasi di baris atas.</w:t>
+      </w:r>
+      <w:r>
+        <w:t xml:space="preserve"> </w:t>
+      </w:r>
+      <w:r>
+        <w:t xml:space="preserve">Setiap slide menampilkan menu Foundation, Staffing, Capabilities, Structure; menu yang sedang dibahas disorot dengan pil lime (atau pil hitam pada slide berpanel lime). Foundation mencakup slide 4 sampai 7, Staffing 8 sampai 9, Capabilities 10 sampai 13, Structure 14 sampai 18; slide pembuka dan sintesis tidak menyorot menu mana pun.</w:t>
       </w:r>
     </w:p>
     <w:p>

</xml_diff>